<commit_message>
Subscriptions system, PDF records export, Understat xG features + xG-Poisson model, live preview dashboard
</commit_message>
<xml_diff>
--- a/Notes/Vindicator Business Notes Plan.docx
+++ b/Notes/Vindicator Business Notes Plan.docx
@@ -108,13 +108,8 @@
       <w:pPr>
         <w:pStyle w:val="NormalWeb"/>
       </w:pPr>
-      <w:proofErr w:type="gramStart"/>
-      <w:r>
-        <w:t>Also</w:t>
-      </w:r>
-      <w:proofErr w:type="gramEnd"/>
-      <w:r>
-        <w:t xml:space="preserve"> to allow </w:t>
+      <w:r>
+        <w:t xml:space="preserve">Also to allow </w:t>
       </w:r>
       <w:proofErr w:type="spellStart"/>
       <w:r>
@@ -384,12 +379,10 @@
         <w:t xml:space="preserve"> looking icons and team badges.) I want you to find a better free alternative with a lot more data to retrieve and find another paid option that is best. If you </w:t>
       </w:r>
       <w:proofErr w:type="spellStart"/>
-      <w:proofErr w:type="gramStart"/>
       <w:r>
         <w:t>cant</w:t>
       </w:r>
       <w:proofErr w:type="spellEnd"/>
-      <w:proofErr w:type="gramEnd"/>
       <w:r>
         <w:t xml:space="preserve"> find any better </w:t>
       </w:r>
@@ -488,15 +481,7 @@
       </w:r>
       <w:proofErr w:type="spellEnd"/>
       <w:r>
-        <w:t xml:space="preserve">. </w:t>
-      </w:r>
-      <w:proofErr w:type="gramStart"/>
-      <w:r>
-        <w:t>Also</w:t>
-      </w:r>
-      <w:proofErr w:type="gramEnd"/>
-      <w:r>
-        <w:t xml:space="preserve"> you have </w:t>
+        <w:t xml:space="preserve">. Also you have </w:t>
       </w:r>
       <w:proofErr w:type="spellStart"/>
       <w:r>
@@ -504,15 +489,7 @@
       </w:r>
       <w:proofErr w:type="spellEnd"/>
       <w:r>
-        <w:t xml:space="preserve"> pro. </w:t>
-      </w:r>
-      <w:proofErr w:type="gramStart"/>
-      <w:r>
-        <w:t>However</w:t>
-      </w:r>
-      <w:proofErr w:type="gramEnd"/>
-      <w:r>
-        <w:t xml:space="preserve"> this is how </w:t>
+        <w:t xml:space="preserve"> pro. However this is how </w:t>
       </w:r>
       <w:proofErr w:type="spellStart"/>
       <w:r>
@@ -821,15 +798,7 @@
         </w:numPr>
       </w:pPr>
       <w:r>
-        <w:t xml:space="preserve">Also used drop down selection boxes for the admin(myself) to use to select different models to generate the data and live feeds. use maybe 3 or 5 different models to generate each sections such as; BTTS, total shots, total goals, what does the betting market currently </w:t>
-      </w:r>
-      <w:proofErr w:type="gramStart"/>
-      <w:r>
-        <w:t>think?,</w:t>
-      </w:r>
-      <w:proofErr w:type="gramEnd"/>
-      <w:r>
-        <w:t xml:space="preserve"> bookmaker suggestions, odds, timestamp, </w:t>
+        <w:t xml:space="preserve">Also used drop down selection boxes for the admin(myself) to use to select different models to generate the data and live feeds. use maybe 3 or 5 different models to generate each sections such as; BTTS, total shots, total goals, what does the betting market currently think?, bookmaker suggestions, odds, timestamp, </w:t>
       </w:r>
       <w:proofErr w:type="spellStart"/>
       <w:r>
@@ -873,15 +842,7 @@
         </w:numPr>
       </w:pPr>
       <w:r>
-        <w:t xml:space="preserve">think of a good way to generate the predictions for each </w:t>
-      </w:r>
-      <w:proofErr w:type="gramStart"/>
-      <w:r>
-        <w:t>games</w:t>
-      </w:r>
-      <w:proofErr w:type="gramEnd"/>
-      <w:r>
-        <w:t xml:space="preserve"> and how points help users see better predictions and odds to help them earn a better ranking in the gaming system.</w:t>
+        <w:t>think of a good way to generate the predictions for each games and how points help users see better predictions and odds to help them earn a better ranking in the gaming system.</w:t>
       </w:r>
     </w:p>
     <w:p>
@@ -967,16 +928,11 @@
         </w:rPr>
         <w:t xml:space="preserve"> </w:t>
       </w:r>
-      <w:proofErr w:type="gramStart"/>
       <w:r>
         <w:t>1.</w:t>
       </w:r>
       <w:r>
-        <w:t>Make</w:t>
-      </w:r>
-      <w:proofErr w:type="gramEnd"/>
-      <w:r>
-        <w:t xml:space="preserve"> sure that the model gives a percentage prediction rather than just an actual score hit rate, for example : </w:t>
+        <w:t xml:space="preserve">Make sure that the model gives a percentage prediction rather than just an actual score hit rate, for example : </w:t>
       </w:r>
       <w:r>
         <w:t>2–1 = 17%</w:t>
@@ -986,12 +942,10 @@
         <w:t xml:space="preserve">2. </w:t>
       </w:r>
       <w:proofErr w:type="spellStart"/>
-      <w:proofErr w:type="gramStart"/>
       <w:r>
         <w:t>accounts.json</w:t>
       </w:r>
       <w:proofErr w:type="spellEnd"/>
-      <w:proofErr w:type="gramEnd"/>
       <w:r>
         <w:t xml:space="preserve"> and </w:t>
       </w:r>
@@ -1004,15 +958,7 @@
       </w:r>
       <w:proofErr w:type="spellEnd"/>
       <w:r>
-        <w:t xml:space="preserve"> I would these record files to be used and also converted into a viewable spreadsheet or pdf recorded file that can be viewed/read only not edited. But </w:t>
-      </w:r>
-      <w:proofErr w:type="gramStart"/>
-      <w:r>
-        <w:t>If</w:t>
-      </w:r>
-      <w:proofErr w:type="gramEnd"/>
-      <w:r>
-        <w:t xml:space="preserve"> it can’t be converted, then I want a separate recorded file in the format of either pdf or excel spreadsheet with a modern look and selections and categories to view each recorded data.</w:t>
+        <w:t xml:space="preserve"> I would these record files to be used and also converted into a viewable spreadsheet or pdf recorded file that can be viewed/read only not edited. But If it can’t be converted, then I want a separate recorded file in the format of either pdf or excel spreadsheet with a modern look and selections and categories to view each recorded data.</w:t>
       </w:r>
       <w:r>
         <w:br/>
@@ -2092,17 +2038,10 @@
       </w:r>
       <w:r>
         <w:br/>
-      </w:r>
-      <w:proofErr w:type="gramStart"/>
-      <w:r>
         <w:t>6.</w:t>
       </w:r>
       <w:r>
-        <w:t>Use</w:t>
-      </w:r>
-      <w:proofErr w:type="gramEnd"/>
-      <w:r>
-        <w:t xml:space="preserve"> RL more heavily for the gaming/rewards system than predicting scores</w:t>
+        <w:t>Use RL more heavily for the gaming/rewards system than predicting scores</w:t>
       </w:r>
       <w:r>
         <w:t>. For things like what reward to give and when to give it, what competition to show, what prediction market to recommend, which game mechanic keeps users engaged.</w:t>
@@ -2112,15 +2051,7 @@
         <w:t>7.</w:t>
       </w:r>
       <w:r>
-        <w:t xml:space="preserve"> Use contextual bandits before RL where </w:t>
-      </w:r>
-      <w:proofErr w:type="gramStart"/>
-      <w:r>
-        <w:t>its</w:t>
-      </w:r>
-      <w:proofErr w:type="gramEnd"/>
-      <w:r>
-        <w:t xml:space="preserve"> suited for things such as; what team the user likes most, what the user usually predicts, watch hat-</w:t>
+        <w:t xml:space="preserve"> Use contextual bandits before RL where its suited for things such as; what team the user likes most, what the user usually predicts, watch hat-</w:t>
       </w:r>
       <w:proofErr w:type="spellStart"/>
       <w:r>
@@ -2919,27 +2850,7 @@
           <w:lang w:eastAsia="en-GB"/>
           <w14:ligatures w14:val="none"/>
         </w:rPr>
-        <w:t xml:space="preserve">I want you to basically build the </w:t>
-      </w:r>
-      <w:proofErr w:type="gramStart"/>
-      <w:r>
-        <w:rPr>
-          <w:rFonts w:ascii="Times New Roman" w:eastAsia="Times New Roman" w:hAnsi="Times New Roman" w:cs="Times New Roman"/>
-          <w:kern w:val="0"/>
-          <w:lang w:eastAsia="en-GB"/>
-          <w14:ligatures w14:val="none"/>
-        </w:rPr>
-        <w:t>six engine</w:t>
-      </w:r>
-      <w:proofErr w:type="gramEnd"/>
-      <w:r>
-        <w:rPr>
-          <w:rFonts w:ascii="Times New Roman" w:eastAsia="Times New Roman" w:hAnsi="Times New Roman" w:cs="Times New Roman"/>
-          <w:kern w:val="0"/>
-          <w:lang w:eastAsia="en-GB"/>
-          <w14:ligatures w14:val="none"/>
-        </w:rPr>
-        <w:t xml:space="preserve"> model:</w:t>
+        <w:t>I want you to basically build the six engine model:</w:t>
       </w:r>
       <w:r>
         <w:rPr>
@@ -3819,19 +3730,8 @@
           <w:lang w:eastAsia="en-GB"/>
           <w14:ligatures w14:val="none"/>
         </w:rPr>
-        <w:t xml:space="preserve">                    / </w:t>
-      </w:r>
-      <w:proofErr w:type="gramStart"/>
-      <w:r>
-        <w:rPr>
-          <w:rFonts w:ascii="Times New Roman" w:eastAsia="Times New Roman" w:hAnsi="Times New Roman" w:cs="Times New Roman"/>
-          <w:kern w:val="0"/>
-          <w:lang w:eastAsia="en-GB"/>
-          <w14:ligatures w14:val="none"/>
-        </w:rPr>
-        <w:t>reinforcement</w:t>
-      </w:r>
-      <w:proofErr w:type="gramEnd"/>
+        <w:t xml:space="preserve">                    / reinforcement</w:t>
+      </w:r>
     </w:p>
     <w:p>
       <w:pPr>
@@ -6243,6 +6143,194 @@
       <w:proofErr w:type="spellEnd"/>
       <w:r>
         <w:t xml:space="preserve"> and blocks where necessary. Use classes if needed to keep the structure tidy and able to modify each section easily. With headers and hear section able to change globally.</w:t>
+      </w:r>
+    </w:p>
+    <w:p>
+      <w:pPr>
+        <w:pStyle w:val="NormalWeb"/>
+      </w:pPr>
+      <w:r>
+        <w:rPr>
+          <w:b/>
+          <w:bCs/>
+          <w:sz w:val="48"/>
+          <w:szCs w:val="48"/>
+        </w:rPr>
+        <w:t>5.</w:t>
+      </w:r>
+      <w:r>
+        <w:br/>
+        <w:t>1.</w:t>
+      </w:r>
+      <w:r>
+        <w:t xml:space="preserve"> Create a modern looking designed pdf version of the records.xlsx and also include a subscriptions category and. Implement that into the rewards gaming system as users can upgrade their account based on their earned points, which will earn them better predictions and better odds with better customization rewards as the user climbs the ranks.</w:t>
+      </w:r>
+      <w:r>
+        <w:br/>
+        <w:t>2. Show the created app/model live in the browser window in Claude so that I can test it.</w:t>
+      </w:r>
+      <w:r>
+        <w:br/>
+        <w:t>3.</w:t>
+      </w:r>
+      <w:r>
+        <w:t xml:space="preserve"> </w:t>
+      </w:r>
+      <w:r>
+        <w:t>the stacked ensemble holds at Brier 0.5936</w:t>
+      </w:r>
+      <w:r>
+        <w:t>. This score needs improving, find suggestions and report them back to me to confirm.</w:t>
+      </w:r>
+      <w:r>
+        <w:br/>
+        <w:t>4.</w:t>
+      </w:r>
+      <w:r>
+        <w:t xml:space="preserve"> </w:t>
+      </w:r>
+      <w:r>
+        <w:t>The stacked ensemble scores Brier 0.594 / log-loss 0.995 — better than every individual model, and the meta-learner correctly gave the de-</w:t>
+      </w:r>
+      <w:proofErr w:type="spellStart"/>
+      <w:r>
+        <w:t>vigged</w:t>
+      </w:r>
+      <w:proofErr w:type="spellEnd"/>
+      <w:r>
+        <w:t xml:space="preserve"> market the biggest trust weight (0.60). The market itself sits at 0.581, so we're ~1 Brier point behind the closing line using only free historical data. That's the expected starting position; the levers to close the gap are </w:t>
+      </w:r>
+      <w:proofErr w:type="spellStart"/>
+      <w:r>
+        <w:t>xG</w:t>
+      </w:r>
+      <w:proofErr w:type="spellEnd"/>
+      <w:r>
+        <w:t xml:space="preserve"> features, </w:t>
+      </w:r>
+      <w:proofErr w:type="spellStart"/>
+      <w:r>
+        <w:t>lineups</w:t>
+      </w:r>
+      <w:proofErr w:type="spellEnd"/>
+      <w:r>
+        <w:t>/injuries from API-Football, and the full GBM roster.</w:t>
+      </w:r>
+      <w:r>
+        <w:br/>
+        <w:t>If this is so then can you pull this data from an open source however possible for free and legit.</w:t>
+      </w:r>
+      <w:r>
+        <w:br/>
+        <w:t xml:space="preserve">5. Make the </w:t>
+      </w:r>
+      <w:proofErr w:type="spellStart"/>
+      <w:r>
+        <w:t>wordpress</w:t>
+      </w:r>
+      <w:proofErr w:type="spellEnd"/>
+      <w:r>
+        <w:t>/</w:t>
+      </w:r>
+      <w:proofErr w:type="spellStart"/>
+      <w:r>
+        <w:t>novamira</w:t>
+      </w:r>
+      <w:proofErr w:type="spellEnd"/>
+      <w:r>
+        <w:t xml:space="preserve"> connection active for this session.</w:t>
+      </w:r>
+      <w:r>
+        <w:br/>
+        <w:t xml:space="preserve">6. </w:t>
+      </w:r>
+      <w:proofErr w:type="spellStart"/>
+      <w:r>
+        <w:t>Im</w:t>
+      </w:r>
+      <w:proofErr w:type="spellEnd"/>
+      <w:r>
+        <w:t xml:space="preserve"> not ready to buy VPS hosting yet, can you find alternatives</w:t>
+      </w:r>
+      <w:r>
+        <w:t xml:space="preserve"> for: (</w:t>
+      </w:r>
+      <w:r>
+        <w:t xml:space="preserve">Kafka, Feast, </w:t>
+      </w:r>
+      <w:proofErr w:type="spellStart"/>
+      <w:r>
+        <w:t>MLflow</w:t>
+      </w:r>
+      <w:proofErr w:type="spellEnd"/>
+      <w:r>
+        <w:t xml:space="preserve">, PostgreSQL/Timescale, </w:t>
+      </w:r>
+      <w:proofErr w:type="spellStart"/>
+      <w:r>
+        <w:t>FastAPI</w:t>
+      </w:r>
+      <w:proofErr w:type="spellEnd"/>
+      <w:r>
+        <w:t xml:space="preserve"> serving</w:t>
+      </w:r>
+      <w:r>
+        <w:t>)</w:t>
+      </w:r>
+      <w:r>
+        <w:t xml:space="preserve"> </w:t>
+      </w:r>
+      <w:r>
+        <w:t>and/or place that step on hold for the future (or implement it as an upgrade feature in the admin panel</w:t>
+      </w:r>
+      <w:r>
+        <w:t xml:space="preserve"> for the future).</w:t>
+      </w:r>
+      <w:r>
+        <w:br/>
+        <w:t xml:space="preserve">7. This is the application password you requestion in bullet point 3 (WordPress) of your recommendations (user: Claudio): </w:t>
+      </w:r>
+      <w:r>
+        <w:t xml:space="preserve">XZFZ </w:t>
+      </w:r>
+      <w:proofErr w:type="spellStart"/>
+      <w:r>
+        <w:t>xuJx</w:t>
+      </w:r>
+      <w:proofErr w:type="spellEnd"/>
+      <w:r>
+        <w:t xml:space="preserve"> </w:t>
+      </w:r>
+      <w:proofErr w:type="spellStart"/>
+      <w:r>
+        <w:t>fdaB</w:t>
+      </w:r>
+      <w:proofErr w:type="spellEnd"/>
+      <w:r>
+        <w:t xml:space="preserve"> F68w </w:t>
+      </w:r>
+      <w:proofErr w:type="spellStart"/>
+      <w:r>
+        <w:t>PaSj</w:t>
+      </w:r>
+      <w:proofErr w:type="spellEnd"/>
+      <w:r>
+        <w:t xml:space="preserve"> </w:t>
+      </w:r>
+      <w:proofErr w:type="spellStart"/>
+      <w:r>
+        <w:t>BrJT</w:t>
+      </w:r>
+      <w:proofErr w:type="spellEnd"/>
+      <w:r>
+        <w:br/>
+        <w:t xml:space="preserve">8. Phase 2 bullet point 1; my answer is for you to find a free open source alternative for live updates (this is regarding the </w:t>
+      </w:r>
+      <w:r>
+        <w:t>train the temporal Transformer + GNN</w:t>
+      </w:r>
+      <w:r>
+        <w:t>) and also put this an upgradable feature for the admin to potentially us in the future for when I want to make the change if the website scales larger.</w:t>
       </w:r>
     </w:p>
     <w:p>

</xml_diff>

<commit_message>
Vendicator rename, glass/neon UI, 6-league sweep + UCL/UEL, draw head, injuries adapter, temporal prototype, WP plugin deployed to staging
</commit_message>
<xml_diff>
--- a/Notes/Vindicator Business Notes Plan.docx
+++ b/Notes/Vindicator Business Notes Plan.docx
@@ -108,8 +108,13 @@
       <w:pPr>
         <w:pStyle w:val="NormalWeb"/>
       </w:pPr>
-      <w:r>
-        <w:t xml:space="preserve">Also to allow </w:t>
+      <w:proofErr w:type="gramStart"/>
+      <w:r>
+        <w:t>Also</w:t>
+      </w:r>
+      <w:proofErr w:type="gramEnd"/>
+      <w:r>
+        <w:t xml:space="preserve"> to allow </w:t>
       </w:r>
       <w:proofErr w:type="spellStart"/>
       <w:r>
@@ -379,10 +384,12 @@
         <w:t xml:space="preserve"> looking icons and team badges.) I want you to find a better free alternative with a lot more data to retrieve and find another paid option that is best. If you </w:t>
       </w:r>
       <w:proofErr w:type="spellStart"/>
+      <w:proofErr w:type="gramStart"/>
       <w:r>
         <w:t>cant</w:t>
       </w:r>
       <w:proofErr w:type="spellEnd"/>
+      <w:proofErr w:type="gramEnd"/>
       <w:r>
         <w:t xml:space="preserve"> find any better </w:t>
       </w:r>
@@ -481,7 +488,15 @@
       </w:r>
       <w:proofErr w:type="spellEnd"/>
       <w:r>
-        <w:t xml:space="preserve">. Also you have </w:t>
+        <w:t xml:space="preserve">. </w:t>
+      </w:r>
+      <w:proofErr w:type="gramStart"/>
+      <w:r>
+        <w:t>Also</w:t>
+      </w:r>
+      <w:proofErr w:type="gramEnd"/>
+      <w:r>
+        <w:t xml:space="preserve"> you have </w:t>
       </w:r>
       <w:proofErr w:type="spellStart"/>
       <w:r>
@@ -489,7 +504,15 @@
       </w:r>
       <w:proofErr w:type="spellEnd"/>
       <w:r>
-        <w:t xml:space="preserve"> pro. However this is how </w:t>
+        <w:t xml:space="preserve"> pro. </w:t>
+      </w:r>
+      <w:proofErr w:type="gramStart"/>
+      <w:r>
+        <w:t>However</w:t>
+      </w:r>
+      <w:proofErr w:type="gramEnd"/>
+      <w:r>
+        <w:t xml:space="preserve"> this is how </w:t>
       </w:r>
       <w:proofErr w:type="spellStart"/>
       <w:r>
@@ -798,7 +821,15 @@
         </w:numPr>
       </w:pPr>
       <w:r>
-        <w:t xml:space="preserve">Also used drop down selection boxes for the admin(myself) to use to select different models to generate the data and live feeds. use maybe 3 or 5 different models to generate each sections such as; BTTS, total shots, total goals, what does the betting market currently think?, bookmaker suggestions, odds, timestamp, </w:t>
+        <w:t xml:space="preserve">Also used drop down selection boxes for the admin(myself) to use to select different models to generate the data and live feeds. use maybe 3 or 5 different models to generate each sections such as; BTTS, total shots, total goals, what does the betting market currently </w:t>
+      </w:r>
+      <w:proofErr w:type="gramStart"/>
+      <w:r>
+        <w:t>think?,</w:t>
+      </w:r>
+      <w:proofErr w:type="gramEnd"/>
+      <w:r>
+        <w:t xml:space="preserve"> bookmaker suggestions, odds, timestamp, </w:t>
       </w:r>
       <w:proofErr w:type="spellStart"/>
       <w:r>
@@ -842,7 +873,15 @@
         </w:numPr>
       </w:pPr>
       <w:r>
-        <w:t>think of a good way to generate the predictions for each games and how points help users see better predictions and odds to help them earn a better ranking in the gaming system.</w:t>
+        <w:t xml:space="preserve">think of a good way to generate the predictions for each </w:t>
+      </w:r>
+      <w:proofErr w:type="gramStart"/>
+      <w:r>
+        <w:t>games</w:t>
+      </w:r>
+      <w:proofErr w:type="gramEnd"/>
+      <w:r>
+        <w:t xml:space="preserve"> and how points help users see better predictions and odds to help them earn a better ranking in the gaming system.</w:t>
       </w:r>
     </w:p>
     <w:p>
@@ -928,11 +967,16 @@
         </w:rPr>
         <w:t xml:space="preserve"> </w:t>
       </w:r>
+      <w:proofErr w:type="gramStart"/>
       <w:r>
         <w:t>1.</w:t>
       </w:r>
       <w:r>
-        <w:t xml:space="preserve">Make sure that the model gives a percentage prediction rather than just an actual score hit rate, for example : </w:t>
+        <w:t>Make</w:t>
+      </w:r>
+      <w:proofErr w:type="gramEnd"/>
+      <w:r>
+        <w:t xml:space="preserve"> sure that the model gives a percentage prediction rather than just an actual score hit rate, for example : </w:t>
       </w:r>
       <w:r>
         <w:t>2–1 = 17%</w:t>
@@ -942,10 +986,12 @@
         <w:t xml:space="preserve">2. </w:t>
       </w:r>
       <w:proofErr w:type="spellStart"/>
+      <w:proofErr w:type="gramStart"/>
       <w:r>
         <w:t>accounts.json</w:t>
       </w:r>
       <w:proofErr w:type="spellEnd"/>
+      <w:proofErr w:type="gramEnd"/>
       <w:r>
         <w:t xml:space="preserve"> and </w:t>
       </w:r>
@@ -958,7 +1004,15 @@
       </w:r>
       <w:proofErr w:type="spellEnd"/>
       <w:r>
-        <w:t xml:space="preserve"> I would these record files to be used and also converted into a viewable spreadsheet or pdf recorded file that can be viewed/read only not edited. But If it can’t be converted, then I want a separate recorded file in the format of either pdf or excel spreadsheet with a modern look and selections and categories to view each recorded data.</w:t>
+        <w:t xml:space="preserve"> I would these record files to be used and also converted into a viewable spreadsheet or pdf recorded file that can be viewed/read only not edited. But </w:t>
+      </w:r>
+      <w:proofErr w:type="gramStart"/>
+      <w:r>
+        <w:t>If</w:t>
+      </w:r>
+      <w:proofErr w:type="gramEnd"/>
+      <w:r>
+        <w:t xml:space="preserve"> it can’t be converted, then I want a separate recorded file in the format of either pdf or excel spreadsheet with a modern look and selections and categories to view each recorded data.</w:t>
       </w:r>
       <w:r>
         <w:br/>
@@ -2038,10 +2092,17 @@
       </w:r>
       <w:r>
         <w:br/>
+      </w:r>
+      <w:proofErr w:type="gramStart"/>
+      <w:r>
         <w:t>6.</w:t>
       </w:r>
       <w:r>
-        <w:t>Use RL more heavily for the gaming/rewards system than predicting scores</w:t>
+        <w:t>Use</w:t>
+      </w:r>
+      <w:proofErr w:type="gramEnd"/>
+      <w:r>
+        <w:t xml:space="preserve"> RL more heavily for the gaming/rewards system than predicting scores</w:t>
       </w:r>
       <w:r>
         <w:t>. For things like what reward to give and when to give it, what competition to show, what prediction market to recommend, which game mechanic keeps users engaged.</w:t>
@@ -2051,7 +2112,15 @@
         <w:t>7.</w:t>
       </w:r>
       <w:r>
-        <w:t xml:space="preserve"> Use contextual bandits before RL where its suited for things such as; what team the user likes most, what the user usually predicts, watch hat-</w:t>
+        <w:t xml:space="preserve"> Use contextual bandits before RL where </w:t>
+      </w:r>
+      <w:proofErr w:type="gramStart"/>
+      <w:r>
+        <w:t>its</w:t>
+      </w:r>
+      <w:proofErr w:type="gramEnd"/>
+      <w:r>
+        <w:t xml:space="preserve"> suited for things such as; what team the user likes most, what the user usually predicts, watch hat-</w:t>
       </w:r>
       <w:proofErr w:type="spellStart"/>
       <w:r>
@@ -2850,7 +2919,27 @@
           <w:lang w:eastAsia="en-GB"/>
           <w14:ligatures w14:val="none"/>
         </w:rPr>
-        <w:t>I want you to basically build the six engine model:</w:t>
+        <w:t xml:space="preserve">I want you to basically build the </w:t>
+      </w:r>
+      <w:proofErr w:type="gramStart"/>
+      <w:r>
+        <w:rPr>
+          <w:rFonts w:ascii="Times New Roman" w:eastAsia="Times New Roman" w:hAnsi="Times New Roman" w:cs="Times New Roman"/>
+          <w:kern w:val="0"/>
+          <w:lang w:eastAsia="en-GB"/>
+          <w14:ligatures w14:val="none"/>
+        </w:rPr>
+        <w:t>six engine</w:t>
+      </w:r>
+      <w:proofErr w:type="gramEnd"/>
+      <w:r>
+        <w:rPr>
+          <w:rFonts w:ascii="Times New Roman" w:eastAsia="Times New Roman" w:hAnsi="Times New Roman" w:cs="Times New Roman"/>
+          <w:kern w:val="0"/>
+          <w:lang w:eastAsia="en-GB"/>
+          <w14:ligatures w14:val="none"/>
+        </w:rPr>
+        <w:t xml:space="preserve"> model:</w:t>
       </w:r>
       <w:r>
         <w:rPr>
@@ -3730,8 +3819,19 @@
           <w:lang w:eastAsia="en-GB"/>
           <w14:ligatures w14:val="none"/>
         </w:rPr>
-        <w:t xml:space="preserve">                    / reinforcement</w:t>
-      </w:r>
+        <w:t xml:space="preserve">                    / </w:t>
+      </w:r>
+      <w:proofErr w:type="gramStart"/>
+      <w:r>
+        <w:rPr>
+          <w:rFonts w:ascii="Times New Roman" w:eastAsia="Times New Roman" w:hAnsi="Times New Roman" w:cs="Times New Roman"/>
+          <w:kern w:val="0"/>
+          <w:lang w:eastAsia="en-GB"/>
+          <w14:ligatures w14:val="none"/>
+        </w:rPr>
+        <w:t>reinforcement</w:t>
+      </w:r>
+      <w:proofErr w:type="gramEnd"/>
     </w:p>
     <w:p>
       <w:pPr>
@@ -6324,7 +6424,15 @@
       <w:proofErr w:type="spellEnd"/>
       <w:r>
         <w:br/>
-        <w:t xml:space="preserve">8. Phase 2 bullet point 1; my answer is for you to find a free open source alternative for live updates (this is regarding the </w:t>
+        <w:t xml:space="preserve">8. Phase 2 bullet point 1; my answer is for you to find a free </w:t>
+      </w:r>
+      <w:proofErr w:type="gramStart"/>
+      <w:r>
+        <w:t>open source</w:t>
+      </w:r>
+      <w:proofErr w:type="gramEnd"/>
+      <w:r>
+        <w:t xml:space="preserve"> alternative for live updates (this is regarding the </w:t>
       </w:r>
       <w:r>
         <w:t>train the temporal Transformer + GNN</w:t>
@@ -6343,6 +6451,629 @@
           <w14:ligatures w14:val="none"/>
         </w:rPr>
       </w:pPr>
+      <w:r>
+        <w:rPr>
+          <w:rFonts w:ascii="Times New Roman" w:eastAsia="Times New Roman" w:hAnsi="Times New Roman" w:cs="Times New Roman"/>
+          <w:b/>
+          <w:bCs/>
+          <w:kern w:val="0"/>
+          <w:sz w:val="48"/>
+          <w:szCs w:val="48"/>
+          <w:lang w:eastAsia="en-GB"/>
+          <w14:ligatures w14:val="none"/>
+        </w:rPr>
+        <w:t>6.</w:t>
+      </w:r>
+      <w:r>
+        <w:rPr>
+          <w:rFonts w:ascii="Times New Roman" w:eastAsia="Times New Roman" w:hAnsi="Times New Roman" w:cs="Times New Roman"/>
+          <w:kern w:val="0"/>
+          <w:lang w:eastAsia="en-GB"/>
+          <w14:ligatures w14:val="none"/>
+        </w:rPr>
+        <w:t xml:space="preserve"> </w:t>
+      </w:r>
+      <w:r>
+        <w:rPr>
+          <w:rFonts w:ascii="Times New Roman" w:eastAsia="Times New Roman" w:hAnsi="Times New Roman" w:cs="Times New Roman"/>
+          <w:kern w:val="0"/>
+          <w:lang w:eastAsia="en-GB"/>
+          <w14:ligatures w14:val="none"/>
+        </w:rPr>
+        <w:br/>
+        <w:t xml:space="preserve">1. The name of the model is </w:t>
+      </w:r>
+      <w:proofErr w:type="spellStart"/>
+      <w:r>
+        <w:rPr>
+          <w:rFonts w:ascii="Times New Roman" w:eastAsia="Times New Roman" w:hAnsi="Times New Roman" w:cs="Times New Roman"/>
+          <w:kern w:val="0"/>
+          <w:lang w:eastAsia="en-GB"/>
+          <w14:ligatures w14:val="none"/>
+        </w:rPr>
+        <w:t>Ve</w:t>
+      </w:r>
+      <w:r>
+        <w:rPr>
+          <w:rFonts w:ascii="Times New Roman" w:eastAsia="Times New Roman" w:hAnsi="Times New Roman" w:cs="Times New Roman"/>
+          <w:kern w:val="0"/>
+          <w:lang w:eastAsia="en-GB"/>
+          <w14:ligatures w14:val="none"/>
+        </w:rPr>
+        <w:t>ndicator</w:t>
+      </w:r>
+      <w:proofErr w:type="spellEnd"/>
+      <w:r>
+        <w:rPr>
+          <w:rFonts w:ascii="Times New Roman" w:eastAsia="Times New Roman" w:hAnsi="Times New Roman" w:cs="Times New Roman"/>
+          <w:kern w:val="0"/>
+          <w:lang w:eastAsia="en-GB"/>
+          <w14:ligatures w14:val="none"/>
+        </w:rPr>
+        <w:t xml:space="preserve"> not vindicator.</w:t>
+      </w:r>
+      <w:r>
+        <w:rPr>
+          <w:rFonts w:ascii="Times New Roman" w:eastAsia="Times New Roman" w:hAnsi="Times New Roman" w:cs="Times New Roman"/>
+          <w:kern w:val="0"/>
+          <w:lang w:eastAsia="en-GB"/>
+          <w14:ligatures w14:val="none"/>
+        </w:rPr>
+        <w:br/>
+        <w:t xml:space="preserve">2. Use more modern tone colours like </w:t>
+      </w:r>
+      <w:proofErr w:type="spellStart"/>
+      <w:r>
+        <w:rPr>
+          <w:rFonts w:ascii="Times New Roman" w:eastAsia="Times New Roman" w:hAnsi="Times New Roman" w:cs="Times New Roman"/>
+          <w:kern w:val="0"/>
+          <w:lang w:eastAsia="en-GB"/>
+          <w14:ligatures w14:val="none"/>
+        </w:rPr>
+        <w:t>patone</w:t>
+      </w:r>
+      <w:proofErr w:type="spellEnd"/>
+      <w:r>
+        <w:rPr>
+          <w:rFonts w:ascii="Times New Roman" w:eastAsia="Times New Roman" w:hAnsi="Times New Roman" w:cs="Times New Roman"/>
+          <w:kern w:val="0"/>
+          <w:lang w:eastAsia="en-GB"/>
+          <w14:ligatures w14:val="none"/>
+        </w:rPr>
+        <w:t xml:space="preserve"> and </w:t>
+      </w:r>
+      <w:r>
+        <w:rPr>
+          <w:rFonts w:ascii="Times New Roman" w:eastAsia="Times New Roman" w:hAnsi="Times New Roman" w:cs="Times New Roman"/>
+          <w:kern w:val="0"/>
+          <w:lang w:eastAsia="en-GB"/>
+          <w14:ligatures w14:val="none"/>
+        </w:rPr>
+        <w:t xml:space="preserve">lighter white and/or lime green style </w:t>
+      </w:r>
+      <w:r>
+        <w:rPr>
+          <w:rFonts w:ascii="Times New Roman" w:eastAsia="Times New Roman" w:hAnsi="Times New Roman" w:cs="Times New Roman"/>
+          <w:kern w:val="0"/>
+          <w:lang w:eastAsia="en-GB"/>
+          <w14:ligatures w14:val="none"/>
+        </w:rPr>
+        <w:t>neon highlights and streaks. Also use a</w:t>
+      </w:r>
+      <w:r>
+        <w:rPr>
+          <w:rFonts w:ascii="Times New Roman" w:eastAsia="Times New Roman" w:hAnsi="Times New Roman" w:cs="Times New Roman"/>
+          <w:kern w:val="0"/>
+          <w:lang w:eastAsia="en-GB"/>
+          <w14:ligatures w14:val="none"/>
+        </w:rPr>
+        <w:t xml:space="preserve"> more metallic dark grey </w:t>
+      </w:r>
+      <w:r>
+        <w:rPr>
+          <w:rFonts w:ascii="Times New Roman" w:eastAsia="Times New Roman" w:hAnsi="Times New Roman" w:cs="Times New Roman"/>
+          <w:kern w:val="0"/>
+          <w:lang w:eastAsia="en-GB"/>
+          <w14:ligatures w14:val="none"/>
+        </w:rPr>
+        <w:t>theme with a glass type theme.</w:t>
+      </w:r>
+      <w:r>
+        <w:rPr>
+          <w:rFonts w:ascii="Times New Roman" w:eastAsia="Times New Roman" w:hAnsi="Times New Roman" w:cs="Times New Roman"/>
+          <w:kern w:val="0"/>
+          <w:lang w:eastAsia="en-GB"/>
+          <w14:ligatures w14:val="none"/>
+        </w:rPr>
+        <w:br/>
+        <w:t>3.</w:t>
+      </w:r>
+      <w:r>
+        <w:rPr>
+          <w:rFonts w:ascii="Times New Roman" w:eastAsia="Times New Roman" w:hAnsi="Times New Roman" w:cs="Times New Roman"/>
+          <w:kern w:val="0"/>
+          <w:lang w:eastAsia="en-GB"/>
+          <w14:ligatures w14:val="none"/>
+        </w:rPr>
+        <w:t xml:space="preserve"> Use team and player icons such as badges and player profile pictures for player info statistics when clicking on a player name or team on hover over.</w:t>
+      </w:r>
+      <w:r>
+        <w:rPr>
+          <w:rFonts w:ascii="Times New Roman" w:eastAsia="Times New Roman" w:hAnsi="Times New Roman" w:cs="Times New Roman"/>
+          <w:kern w:val="0"/>
+          <w:lang w:eastAsia="en-GB"/>
+          <w14:ligatures w14:val="none"/>
+        </w:rPr>
+        <w:br/>
+      </w:r>
+      <w:r>
+        <w:rPr>
+          <w:rFonts w:ascii="Times New Roman" w:eastAsia="Times New Roman" w:hAnsi="Times New Roman" w:cs="Times New Roman"/>
+          <w:kern w:val="0"/>
+          <w:lang w:eastAsia="en-GB"/>
+          <w14:ligatures w14:val="none"/>
+        </w:rPr>
+        <w:lastRenderedPageBreak/>
+        <w:t xml:space="preserve">4. Can you make the live browser preview the actual website where the app/model will be located on my web hosting </w:t>
+      </w:r>
+      <w:hyperlink r:id="rId6" w:history="1">
+        <w:r>
+          <w:rPr>
+            <w:rStyle w:val="Hyperlink"/>
+            <w:rFonts w:ascii="Times New Roman" w:eastAsia="Times New Roman" w:hAnsi="Times New Roman" w:cs="Times New Roman"/>
+            <w:kern w:val="0"/>
+            <w:lang w:eastAsia="en-GB"/>
+            <w14:ligatures w14:val="none"/>
+          </w:rPr>
+          <w:t>www.vendicator.co.uk</w:t>
+        </w:r>
+      </w:hyperlink>
+      <w:r>
+        <w:rPr>
+          <w:rFonts w:ascii="Times New Roman" w:eastAsia="Times New Roman" w:hAnsi="Times New Roman" w:cs="Times New Roman"/>
+          <w:kern w:val="0"/>
+          <w:lang w:eastAsia="en-GB"/>
+          <w14:ligatures w14:val="none"/>
+        </w:rPr>
+        <w:t xml:space="preserve"> (using the staging setup). Displaying the login screen with a signup option to access the model. Then create a system where the login credentials save to the </w:t>
+      </w:r>
+      <w:proofErr w:type="spellStart"/>
+      <w:proofErr w:type="gramStart"/>
+      <w:r>
+        <w:rPr>
+          <w:rFonts w:ascii="Times New Roman" w:eastAsia="Times New Roman" w:hAnsi="Times New Roman" w:cs="Times New Roman"/>
+          <w:kern w:val="0"/>
+          <w:lang w:eastAsia="en-GB"/>
+          <w14:ligatures w14:val="none"/>
+        </w:rPr>
+        <w:t>records.json</w:t>
+      </w:r>
+      <w:proofErr w:type="spellEnd"/>
+      <w:proofErr w:type="gramEnd"/>
+      <w:r>
+        <w:rPr>
+          <w:rFonts w:ascii="Times New Roman" w:eastAsia="Times New Roman" w:hAnsi="Times New Roman" w:cs="Times New Roman"/>
+          <w:kern w:val="0"/>
+          <w:lang w:eastAsia="en-GB"/>
+          <w14:ligatures w14:val="none"/>
+        </w:rPr>
+        <w:t>. Recording all relevant user information for a gaming/ predictions model.</w:t>
+      </w:r>
+      <w:r>
+        <w:rPr>
+          <w:rFonts w:ascii="Times New Roman" w:eastAsia="Times New Roman" w:hAnsi="Times New Roman" w:cs="Times New Roman"/>
+          <w:kern w:val="0"/>
+          <w:lang w:eastAsia="en-GB"/>
+          <w14:ligatures w14:val="none"/>
+        </w:rPr>
+        <w:br/>
+        <w:t xml:space="preserve">5. Complete this next step for the data pulling and </w:t>
+      </w:r>
+      <w:proofErr w:type="spellStart"/>
+      <w:r>
+        <w:rPr>
+          <w:rFonts w:ascii="Times New Roman" w:eastAsia="Times New Roman" w:hAnsi="Times New Roman" w:cs="Times New Roman"/>
+          <w:kern w:val="0"/>
+          <w:lang w:eastAsia="en-GB"/>
+          <w14:ligatures w14:val="none"/>
+        </w:rPr>
+        <w:t>intergration</w:t>
+      </w:r>
+      <w:proofErr w:type="spellEnd"/>
+      <w:r>
+        <w:rPr>
+          <w:rFonts w:ascii="Times New Roman" w:eastAsia="Times New Roman" w:hAnsi="Times New Roman" w:cs="Times New Roman"/>
+          <w:kern w:val="0"/>
+          <w:lang w:eastAsia="en-GB"/>
+          <w14:ligatures w14:val="none"/>
+        </w:rPr>
+        <w:t xml:space="preserve">: </w:t>
+      </w:r>
+      <w:proofErr w:type="spellStart"/>
+      <w:r>
+        <w:rPr>
+          <w:rFonts w:ascii="Times New Roman" w:eastAsia="Times New Roman" w:hAnsi="Times New Roman" w:cs="Times New Roman"/>
+          <w:kern w:val="0"/>
+          <w:lang w:eastAsia="en-GB"/>
+          <w14:ligatures w14:val="none"/>
+        </w:rPr>
+        <w:t>StatsBomb</w:t>
+      </w:r>
+      <w:proofErr w:type="spellEnd"/>
+      <w:r>
+        <w:rPr>
+          <w:rFonts w:ascii="Times New Roman" w:eastAsia="Times New Roman" w:hAnsi="Times New Roman" w:cs="Times New Roman"/>
+          <w:kern w:val="0"/>
+          <w:lang w:eastAsia="en-GB"/>
+          <w14:ligatures w14:val="none"/>
+        </w:rPr>
+        <w:t xml:space="preserve"> Open Data and API-Football injuries/</w:t>
+      </w:r>
+      <w:proofErr w:type="spellStart"/>
+      <w:r>
+        <w:rPr>
+          <w:rFonts w:ascii="Times New Roman" w:eastAsia="Times New Roman" w:hAnsi="Times New Roman" w:cs="Times New Roman"/>
+          <w:kern w:val="0"/>
+          <w:lang w:eastAsia="en-GB"/>
+          <w14:ligatures w14:val="none"/>
+        </w:rPr>
+        <w:t>lineups</w:t>
+      </w:r>
+      <w:proofErr w:type="spellEnd"/>
+      <w:r>
+        <w:rPr>
+          <w:rFonts w:ascii="Times New Roman" w:eastAsia="Times New Roman" w:hAnsi="Times New Roman" w:cs="Times New Roman"/>
+          <w:kern w:val="0"/>
+          <w:lang w:eastAsia="en-GB"/>
+          <w14:ligatures w14:val="none"/>
+        </w:rPr>
+        <w:t xml:space="preserve"> adapters are also in place for the next step</w:t>
+      </w:r>
+      <w:r>
+        <w:rPr>
+          <w:rFonts w:ascii="Times New Roman" w:eastAsia="Times New Roman" w:hAnsi="Times New Roman" w:cs="Times New Roman"/>
+          <w:kern w:val="0"/>
+          <w:lang w:eastAsia="en-GB"/>
+          <w14:ligatures w14:val="none"/>
+        </w:rPr>
+        <w:t xml:space="preserve"> </w:t>
+      </w:r>
+    </w:p>
+    <w:p>
+      <w:pPr>
+        <w:spacing w:before="100" w:beforeAutospacing="1" w:after="100" w:afterAutospacing="1"/>
+        <w:rPr>
+          <w:rFonts w:ascii="Times New Roman" w:eastAsia="Times New Roman" w:hAnsi="Times New Roman" w:cs="Times New Roman"/>
+          <w:kern w:val="0"/>
+          <w:lang w:eastAsia="en-GB"/>
+          <w14:ligatures w14:val="none"/>
+        </w:rPr>
+      </w:pPr>
+      <w:r>
+        <w:rPr>
+          <w:rFonts w:ascii="Times New Roman" w:eastAsia="Times New Roman" w:hAnsi="Times New Roman" w:cs="Times New Roman"/>
+          <w:kern w:val="0"/>
+          <w:lang w:eastAsia="en-GB"/>
+          <w14:ligatures w14:val="none"/>
+        </w:rPr>
+        <w:t xml:space="preserve">6. Run all the items in this section: </w:t>
+      </w:r>
+      <w:r>
+        <w:rPr>
+          <w:rFonts w:ascii="Times New Roman" w:eastAsia="Times New Roman" w:hAnsi="Times New Roman" w:cs="Times New Roman"/>
+          <w:kern w:val="0"/>
+          <w:lang w:eastAsia="en-GB"/>
+          <w14:ligatures w14:val="none"/>
+        </w:rPr>
+        <w:t>Item 3 — Brier improvement suggestions (your confirmation needed)</w:t>
+      </w:r>
+      <w:r>
+        <w:rPr>
+          <w:rFonts w:ascii="Times New Roman" w:eastAsia="Times New Roman" w:hAnsi="Times New Roman" w:cs="Times New Roman"/>
+          <w:kern w:val="0"/>
+          <w:lang w:eastAsia="en-GB"/>
+          <w14:ligatures w14:val="none"/>
+        </w:rPr>
+        <w:t xml:space="preserve"> (but also find </w:t>
+      </w:r>
+      <w:proofErr w:type="spellStart"/>
+      <w:r>
+        <w:rPr>
+          <w:rFonts w:ascii="Times New Roman" w:eastAsia="Times New Roman" w:hAnsi="Times New Roman" w:cs="Times New Roman"/>
+          <w:kern w:val="0"/>
+          <w:lang w:eastAsia="en-GB"/>
+          <w14:ligatures w14:val="none"/>
+        </w:rPr>
+        <w:t>english</w:t>
+      </w:r>
+      <w:proofErr w:type="spellEnd"/>
+      <w:r>
+        <w:rPr>
+          <w:rFonts w:ascii="Times New Roman" w:eastAsia="Times New Roman" w:hAnsi="Times New Roman" w:cs="Times New Roman"/>
+          <w:kern w:val="0"/>
+          <w:lang w:eastAsia="en-GB"/>
+          <w14:ligatures w14:val="none"/>
+        </w:rPr>
+        <w:t xml:space="preserve"> championship, league 1, league 2 and champions league and </w:t>
+      </w:r>
+      <w:proofErr w:type="spellStart"/>
+      <w:r>
+        <w:rPr>
+          <w:rFonts w:ascii="Times New Roman" w:eastAsia="Times New Roman" w:hAnsi="Times New Roman" w:cs="Times New Roman"/>
+          <w:kern w:val="0"/>
+          <w:lang w:eastAsia="en-GB"/>
+          <w14:ligatures w14:val="none"/>
+        </w:rPr>
+        <w:t>uefa</w:t>
+      </w:r>
+      <w:proofErr w:type="spellEnd"/>
+      <w:r>
+        <w:rPr>
+          <w:rFonts w:ascii="Times New Roman" w:eastAsia="Times New Roman" w:hAnsi="Times New Roman" w:cs="Times New Roman"/>
+          <w:kern w:val="0"/>
+          <w:lang w:eastAsia="en-GB"/>
+          <w14:ligatures w14:val="none"/>
+        </w:rPr>
+        <w:t xml:space="preserve"> league free data source and historical data to use.</w:t>
+      </w:r>
+      <w:r>
+        <w:rPr>
+          <w:rFonts w:ascii="Times New Roman" w:eastAsia="Times New Roman" w:hAnsi="Times New Roman" w:cs="Times New Roman"/>
+          <w:kern w:val="0"/>
+          <w:lang w:eastAsia="en-GB"/>
+          <w14:ligatures w14:val="none"/>
+        </w:rPr>
+        <w:br/>
+        <w:t xml:space="preserve">7. Make sure that the admin to login to this model will be me using the email </w:t>
+      </w:r>
+      <w:hyperlink r:id="rId7" w:history="1">
+        <w:r>
+          <w:rPr>
+            <w:rStyle w:val="Hyperlink"/>
+            <w:rFonts w:ascii="Times New Roman" w:eastAsia="Times New Roman" w:hAnsi="Times New Roman" w:cs="Times New Roman"/>
+            <w:kern w:val="0"/>
+            <w:lang w:eastAsia="en-GB"/>
+            <w14:ligatures w14:val="none"/>
+          </w:rPr>
+          <w:t>bluetuxedo808@proton.me</w:t>
+        </w:r>
+      </w:hyperlink>
+      <w:r>
+        <w:rPr>
+          <w:rFonts w:ascii="Times New Roman" w:eastAsia="Times New Roman" w:hAnsi="Times New Roman" w:cs="Times New Roman"/>
+          <w:kern w:val="0"/>
+          <w:lang w:eastAsia="en-GB"/>
+          <w14:ligatures w14:val="none"/>
+        </w:rPr>
+        <w:t xml:space="preserve">. </w:t>
+      </w:r>
+      <w:r>
+        <w:rPr>
+          <w:rFonts w:ascii="Times New Roman" w:eastAsia="Times New Roman" w:hAnsi="Times New Roman" w:cs="Times New Roman"/>
+          <w:kern w:val="0"/>
+          <w:lang w:eastAsia="en-GB"/>
+          <w14:ligatures w14:val="none"/>
+        </w:rPr>
+        <w:t>And use a temporary password of 123 for now so I can log in to the admin panel where I can model changes, manage subscriptions, ban users, create package rewards and more, where I can add sections for the future easily.</w:t>
+      </w:r>
+      <w:r>
+        <w:rPr>
+          <w:rFonts w:ascii="Times New Roman" w:eastAsia="Times New Roman" w:hAnsi="Times New Roman" w:cs="Times New Roman"/>
+          <w:kern w:val="0"/>
+          <w:lang w:eastAsia="en-GB"/>
+          <w14:ligatures w14:val="none"/>
+        </w:rPr>
+        <w:br/>
+      </w:r>
+      <w:proofErr w:type="gramStart"/>
+      <w:r>
+        <w:rPr>
+          <w:rFonts w:ascii="Times New Roman" w:eastAsia="Times New Roman" w:hAnsi="Times New Roman" w:cs="Times New Roman"/>
+          <w:kern w:val="0"/>
+          <w:lang w:eastAsia="en-GB"/>
+          <w14:ligatures w14:val="none"/>
+        </w:rPr>
+        <w:t>8.</w:t>
+      </w:r>
+      <w:r>
+        <w:rPr>
+          <w:rFonts w:ascii="Times New Roman" w:eastAsia="Times New Roman" w:hAnsi="Times New Roman" w:cs="Times New Roman"/>
+          <w:kern w:val="0"/>
+          <w:lang w:eastAsia="en-GB"/>
+          <w14:ligatures w14:val="none"/>
+        </w:rPr>
+        <w:t>Also</w:t>
+      </w:r>
+      <w:proofErr w:type="gramEnd"/>
+      <w:r>
+        <w:rPr>
+          <w:rFonts w:ascii="Times New Roman" w:eastAsia="Times New Roman" w:hAnsi="Times New Roman" w:cs="Times New Roman"/>
+          <w:kern w:val="0"/>
+          <w:lang w:eastAsia="en-GB"/>
+          <w14:ligatures w14:val="none"/>
+        </w:rPr>
+        <w:t xml:space="preserve"> make the account section with sections such as; settings, competitions/leagues, betting history, reward history and graph tally (with modern look), manage profile to add custom pictures and change rewards pictures and manage subscriptions etc.</w:t>
+      </w:r>
+      <w:r>
+        <w:rPr>
+          <w:rFonts w:ascii="Times New Roman" w:eastAsia="Times New Roman" w:hAnsi="Times New Roman" w:cs="Times New Roman"/>
+          <w:kern w:val="0"/>
+          <w:lang w:eastAsia="en-GB"/>
+          <w14:ligatures w14:val="none"/>
+        </w:rPr>
+        <w:br/>
+        <w:t xml:space="preserve">8. Run all of item6 </w:t>
+      </w:r>
+      <w:r>
+        <w:rPr>
+          <w:rFonts w:ascii="Times New Roman" w:eastAsia="Times New Roman" w:hAnsi="Times New Roman" w:cs="Times New Roman"/>
+          <w:kern w:val="0"/>
+          <w:lang w:eastAsia="en-GB"/>
+          <w14:ligatures w14:val="none"/>
+        </w:rPr>
+        <w:t>VPS-free alternatives (implemented as the plan</w:t>
+      </w:r>
+      <w:r>
+        <w:rPr>
+          <w:rFonts w:ascii="Times New Roman" w:eastAsia="Times New Roman" w:hAnsi="Times New Roman" w:cs="Times New Roman"/>
+          <w:kern w:val="0"/>
+          <w:lang w:eastAsia="en-GB"/>
+          <w14:ligatures w14:val="none"/>
+        </w:rPr>
+        <w:t xml:space="preserve"> integrated as part of the reward system and for the admin to make global changes to the system entirely</w:t>
+      </w:r>
+      <w:r>
+        <w:rPr>
+          <w:rFonts w:ascii="Times New Roman" w:eastAsia="Times New Roman" w:hAnsi="Times New Roman" w:cs="Times New Roman"/>
+          <w:kern w:val="0"/>
+          <w:lang w:eastAsia="en-GB"/>
+          <w14:ligatures w14:val="none"/>
+        </w:rPr>
+        <w:t>, hold confirmed)</w:t>
+      </w:r>
+      <w:r>
+        <w:rPr>
+          <w:rFonts w:ascii="Times New Roman" w:eastAsia="Times New Roman" w:hAnsi="Times New Roman" w:cs="Times New Roman"/>
+          <w:kern w:val="0"/>
+          <w:lang w:eastAsia="en-GB"/>
+          <w14:ligatures w14:val="none"/>
+        </w:rPr>
+        <w:t xml:space="preserve">. (be sure to include this: </w:t>
+      </w:r>
+      <w:r>
+        <w:rPr>
+          <w:rFonts w:ascii="Times New Roman" w:eastAsia="Times New Roman" w:hAnsi="Times New Roman" w:cs="Times New Roman"/>
+          <w:kern w:val="0"/>
+          <w:lang w:eastAsia="en-GB"/>
+          <w14:ligatures w14:val="none"/>
+        </w:rPr>
+        <w:t>I'll add an "Infrastructure upgrades" panel in the WP admin plugin with these as greyed-out toggles (VPS required) so the upgrade path is visible in your admin UI when you're ready.</w:t>
+      </w:r>
+      <w:r>
+        <w:rPr>
+          <w:rFonts w:ascii="Times New Roman" w:eastAsia="Times New Roman" w:hAnsi="Times New Roman" w:cs="Times New Roman"/>
+          <w:kern w:val="0"/>
+          <w:lang w:eastAsia="en-GB"/>
+          <w14:ligatures w14:val="none"/>
+        </w:rPr>
+        <w:t>)</w:t>
+      </w:r>
+      <w:r>
+        <w:rPr>
+          <w:rFonts w:ascii="Times New Roman" w:eastAsia="Times New Roman" w:hAnsi="Times New Roman" w:cs="Times New Roman"/>
+          <w:kern w:val="0"/>
+          <w:lang w:eastAsia="en-GB"/>
+          <w14:ligatures w14:val="none"/>
+        </w:rPr>
+        <w:br/>
+        <w:t xml:space="preserve">9. I confirm that you run all of phase 2 in item 8: </w:t>
+      </w:r>
+      <w:r>
+        <w:rPr>
+          <w:rFonts w:ascii="Times New Roman" w:eastAsia="Times New Roman" w:hAnsi="Times New Roman" w:cs="Times New Roman"/>
+          <w:kern w:val="0"/>
+          <w:lang w:eastAsia="en-GB"/>
+          <w14:ligatures w14:val="none"/>
+        </w:rPr>
+        <w:t>Item 8 — Phase 2 free alternative (confirmed approach)</w:t>
+      </w:r>
+      <w:r>
+        <w:rPr>
+          <w:rFonts w:ascii="Times New Roman" w:eastAsia="Times New Roman" w:hAnsi="Times New Roman" w:cs="Times New Roman"/>
+          <w:kern w:val="0"/>
+          <w:lang w:eastAsia="en-GB"/>
+          <w14:ligatures w14:val="none"/>
+        </w:rPr>
+        <w:t xml:space="preserve">; </w:t>
+      </w:r>
+      <w:r>
+        <w:rPr>
+          <w:rFonts w:ascii="Times New Roman" w:eastAsia="Times New Roman" w:hAnsi="Times New Roman" w:cs="Times New Roman"/>
+          <w:kern w:val="0"/>
+          <w:lang w:eastAsia="en-GB"/>
+          <w14:ligatures w14:val="none"/>
+        </w:rPr>
+        <w:t xml:space="preserve">The temporal Transformer + GNN will be prototyped free on </w:t>
+      </w:r>
+      <w:proofErr w:type="spellStart"/>
+      <w:r>
+        <w:rPr>
+          <w:rFonts w:ascii="Times New Roman" w:eastAsia="Times New Roman" w:hAnsi="Times New Roman" w:cs="Times New Roman"/>
+          <w:kern w:val="0"/>
+          <w:lang w:eastAsia="en-GB"/>
+          <w14:ligatures w14:val="none"/>
+        </w:rPr>
+        <w:t>StatsBomb</w:t>
+      </w:r>
+      <w:proofErr w:type="spellEnd"/>
+      <w:r>
+        <w:rPr>
+          <w:rFonts w:ascii="Times New Roman" w:eastAsia="Times New Roman" w:hAnsi="Times New Roman" w:cs="Times New Roman"/>
+          <w:kern w:val="0"/>
+          <w:lang w:eastAsia="en-GB"/>
+          <w14:ligatures w14:val="none"/>
+        </w:rPr>
+        <w:t xml:space="preserve"> Open Data (adapter ready), and appear in the admin panel as an upgradable model option next to the others — switchable when you later buy an event feed and the trained models beat the analytic engine on live Brier.</w:t>
+      </w:r>
+      <w:r>
+        <w:rPr>
+          <w:rFonts w:ascii="Times New Roman" w:eastAsia="Times New Roman" w:hAnsi="Times New Roman" w:cs="Times New Roman"/>
+          <w:kern w:val="0"/>
+          <w:lang w:eastAsia="en-GB"/>
+          <w14:ligatures w14:val="none"/>
+        </w:rPr>
+        <w:br/>
+        <w:t xml:space="preserve">10. Then complete this next step: </w:t>
+      </w:r>
+      <w:r>
+        <w:rPr>
+          <w:rFonts w:ascii="Times New Roman" w:eastAsia="Times New Roman" w:hAnsi="Times New Roman" w:cs="Times New Roman"/>
+          <w:kern w:val="0"/>
+          <w:lang w:eastAsia="en-GB"/>
+          <w14:ligatures w14:val="none"/>
+        </w:rPr>
+        <w:t>Next step when you're ready: build the WordPress plugin (</w:t>
+      </w:r>
+      <w:proofErr w:type="spellStart"/>
+      <w:r>
+        <w:rPr>
+          <w:rFonts w:ascii="Times New Roman" w:eastAsia="Times New Roman" w:hAnsi="Times New Roman" w:cs="Times New Roman"/>
+          <w:kern w:val="0"/>
+          <w:lang w:eastAsia="en-GB"/>
+          <w14:ligatures w14:val="none"/>
+        </w:rPr>
+        <w:t>wp</w:t>
+      </w:r>
+      <w:proofErr w:type="spellEnd"/>
+      <w:r>
+        <w:rPr>
+          <w:rFonts w:ascii="Times New Roman" w:eastAsia="Times New Roman" w:hAnsi="Times New Roman" w:cs="Times New Roman"/>
+          <w:kern w:val="0"/>
+          <w:lang w:eastAsia="en-GB"/>
+          <w14:ligatures w14:val="none"/>
+        </w:rPr>
+        <w:t xml:space="preserve">-deploy/) with the admin model-selector dropdowns and the subscriptions/rewards integration, then the Bricks pages via </w:t>
+      </w:r>
+      <w:proofErr w:type="spellStart"/>
+      <w:r>
+        <w:rPr>
+          <w:rFonts w:ascii="Times New Roman" w:eastAsia="Times New Roman" w:hAnsi="Times New Roman" w:cs="Times New Roman"/>
+          <w:kern w:val="0"/>
+          <w:lang w:eastAsia="en-GB"/>
+          <w14:ligatures w14:val="none"/>
+        </w:rPr>
+        <w:t>NovaMira</w:t>
+      </w:r>
+      <w:proofErr w:type="spellEnd"/>
+      <w:r>
+        <w:rPr>
+          <w:rFonts w:ascii="Times New Roman" w:eastAsia="Times New Roman" w:hAnsi="Times New Roman" w:cs="Times New Roman"/>
+          <w:kern w:val="0"/>
+          <w:lang w:eastAsia="en-GB"/>
+          <w14:ligatures w14:val="none"/>
+        </w:rPr>
+        <w:t xml:space="preserve">. </w:t>
+      </w:r>
     </w:p>
     <w:sectPr>
       <w:pgSz w:w="11906" w:h="16838"/>

</xml_diff>

<commit_message>
Leagues manager, rank badges, profile/privacy revamp, cups + 10yr archive, injury logger, temporal retrain (300 matches)
</commit_message>
<xml_diff>
--- a/Notes/Vindicator Business Notes Plan.docx
+++ b/Notes/Vindicator Business Notes Plan.docx
@@ -6864,15 +6864,6 @@
           <w14:ligatures w14:val="none"/>
         </w:rPr>
         <w:br/>
-      </w:r>
-      <w:proofErr w:type="gramStart"/>
-      <w:r>
-        <w:rPr>
-          <w:rFonts w:ascii="Times New Roman" w:eastAsia="Times New Roman" w:hAnsi="Times New Roman" w:cs="Times New Roman"/>
-          <w:kern w:val="0"/>
-          <w:lang w:eastAsia="en-GB"/>
-          <w14:ligatures w14:val="none"/>
-        </w:rPr>
         <w:t>8.</w:t>
       </w:r>
       <w:r>
@@ -6882,17 +6873,7 @@
           <w:lang w:eastAsia="en-GB"/>
           <w14:ligatures w14:val="none"/>
         </w:rPr>
-        <w:t>Also</w:t>
-      </w:r>
-      <w:proofErr w:type="gramEnd"/>
-      <w:r>
-        <w:rPr>
-          <w:rFonts w:ascii="Times New Roman" w:eastAsia="Times New Roman" w:hAnsi="Times New Roman" w:cs="Times New Roman"/>
-          <w:kern w:val="0"/>
-          <w:lang w:eastAsia="en-GB"/>
-          <w14:ligatures w14:val="none"/>
-        </w:rPr>
-        <w:t xml:space="preserve"> make the account section with sections such as; settings, competitions/leagues, betting history, reward history and graph tally (with modern look), manage profile to add custom pictures and change rewards pictures and manage subscriptions etc.</w:t>
+        <w:t>Also make the account section with sections such as; settings, competitions/leagues, betting history, reward history and graph tally (with modern look), manage profile to add custom pictures and change rewards pictures and manage subscriptions etc.</w:t>
       </w:r>
       <w:r>
         <w:rPr>
@@ -7073,6 +7054,437 @@
           <w14:ligatures w14:val="none"/>
         </w:rPr>
         <w:t xml:space="preserve">. </w:t>
+      </w:r>
+    </w:p>
+    <w:p>
+      <w:pPr>
+        <w:spacing w:before="100" w:beforeAutospacing="1" w:after="100" w:afterAutospacing="1"/>
+        <w:rPr>
+          <w:rFonts w:ascii="Times New Roman" w:eastAsia="Times New Roman" w:hAnsi="Times New Roman" w:cs="Times New Roman"/>
+          <w:kern w:val="0"/>
+          <w:lang w:eastAsia="en-GB"/>
+          <w14:ligatures w14:val="none"/>
+        </w:rPr>
+      </w:pPr>
+    </w:p>
+    <w:p>
+      <w:pPr>
+        <w:spacing w:before="100" w:beforeAutospacing="1" w:after="100" w:afterAutospacing="1"/>
+        <w:rPr>
+          <w:rFonts w:ascii="Times New Roman" w:eastAsia="Times New Roman" w:hAnsi="Times New Roman" w:cs="Times New Roman"/>
+          <w:kern w:val="0"/>
+          <w:lang w:eastAsia="en-GB"/>
+          <w14:ligatures w14:val="none"/>
+        </w:rPr>
+      </w:pPr>
+      <w:r>
+        <w:rPr>
+          <w:rFonts w:ascii="Times New Roman" w:eastAsia="Times New Roman" w:hAnsi="Times New Roman" w:cs="Times New Roman"/>
+          <w:b/>
+          <w:bCs/>
+          <w:kern w:val="0"/>
+          <w:sz w:val="48"/>
+          <w:szCs w:val="48"/>
+          <w:lang w:eastAsia="en-GB"/>
+          <w14:ligatures w14:val="none"/>
+        </w:rPr>
+        <w:t>7.</w:t>
+      </w:r>
+      <w:r>
+        <w:rPr>
+          <w:rFonts w:ascii="Times New Roman" w:eastAsia="Times New Roman" w:hAnsi="Times New Roman" w:cs="Times New Roman"/>
+          <w:kern w:val="0"/>
+          <w:lang w:eastAsia="en-GB"/>
+          <w14:ligatures w14:val="none"/>
+        </w:rPr>
+        <w:br/>
+        <w:t>1. Make an option for more leagues to be added separate to the model engines in the admin panel</w:t>
+      </w:r>
+      <w:r>
+        <w:rPr>
+          <w:rFonts w:ascii="Times New Roman" w:eastAsia="Times New Roman" w:hAnsi="Times New Roman" w:cs="Times New Roman"/>
+          <w:kern w:val="0"/>
+          <w:lang w:eastAsia="en-GB"/>
+          <w14:ligatures w14:val="none"/>
+        </w:rPr>
+        <w:t xml:space="preserve"> for future upgrades.</w:t>
+      </w:r>
+      <w:r>
+        <w:rPr>
+          <w:rFonts w:ascii="Times New Roman" w:eastAsia="Times New Roman" w:hAnsi="Times New Roman" w:cs="Times New Roman"/>
+          <w:kern w:val="0"/>
+          <w:lang w:eastAsia="en-GB"/>
+          <w14:ligatures w14:val="none"/>
+        </w:rPr>
+        <w:br/>
+        <w:t xml:space="preserve">2. </w:t>
+      </w:r>
+      <w:r>
+        <w:rPr>
+          <w:rFonts w:ascii="Times New Roman" w:eastAsia="Times New Roman" w:hAnsi="Times New Roman" w:cs="Times New Roman"/>
+          <w:kern w:val="0"/>
+          <w:lang w:eastAsia="en-GB"/>
+          <w14:ligatures w14:val="none"/>
+        </w:rPr>
+        <w:t>Find and add la-Liga data for Spanish league</w:t>
+      </w:r>
+      <w:r>
+        <w:rPr>
+          <w:rFonts w:ascii="Times New Roman" w:eastAsia="Times New Roman" w:hAnsi="Times New Roman" w:cs="Times New Roman"/>
+          <w:kern w:val="0"/>
+          <w:lang w:eastAsia="en-GB"/>
+          <w14:ligatures w14:val="none"/>
+        </w:rPr>
+        <w:t>s</w:t>
+      </w:r>
+      <w:r>
+        <w:rPr>
+          <w:rFonts w:ascii="Times New Roman" w:eastAsia="Times New Roman" w:hAnsi="Times New Roman" w:cs="Times New Roman"/>
+          <w:kern w:val="0"/>
+          <w:lang w:eastAsia="en-GB"/>
+          <w14:ligatures w14:val="none"/>
+        </w:rPr>
+        <w:t xml:space="preserve"> and add Copa Italia for Italian leagues and make a selection box for this too so I can </w:t>
+      </w:r>
+      <w:r>
+        <w:rPr>
+          <w:rFonts w:ascii="Times New Roman" w:eastAsia="Times New Roman" w:hAnsi="Times New Roman" w:cs="Times New Roman"/>
+          <w:kern w:val="0"/>
+          <w:lang w:eastAsia="en-GB"/>
+          <w14:ligatures w14:val="none"/>
+        </w:rPr>
+        <w:t>add different</w:t>
+      </w:r>
+      <w:r>
+        <w:rPr>
+          <w:rFonts w:ascii="Times New Roman" w:eastAsia="Times New Roman" w:hAnsi="Times New Roman" w:cs="Times New Roman"/>
+          <w:kern w:val="0"/>
+          <w:lang w:eastAsia="en-GB"/>
+          <w14:ligatures w14:val="none"/>
+        </w:rPr>
+        <w:t xml:space="preserve"> leagues from different countries and continents </w:t>
+      </w:r>
+      <w:r>
+        <w:rPr>
+          <w:rFonts w:ascii="Times New Roman" w:eastAsia="Times New Roman" w:hAnsi="Times New Roman" w:cs="Times New Roman"/>
+          <w:kern w:val="0"/>
+          <w:lang w:eastAsia="en-GB"/>
+          <w14:ligatures w14:val="none"/>
+        </w:rPr>
+        <w:t xml:space="preserve">from </w:t>
+      </w:r>
+      <w:r>
+        <w:rPr>
+          <w:rFonts w:ascii="Times New Roman" w:eastAsia="Times New Roman" w:hAnsi="Times New Roman" w:cs="Times New Roman"/>
+          <w:kern w:val="0"/>
+          <w:lang w:eastAsia="en-GB"/>
+          <w14:ligatures w14:val="none"/>
+        </w:rPr>
+        <w:t>around the world in the future.</w:t>
+      </w:r>
+      <w:r>
+        <w:rPr>
+          <w:rFonts w:ascii="Times New Roman" w:eastAsia="Times New Roman" w:hAnsi="Times New Roman" w:cs="Times New Roman"/>
+          <w:kern w:val="0"/>
+          <w:lang w:eastAsia="en-GB"/>
+          <w14:ligatures w14:val="none"/>
+        </w:rPr>
+        <w:br/>
+        <w:t>3. Make sure the teams and leagues information can be logged and stored on a file which continuously updates so my model can have a record dating back over 5-10 years of sports data to present.</w:t>
+      </w:r>
+      <w:r>
+        <w:rPr>
+          <w:rFonts w:ascii="Times New Roman" w:eastAsia="Times New Roman" w:hAnsi="Times New Roman" w:cs="Times New Roman"/>
+          <w:kern w:val="0"/>
+          <w:lang w:eastAsia="en-GB"/>
+          <w14:ligatures w14:val="none"/>
+        </w:rPr>
+        <w:br/>
+        <w:t xml:space="preserve">4. Remove the option to upload a picture instead replace it for a </w:t>
+      </w:r>
+      <w:proofErr w:type="gramStart"/>
+      <w:r>
+        <w:rPr>
+          <w:rFonts w:ascii="Times New Roman" w:eastAsia="Times New Roman" w:hAnsi="Times New Roman" w:cs="Times New Roman"/>
+          <w:kern w:val="0"/>
+          <w:lang w:eastAsia="en-GB"/>
+          <w14:ligatures w14:val="none"/>
+        </w:rPr>
+        <w:t>rewards</w:t>
+      </w:r>
+      <w:proofErr w:type="gramEnd"/>
+      <w:r>
+        <w:rPr>
+          <w:rFonts w:ascii="Times New Roman" w:eastAsia="Times New Roman" w:hAnsi="Times New Roman" w:cs="Times New Roman"/>
+          <w:kern w:val="0"/>
+          <w:lang w:eastAsia="en-GB"/>
+          <w14:ligatures w14:val="none"/>
+        </w:rPr>
+        <w:t xml:space="preserve"> ranking icon system, where the users ranking rating will go up based on their collected points total and will show a new and “improved” icon/badge to represent the users status on this model.</w:t>
+      </w:r>
+      <w:r>
+        <w:rPr>
+          <w:rFonts w:ascii="Times New Roman" w:eastAsia="Times New Roman" w:hAnsi="Times New Roman" w:cs="Times New Roman"/>
+          <w:kern w:val="0"/>
+          <w:lang w:eastAsia="en-GB"/>
+          <w14:ligatures w14:val="none"/>
+        </w:rPr>
+        <w:br/>
+        <w:t xml:space="preserve">5. Complete the next steps in 9. </w:t>
+      </w:r>
+      <w:r>
+        <w:rPr>
+          <w:rFonts w:ascii="Times New Roman" w:eastAsia="Times New Roman" w:hAnsi="Times New Roman" w:cs="Times New Roman"/>
+          <w:kern w:val="0"/>
+          <w:lang w:eastAsia="en-GB"/>
+          <w14:ligatures w14:val="none"/>
+        </w:rPr>
+        <w:t>T</w:t>
+      </w:r>
+      <w:r>
+        <w:rPr>
+          <w:rFonts w:ascii="Times New Roman" w:eastAsia="Times New Roman" w:hAnsi="Times New Roman" w:cs="Times New Roman"/>
+          <w:kern w:val="0"/>
+          <w:lang w:eastAsia="en-GB"/>
+          <w14:ligatures w14:val="none"/>
+        </w:rPr>
+        <w:t>emporal</w:t>
+      </w:r>
+      <w:r>
+        <w:rPr>
+          <w:rFonts w:ascii="Times New Roman" w:eastAsia="Times New Roman" w:hAnsi="Times New Roman" w:cs="Times New Roman"/>
+          <w:kern w:val="0"/>
+          <w:lang w:eastAsia="en-GB"/>
+          <w14:ligatures w14:val="none"/>
+        </w:rPr>
+        <w:t xml:space="preserve"> prototype </w:t>
+      </w:r>
+      <w:r>
+        <w:rPr>
+          <w:rFonts w:ascii="Times New Roman" w:eastAsia="Times New Roman" w:hAnsi="Times New Roman" w:cs="Times New Roman"/>
+          <w:kern w:val="0"/>
+          <w:lang w:eastAsia="en-GB"/>
+          <w14:ligatures w14:val="none"/>
+        </w:rPr>
+        <w:t>section</w:t>
+      </w:r>
+      <w:r>
+        <w:rPr>
+          <w:rFonts w:ascii="Times New Roman" w:eastAsia="Times New Roman" w:hAnsi="Times New Roman" w:cs="Times New Roman"/>
+          <w:kern w:val="0"/>
+          <w:lang w:eastAsia="en-GB"/>
+          <w14:ligatures w14:val="none"/>
+        </w:rPr>
+        <w:t xml:space="preserve"> and find more open data matches to close the brier gap. Find </w:t>
+      </w:r>
+      <w:r>
+        <w:rPr>
+          <w:rFonts w:ascii="Times New Roman" w:eastAsia="Times New Roman" w:hAnsi="Times New Roman" w:cs="Times New Roman"/>
+          <w:kern w:val="0"/>
+          <w:lang w:eastAsia="en-GB"/>
+          <w14:ligatures w14:val="none"/>
+        </w:rPr>
+        <w:br/>
+        <w:t>6.</w:t>
+      </w:r>
+      <w:r>
+        <w:rPr>
+          <w:rFonts w:ascii="Times New Roman" w:eastAsia="Times New Roman" w:hAnsi="Times New Roman" w:cs="Times New Roman"/>
+          <w:kern w:val="0"/>
+          <w:lang w:eastAsia="en-GB"/>
+          <w14:ligatures w14:val="none"/>
+        </w:rPr>
+        <w:t xml:space="preserve"> 1.Rename yes rename on </w:t>
+      </w:r>
+      <w:proofErr w:type="spellStart"/>
+      <w:r>
+        <w:rPr>
+          <w:rFonts w:ascii="Times New Roman" w:eastAsia="Times New Roman" w:hAnsi="Times New Roman" w:cs="Times New Roman"/>
+          <w:kern w:val="0"/>
+          <w:lang w:eastAsia="en-GB"/>
+          <w14:ligatures w14:val="none"/>
+        </w:rPr>
+        <w:t>github</w:t>
+      </w:r>
+      <w:proofErr w:type="spellEnd"/>
+      <w:r>
+        <w:rPr>
+          <w:rFonts w:ascii="Times New Roman" w:eastAsia="Times New Roman" w:hAnsi="Times New Roman" w:cs="Times New Roman"/>
+          <w:kern w:val="0"/>
+          <w:lang w:eastAsia="en-GB"/>
+          <w14:ligatures w14:val="none"/>
+        </w:rPr>
+        <w:t xml:space="preserve"> to vindicator.</w:t>
+      </w:r>
+      <w:r>
+        <w:rPr>
+          <w:rFonts w:ascii="Times New Roman" w:eastAsia="Times New Roman" w:hAnsi="Times New Roman" w:cs="Times New Roman"/>
+          <w:kern w:val="0"/>
+          <w:lang w:eastAsia="en-GB"/>
+          <w14:ligatures w14:val="none"/>
+        </w:rPr>
+        <w:br/>
+      </w:r>
+      <w:r>
+        <w:rPr>
+          <w:rFonts w:ascii="Times New Roman" w:eastAsia="Times New Roman" w:hAnsi="Times New Roman" w:cs="Times New Roman"/>
+          <w:kern w:val="0"/>
+          <w:lang w:eastAsia="en-GB"/>
+          <w14:ligatures w14:val="none"/>
+        </w:rPr>
+        <w:lastRenderedPageBreak/>
+        <w:t xml:space="preserve">7. The manage profile section should be to change things like username, </w:t>
+      </w:r>
+      <w:r>
+        <w:rPr>
+          <w:rFonts w:ascii="Times New Roman" w:eastAsia="Times New Roman" w:hAnsi="Times New Roman" w:cs="Times New Roman"/>
+          <w:kern w:val="0"/>
+          <w:lang w:eastAsia="en-GB"/>
+          <w14:ligatures w14:val="none"/>
+        </w:rPr>
+        <w:t xml:space="preserve">location, favourite team to follow updated predictions, privacy elements for each </w:t>
+      </w:r>
+      <w:proofErr w:type="gramStart"/>
+      <w:r>
+        <w:rPr>
+          <w:rFonts w:ascii="Times New Roman" w:eastAsia="Times New Roman" w:hAnsi="Times New Roman" w:cs="Times New Roman"/>
+          <w:kern w:val="0"/>
+          <w:lang w:eastAsia="en-GB"/>
+          <w14:ligatures w14:val="none"/>
+        </w:rPr>
+        <w:t>users</w:t>
+      </w:r>
+      <w:proofErr w:type="gramEnd"/>
+      <w:r>
+        <w:rPr>
+          <w:rFonts w:ascii="Times New Roman" w:eastAsia="Times New Roman" w:hAnsi="Times New Roman" w:cs="Times New Roman"/>
+          <w:kern w:val="0"/>
+          <w:lang w:eastAsia="en-GB"/>
+          <w14:ligatures w14:val="none"/>
+        </w:rPr>
+        <w:t xml:space="preserve"> such as hide email and change password. </w:t>
+      </w:r>
+      <w:r>
+        <w:rPr>
+          <w:rFonts w:ascii="Times New Roman" w:eastAsia="Times New Roman" w:hAnsi="Times New Roman" w:cs="Times New Roman"/>
+          <w:kern w:val="0"/>
+          <w:lang w:eastAsia="en-GB"/>
+          <w14:ligatures w14:val="none"/>
+        </w:rPr>
+        <w:t>Think more like a user account to manage their subscription and profile customization.</w:t>
+      </w:r>
+      <w:r>
+        <w:rPr>
+          <w:rFonts w:ascii="Times New Roman" w:eastAsia="Times New Roman" w:hAnsi="Times New Roman" w:cs="Times New Roman"/>
+          <w:kern w:val="0"/>
+          <w:lang w:eastAsia="en-GB"/>
+          <w14:ligatures w14:val="none"/>
+        </w:rPr>
+        <w:br/>
+        <w:t>8. Find cup competitions for English leagues, Spanish leagues and Italian leagues and add them to the lists too.</w:t>
+      </w:r>
+      <w:r>
+        <w:rPr>
+          <w:rFonts w:ascii="Times New Roman" w:eastAsia="Times New Roman" w:hAnsi="Times New Roman" w:cs="Times New Roman"/>
+          <w:kern w:val="0"/>
+          <w:lang w:eastAsia="en-GB"/>
+          <w14:ligatures w14:val="none"/>
+        </w:rPr>
+        <w:br/>
+      </w:r>
+      <w:r>
+        <w:rPr>
+          <w:rFonts w:ascii="Times New Roman" w:eastAsia="Times New Roman" w:hAnsi="Times New Roman" w:cs="Times New Roman"/>
+          <w:kern w:val="0"/>
+          <w:lang w:eastAsia="en-GB"/>
+          <w14:ligatures w14:val="none"/>
+        </w:rPr>
+        <w:t xml:space="preserve">9. If </w:t>
+      </w:r>
+      <w:proofErr w:type="gramStart"/>
+      <w:r>
+        <w:rPr>
+          <w:rFonts w:ascii="Times New Roman" w:eastAsia="Times New Roman" w:hAnsi="Times New Roman" w:cs="Times New Roman"/>
+          <w:kern w:val="0"/>
+          <w:lang w:eastAsia="en-GB"/>
+          <w14:ligatures w14:val="none"/>
+        </w:rPr>
+        <w:t>Closing</w:t>
+      </w:r>
+      <w:proofErr w:type="gramEnd"/>
+      <w:r>
+        <w:rPr>
+          <w:rFonts w:ascii="Times New Roman" w:eastAsia="Times New Roman" w:hAnsi="Times New Roman" w:cs="Times New Roman"/>
+          <w:kern w:val="0"/>
+          <w:lang w:eastAsia="en-GB"/>
+          <w14:ligatures w14:val="none"/>
+        </w:rPr>
+        <w:t xml:space="preserve"> the league gap now depends mostly on the live injury/</w:t>
+      </w:r>
+      <w:proofErr w:type="spellStart"/>
+      <w:r>
+        <w:rPr>
+          <w:rFonts w:ascii="Times New Roman" w:eastAsia="Times New Roman" w:hAnsi="Times New Roman" w:cs="Times New Roman"/>
+          <w:kern w:val="0"/>
+          <w:lang w:eastAsia="en-GB"/>
+          <w14:ligatures w14:val="none"/>
+        </w:rPr>
+        <w:t>lineup</w:t>
+      </w:r>
+      <w:proofErr w:type="spellEnd"/>
+      <w:r>
+        <w:rPr>
+          <w:rFonts w:ascii="Times New Roman" w:eastAsia="Times New Roman" w:hAnsi="Times New Roman" w:cs="Times New Roman"/>
+          <w:kern w:val="0"/>
+          <w:lang w:eastAsia="en-GB"/>
+          <w14:ligatures w14:val="none"/>
+        </w:rPr>
+        <w:t xml:space="preserve"> signals feeding real predictions</w:t>
+      </w:r>
+      <w:r>
+        <w:rPr>
+          <w:rFonts w:ascii="Times New Roman" w:eastAsia="Times New Roman" w:hAnsi="Times New Roman" w:cs="Times New Roman"/>
+          <w:kern w:val="0"/>
+          <w:lang w:eastAsia="en-GB"/>
+          <w14:ligatures w14:val="none"/>
+        </w:rPr>
+        <w:t>, then find the best open source data you can find to do that.</w:t>
+      </w:r>
+      <w:r>
+        <w:rPr>
+          <w:rFonts w:ascii="Times New Roman" w:eastAsia="Times New Roman" w:hAnsi="Times New Roman" w:cs="Times New Roman"/>
+          <w:kern w:val="0"/>
+          <w:lang w:eastAsia="en-GB"/>
+          <w14:ligatures w14:val="none"/>
+        </w:rPr>
+        <w:t xml:space="preserve"> Now continue the next steps</w:t>
+      </w:r>
+      <w:r>
+        <w:rPr>
+          <w:rFonts w:ascii="Times New Roman" w:eastAsia="Times New Roman" w:hAnsi="Times New Roman" w:cs="Times New Roman"/>
+          <w:kern w:val="0"/>
+          <w:lang w:eastAsia="en-GB"/>
+          <w14:ligatures w14:val="none"/>
+        </w:rPr>
+        <w:t>.</w:t>
+      </w:r>
+      <w:r>
+        <w:rPr>
+          <w:rFonts w:ascii="Times New Roman" w:eastAsia="Times New Roman" w:hAnsi="Times New Roman" w:cs="Times New Roman"/>
+          <w:kern w:val="0"/>
+          <w:lang w:eastAsia="en-GB"/>
+          <w14:ligatures w14:val="none"/>
+        </w:rPr>
+        <w:br/>
+      </w:r>
+      <w:r>
+        <w:rPr>
+          <w:rFonts w:ascii="Times New Roman" w:eastAsia="Times New Roman" w:hAnsi="Times New Roman" w:cs="Times New Roman"/>
+          <w:kern w:val="0"/>
+          <w:lang w:eastAsia="en-GB"/>
+          <w14:ligatures w14:val="none"/>
+        </w:rPr>
+        <w:br/>
       </w:r>
     </w:p>
     <w:sectPr>

</xml_diff>

<commit_message>
Model live: upcoming-fixture predictions, REST push, settlement + points flow, daily cron, multi-fixture dashboards
</commit_message>
<xml_diff>
--- a/Notes/Vindicator Business Notes Plan.docx
+++ b/Notes/Vindicator Business Notes Plan.docx
@@ -7072,14 +7072,6 @@
         <w:spacing w:before="100" w:beforeAutospacing="1" w:after="100" w:afterAutospacing="1"/>
         <w:rPr>
           <w:rFonts w:ascii="Times New Roman" w:eastAsia="Times New Roman" w:hAnsi="Times New Roman" w:cs="Times New Roman"/>
-          <w:kern w:val="0"/>
-          <w:lang w:eastAsia="en-GB"/>
-          <w14:ligatures w14:val="none"/>
-        </w:rPr>
-      </w:pPr>
-      <w:r>
-        <w:rPr>
-          <w:rFonts w:ascii="Times New Roman" w:eastAsia="Times New Roman" w:hAnsi="Times New Roman" w:cs="Times New Roman"/>
           <w:b/>
           <w:bCs/>
           <w:kern w:val="0"/>
@@ -7088,6 +7080,18 @@
           <w:lang w:eastAsia="en-GB"/>
           <w14:ligatures w14:val="none"/>
         </w:rPr>
+      </w:pPr>
+      <w:r>
+        <w:rPr>
+          <w:rFonts w:ascii="Times New Roman" w:eastAsia="Times New Roman" w:hAnsi="Times New Roman" w:cs="Times New Roman"/>
+          <w:b/>
+          <w:bCs/>
+          <w:kern w:val="0"/>
+          <w:sz w:val="48"/>
+          <w:szCs w:val="48"/>
+          <w:lang w:eastAsia="en-GB"/>
+          <w14:ligatures w14:val="none"/>
+        </w:rPr>
         <w:t>7.</w:t>
       </w:r>
       <w:r>
@@ -7477,6 +7481,30 @@
         </w:rPr>
         <w:br/>
       </w:r>
+    </w:p>
+    <w:p>
+      <w:pPr>
+        <w:spacing w:before="100" w:beforeAutospacing="1" w:after="100" w:afterAutospacing="1"/>
+        <w:rPr>
+          <w:rFonts w:ascii="Times New Roman" w:eastAsia="Times New Roman" w:hAnsi="Times New Roman" w:cs="Times New Roman"/>
+          <w:kern w:val="0"/>
+          <w:lang w:eastAsia="en-GB"/>
+          <w14:ligatures w14:val="none"/>
+        </w:rPr>
+      </w:pPr>
+      <w:r>
+        <w:rPr>
+          <w:rFonts w:ascii="Times New Roman" w:eastAsia="Times New Roman" w:hAnsi="Times New Roman" w:cs="Times New Roman"/>
+          <w:b/>
+          <w:bCs/>
+          <w:kern w:val="0"/>
+          <w:sz w:val="48"/>
+          <w:szCs w:val="48"/>
+          <w:lang w:eastAsia="en-GB"/>
+          <w14:ligatures w14:val="none"/>
+        </w:rPr>
+        <w:t>8.</w:t>
+      </w:r>
       <w:r>
         <w:rPr>
           <w:rFonts w:ascii="Times New Roman" w:eastAsia="Times New Roman" w:hAnsi="Times New Roman" w:cs="Times New Roman"/>
@@ -7485,7 +7513,159 @@
           <w14:ligatures w14:val="none"/>
         </w:rPr>
         <w:br/>
-      </w:r>
+        <w:t xml:space="preserve">1. </w:t>
+      </w:r>
+      <w:r>
+        <w:rPr>
+          <w:rFonts w:ascii="Times New Roman" w:eastAsia="Times New Roman" w:hAnsi="Times New Roman" w:cs="Times New Roman"/>
+          <w:kern w:val="0"/>
+          <w:lang w:eastAsia="en-GB"/>
+          <w14:ligatures w14:val="none"/>
+        </w:rPr>
+        <w:t>Everything's deployed to staging.vendicator.co.uk and pushed to git. Natural next steps when you're ready: schedule the daily pipeline + injury logger (</w:t>
+      </w:r>
+      <w:proofErr w:type="spellStart"/>
+      <w:r>
+        <w:rPr>
+          <w:rFonts w:ascii="Times New Roman" w:eastAsia="Times New Roman" w:hAnsi="Times New Roman" w:cs="Times New Roman"/>
+          <w:kern w:val="0"/>
+          <w:lang w:eastAsia="en-GB"/>
+          <w14:ligatures w14:val="none"/>
+        </w:rPr>
+        <w:t>cron</w:t>
+      </w:r>
+      <w:proofErr w:type="spellEnd"/>
+      <w:r>
+        <w:rPr>
+          <w:rFonts w:ascii="Times New Roman" w:eastAsia="Times New Roman" w:hAnsi="Times New Roman" w:cs="Times New Roman"/>
+          <w:kern w:val="0"/>
+          <w:lang w:eastAsia="en-GB"/>
+          <w14:ligatures w14:val="none"/>
+        </w:rPr>
+        <w:t xml:space="preserve">), settle real predictions as this weekend's fixtures finish so points start flowing, </w:t>
+      </w:r>
+      <w:r>
+        <w:rPr>
+          <w:rFonts w:ascii="Times New Roman" w:eastAsia="Times New Roman" w:hAnsi="Times New Roman" w:cs="Times New Roman"/>
+          <w:kern w:val="0"/>
+          <w:lang w:eastAsia="en-GB"/>
+          <w14:ligatures w14:val="none"/>
+        </w:rPr>
+        <w:t xml:space="preserve">and I </w:t>
+      </w:r>
+      <w:r>
+        <w:rPr>
+          <w:rFonts w:ascii="Times New Roman" w:eastAsia="Times New Roman" w:hAnsi="Times New Roman" w:cs="Times New Roman"/>
+          <w:kern w:val="0"/>
+          <w:lang w:eastAsia="en-GB"/>
+          <w14:ligatures w14:val="none"/>
+        </w:rPr>
+        <w:t>say the word on API-Football Pro to light up current-season injuries.</w:t>
+      </w:r>
+      <w:r>
+        <w:rPr>
+          <w:rFonts w:ascii="Times New Roman" w:eastAsia="Times New Roman" w:hAnsi="Times New Roman" w:cs="Times New Roman"/>
+          <w:kern w:val="0"/>
+          <w:lang w:eastAsia="en-GB"/>
+          <w14:ligatures w14:val="none"/>
+        </w:rPr>
+        <w:t xml:space="preserve"> </w:t>
+      </w:r>
+      <w:proofErr w:type="gramStart"/>
+      <w:r>
+        <w:rPr>
+          <w:rFonts w:ascii="Times New Roman" w:eastAsia="Times New Roman" w:hAnsi="Times New Roman" w:cs="Times New Roman"/>
+          <w:kern w:val="0"/>
+          <w:lang w:eastAsia="en-GB"/>
+          <w14:ligatures w14:val="none"/>
+        </w:rPr>
+        <w:t>However</w:t>
+      </w:r>
+      <w:proofErr w:type="gramEnd"/>
+      <w:r>
+        <w:rPr>
+          <w:rFonts w:ascii="Times New Roman" w:eastAsia="Times New Roman" w:hAnsi="Times New Roman" w:cs="Times New Roman"/>
+          <w:kern w:val="0"/>
+          <w:lang w:eastAsia="en-GB"/>
+          <w14:ligatures w14:val="none"/>
+        </w:rPr>
+        <w:t xml:space="preserve"> I want all data retrieve to be free and/ open sourced or just generally available to retrieve. You can now continue to get the model up and running</w:t>
+      </w:r>
+      <w:r>
+        <w:rPr>
+          <w:rFonts w:ascii="Times New Roman" w:eastAsia="Times New Roman" w:hAnsi="Times New Roman" w:cs="Times New Roman"/>
+          <w:kern w:val="0"/>
+          <w:lang w:eastAsia="en-GB"/>
+          <w14:ligatures w14:val="none"/>
+        </w:rPr>
+        <w:br/>
+      </w:r>
+    </w:p>
+    <w:p>
+      <w:pPr>
+        <w:pStyle w:val="NormalWeb"/>
+      </w:pPr>
+      <w:r>
+        <w:rPr>
+          <w:b/>
+          <w:bCs/>
+          <w:sz w:val="48"/>
+          <w:szCs w:val="48"/>
+        </w:rPr>
+        <w:t>9.</w:t>
+      </w:r>
+      <w:r>
+        <w:br/>
+        <w:t xml:space="preserve">1. </w:t>
+      </w:r>
+      <w:r>
+        <w:t xml:space="preserve">if data </w:t>
+      </w:r>
+      <w:proofErr w:type="spellStart"/>
+      <w:proofErr w:type="gramStart"/>
+      <w:r>
+        <w:t>cant</w:t>
+      </w:r>
+      <w:proofErr w:type="spellEnd"/>
+      <w:proofErr w:type="gramEnd"/>
+      <w:r>
+        <w:t xml:space="preserve"> be pulled freely from </w:t>
+      </w:r>
+      <w:proofErr w:type="spellStart"/>
+      <w:r>
+        <w:t>opta</w:t>
+      </w:r>
+      <w:proofErr w:type="spellEnd"/>
+      <w:r>
+        <w:t xml:space="preserve"> and </w:t>
+      </w:r>
+      <w:proofErr w:type="spellStart"/>
+      <w:r>
+        <w:t>api</w:t>
+      </w:r>
+      <w:proofErr w:type="spellEnd"/>
+      <w:r>
+        <w:t xml:space="preserve">-football then make sure </w:t>
+      </w:r>
+      <w:proofErr w:type="spellStart"/>
+      <w:r>
+        <w:t>theres</w:t>
+      </w:r>
+      <w:proofErr w:type="spellEnd"/>
+      <w:r>
+        <w:t xml:space="preserve"> and option in the upgrading for the admin to add these in the future when ready.</w:t>
+      </w:r>
+    </w:p>
+    <w:p>
+      <w:pPr>
+        <w:spacing w:before="100" w:beforeAutospacing="1" w:after="100" w:afterAutospacing="1"/>
+        <w:rPr>
+          <w:rFonts w:ascii="Times New Roman" w:eastAsia="Times New Roman" w:hAnsi="Times New Roman" w:cs="Times New Roman"/>
+          <w:kern w:val="0"/>
+          <w:lang w:eastAsia="en-GB"/>
+          <w14:ligatures w14:val="none"/>
+        </w:rPr>
+      </w:pPr>
     </w:p>
     <w:sectPr>
       <w:pgSz w:w="11906" w:h="16838"/>

</xml_diff>

<commit_message>
Dashboard v2: xTotal goals, best-team-to-score, 3-book odds board, live clock + fixture ticker with hover analysis, team pages with league tables, badge tooltips, pick removal + win/loss toasts
</commit_message>
<xml_diff>
--- a/Notes/Vindicator Business Notes Plan.docx
+++ b/Notes/Vindicator Business Notes Plan.docx
@@ -7658,14 +7658,215 @@
     </w:p>
     <w:p>
       <w:pPr>
-        <w:spacing w:before="100" w:beforeAutospacing="1" w:after="100" w:afterAutospacing="1"/>
-        <w:rPr>
-          <w:rFonts w:ascii="Times New Roman" w:eastAsia="Times New Roman" w:hAnsi="Times New Roman" w:cs="Times New Roman"/>
-          <w:kern w:val="0"/>
-          <w:lang w:eastAsia="en-GB"/>
-          <w14:ligatures w14:val="none"/>
-        </w:rPr>
-      </w:pPr>
+        <w:pStyle w:val="NormalWeb"/>
+        <w:rPr>
+          <w:b/>
+          <w:bCs/>
+          <w:sz w:val="48"/>
+          <w:szCs w:val="48"/>
+        </w:rPr>
+      </w:pPr>
+      <w:r>
+        <w:rPr>
+          <w:b/>
+          <w:bCs/>
+          <w:sz w:val="48"/>
+          <w:szCs w:val="48"/>
+        </w:rPr>
+        <w:t>10.</w:t>
+      </w:r>
+    </w:p>
+    <w:p>
+      <w:pPr>
+        <w:pStyle w:val="NormalWeb"/>
+      </w:pPr>
+      <w:r>
+        <w:t xml:space="preserve">1. in the predictions section change double chance section to </w:t>
+      </w:r>
+      <w:proofErr w:type="spellStart"/>
+      <w:r>
+        <w:t>xtotal</w:t>
+      </w:r>
+      <w:proofErr w:type="spellEnd"/>
+      <w:r>
+        <w:t xml:space="preserve"> alternative goals </w:t>
+      </w:r>
+      <w:proofErr w:type="spellStart"/>
+      <w:r>
+        <w:t>i.e</w:t>
+      </w:r>
+      <w:proofErr w:type="spellEnd"/>
+      <w:r>
+        <w:t xml:space="preserve"> 0, 1.5, 2.5 etc</w:t>
+      </w:r>
+      <w:r>
+        <w:br/>
+      </w:r>
+      <w:r>
+        <w:t>2. Change the BTTS section to show home or away team as best team to score with odds and percentages</w:t>
+      </w:r>
+      <w:r>
+        <w:br/>
+        <w:t xml:space="preserve">3. Make another section in the prediction section for best odds and give 3 different odds based on free </w:t>
+      </w:r>
+      <w:proofErr w:type="gramStart"/>
+      <w:r>
+        <w:t>open source</w:t>
+      </w:r>
+      <w:proofErr w:type="gramEnd"/>
+      <w:r>
+        <w:t xml:space="preserve"> data of continuous betting data.</w:t>
+      </w:r>
+      <w:r>
+        <w:br/>
+        <w:t xml:space="preserve">4. Add time stamps and a modern digital clock with a second’s timer. Also show underneath the clock, icon-images of updates stating when </w:t>
+      </w:r>
+      <w:proofErr w:type="gramStart"/>
+      <w:r>
+        <w:t>a ,match</w:t>
+      </w:r>
+      <w:proofErr w:type="gramEnd"/>
+      <w:r>
+        <w:t xml:space="preserve"> is about to start and show the name of the match with the best 5 odds to appear in a timed running box displaying each game in the format of (MUN Vs CTY), then allow users to click on that odd and see the predictions in a hover over menu describing in detail why and who could win and certain stats. </w:t>
+      </w:r>
+      <w:r>
+        <w:br/>
+        <w:t>5. Make the selection boxes more modern and match the global theme colours.</w:t>
+      </w:r>
+      <w:r>
+        <w:br/>
+        <w:t xml:space="preserve">6. Show more predictions on the predictions section with icon badges next to team names with the ability to hover over the badges and see more team information. Which you can click into to get a table of team information, a section to see the league table which is updated continuously and a section for players stats showing as much </w:t>
+      </w:r>
+      <w:proofErr w:type="gramStart"/>
+      <w:r>
+        <w:t>in depth</w:t>
+      </w:r>
+      <w:proofErr w:type="gramEnd"/>
+      <w:r>
+        <w:t xml:space="preserve"> rich information about players and teams to generate team prediction descriptions in box fields under team images.</w:t>
+      </w:r>
+      <w:r>
+        <w:br/>
+        <w:t xml:space="preserve">7. Once a selection has been made, remove that current selection from the </w:t>
+      </w:r>
+      <w:proofErr w:type="spellStart"/>
+      <w:r>
+        <w:t>selctions</w:t>
+      </w:r>
+      <w:proofErr w:type="spellEnd"/>
+      <w:r>
+        <w:t xml:space="preserve"> page and log it.</w:t>
+      </w:r>
+      <w:r>
+        <w:br/>
+      </w:r>
+      <w:r>
+        <w:lastRenderedPageBreak/>
+        <w:t xml:space="preserve">8. Using the global timestamp system, show a </w:t>
+      </w:r>
+      <w:proofErr w:type="gramStart"/>
+      <w:r>
+        <w:t>pop up</w:t>
+      </w:r>
+      <w:proofErr w:type="gramEnd"/>
+      <w:r>
+        <w:t xml:space="preserve"> message in the corner and leave it displayed until closed showing if you won or lost a bet. </w:t>
+      </w:r>
+    </w:p>
+    <w:p>
+      <w:pPr>
+        <w:spacing w:before="100" w:beforeAutospacing="1" w:after="100" w:afterAutospacing="1"/>
+        <w:rPr>
+          <w:rFonts w:ascii="Times New Roman" w:eastAsia="Times New Roman" w:hAnsi="Times New Roman" w:cs="Times New Roman"/>
+          <w:kern w:val="0"/>
+          <w:lang w:eastAsia="en-GB"/>
+          <w14:ligatures w14:val="none"/>
+        </w:rPr>
+      </w:pPr>
+      <w:r>
+        <w:rPr>
+          <w:rFonts w:ascii="Times New Roman" w:eastAsia="Times New Roman" w:hAnsi="Times New Roman" w:cs="Times New Roman"/>
+          <w:b/>
+          <w:bCs/>
+          <w:kern w:val="0"/>
+          <w:sz w:val="48"/>
+          <w:szCs w:val="48"/>
+          <w:lang w:eastAsia="en-GB"/>
+          <w14:ligatures w14:val="none"/>
+        </w:rPr>
+        <w:t>11.</w:t>
+      </w:r>
+      <w:r>
+        <w:rPr>
+          <w:rFonts w:ascii="Times New Roman" w:eastAsia="Times New Roman" w:hAnsi="Times New Roman" w:cs="Times New Roman"/>
+          <w:kern w:val="0"/>
+          <w:lang w:eastAsia="en-GB"/>
+          <w14:ligatures w14:val="none"/>
+        </w:rPr>
+        <w:br/>
+        <w:t xml:space="preserve">1. Make sure users </w:t>
+      </w:r>
+      <w:proofErr w:type="gramStart"/>
+      <w:r>
+        <w:rPr>
+          <w:rFonts w:ascii="Times New Roman" w:eastAsia="Times New Roman" w:hAnsi="Times New Roman" w:cs="Times New Roman"/>
+          <w:kern w:val="0"/>
+          <w:lang w:eastAsia="en-GB"/>
+          <w14:ligatures w14:val="none"/>
+        </w:rPr>
+        <w:t>ca</w:t>
+      </w:r>
+      <w:proofErr w:type="spellStart"/>
+      <w:r>
+        <w:rPr>
+          <w:rFonts w:ascii="Times New Roman" w:eastAsia="Times New Roman" w:hAnsi="Times New Roman" w:cs="Times New Roman"/>
+          <w:kern w:val="0"/>
+          <w:lang w:eastAsia="en-GB"/>
+          <w14:ligatures w14:val="none"/>
+        </w:rPr>
+        <w:t>nt</w:t>
+      </w:r>
+      <w:proofErr w:type="spellEnd"/>
+      <w:proofErr w:type="gramEnd"/>
+      <w:r>
+        <w:rPr>
+          <w:rFonts w:ascii="Times New Roman" w:eastAsia="Times New Roman" w:hAnsi="Times New Roman" w:cs="Times New Roman"/>
+          <w:kern w:val="0"/>
+          <w:lang w:eastAsia="en-GB"/>
+          <w14:ligatures w14:val="none"/>
+        </w:rPr>
+        <w:t xml:space="preserve"> make the same bet selection more than once. And </w:t>
+      </w:r>
+      <w:proofErr w:type="spellStart"/>
+      <w:r>
+        <w:rPr>
+          <w:rFonts w:ascii="Times New Roman" w:eastAsia="Times New Roman" w:hAnsi="Times New Roman" w:cs="Times New Roman"/>
+          <w:kern w:val="0"/>
+          <w:lang w:eastAsia="en-GB"/>
+          <w14:ligatures w14:val="none"/>
+        </w:rPr>
+        <w:t>removie</w:t>
+      </w:r>
+      <w:proofErr w:type="spellEnd"/>
+      <w:r>
+        <w:rPr>
+          <w:rFonts w:ascii="Times New Roman" w:eastAsia="Times New Roman" w:hAnsi="Times New Roman" w:cs="Times New Roman"/>
+          <w:kern w:val="0"/>
+          <w:lang w:eastAsia="en-GB"/>
+          <w14:ligatures w14:val="none"/>
+        </w:rPr>
+        <w:t xml:space="preserve"> any double entries if any made.</w:t>
+      </w:r>
+      <w:r>
+        <w:rPr>
+          <w:rFonts w:ascii="Times New Roman" w:eastAsia="Times New Roman" w:hAnsi="Times New Roman" w:cs="Times New Roman"/>
+          <w:kern w:val="0"/>
+          <w:lang w:eastAsia="en-GB"/>
+          <w14:ligatures w14:val="none"/>
+        </w:rPr>
+        <w:br/>
+        <w:t>2.</w:t>
+      </w:r>
     </w:p>
     <w:sectPr>
       <w:pgSz w:w="11906" w:h="16838"/>

</xml_diff>

<commit_message>
Player markets with last-5 dot tallies and value-based points, discipline markets, canonical team registry, league tables + player profiles, per-competition market config, dashboard filtering/paging and hover layering fixes
</commit_message>
<xml_diff>
--- a/Notes/Vindicator Business Notes Plan.docx
+++ b/Notes/Vindicator Business Notes Plan.docx
@@ -7837,17 +7837,15 @@
         </w:rPr>
         <w:t xml:space="preserve"> make the same bet selection more than once. And </w:t>
       </w:r>
-      <w:proofErr w:type="spellStart"/>
-      <w:r>
-        <w:rPr>
-          <w:rFonts w:ascii="Times New Roman" w:eastAsia="Times New Roman" w:hAnsi="Times New Roman" w:cs="Times New Roman"/>
-          <w:kern w:val="0"/>
-          <w:lang w:eastAsia="en-GB"/>
-          <w14:ligatures w14:val="none"/>
-        </w:rPr>
-        <w:t>removie</w:t>
-      </w:r>
-      <w:proofErr w:type="spellEnd"/>
+      <w:r>
+        <w:rPr>
+          <w:rFonts w:ascii="Times New Roman" w:eastAsia="Times New Roman" w:hAnsi="Times New Roman" w:cs="Times New Roman"/>
+          <w:kern w:val="0"/>
+          <w:lang w:eastAsia="en-GB"/>
+          <w14:ligatures w14:val="none"/>
+        </w:rPr>
+        <w:t>remove</w:t>
+      </w:r>
       <w:r>
         <w:rPr>
           <w:rFonts w:ascii="Times New Roman" w:eastAsia="Times New Roman" w:hAnsi="Times New Roman" w:cs="Times New Roman"/>
@@ -7865,7 +7863,566 @@
           <w14:ligatures w14:val="none"/>
         </w:rPr>
         <w:br/>
+      </w:r>
+      <w:proofErr w:type="gramStart"/>
+      <w:r>
+        <w:rPr>
+          <w:rFonts w:ascii="Times New Roman" w:eastAsia="Times New Roman" w:hAnsi="Times New Roman" w:cs="Times New Roman"/>
+          <w:kern w:val="0"/>
+          <w:lang w:eastAsia="en-GB"/>
+          <w14:ligatures w14:val="none"/>
+        </w:rPr>
         <w:t>2.</w:t>
+      </w:r>
+      <w:r>
+        <w:rPr>
+          <w:rFonts w:ascii="Times New Roman" w:eastAsia="Times New Roman" w:hAnsi="Times New Roman" w:cs="Times New Roman"/>
+          <w:kern w:val="0"/>
+          <w:lang w:eastAsia="en-GB"/>
+          <w14:ligatures w14:val="none"/>
+        </w:rPr>
+        <w:t>change</w:t>
+      </w:r>
+      <w:proofErr w:type="gramEnd"/>
+      <w:r>
+        <w:rPr>
+          <w:rFonts w:ascii="Times New Roman" w:eastAsia="Times New Roman" w:hAnsi="Times New Roman" w:cs="Times New Roman"/>
+          <w:kern w:val="0"/>
+          <w:lang w:eastAsia="en-GB"/>
+          <w14:ligatures w14:val="none"/>
+        </w:rPr>
+        <w:t xml:space="preserve"> the name of </w:t>
+      </w:r>
+      <w:proofErr w:type="spellStart"/>
+      <w:r>
+        <w:rPr>
+          <w:rFonts w:ascii="Times New Roman" w:eastAsia="Times New Roman" w:hAnsi="Times New Roman" w:cs="Times New Roman"/>
+          <w:kern w:val="0"/>
+          <w:lang w:eastAsia="en-GB"/>
+          <w14:ligatures w14:val="none"/>
+        </w:rPr>
+        <w:t>xtotal</w:t>
+      </w:r>
+      <w:proofErr w:type="spellEnd"/>
+      <w:r>
+        <w:rPr>
+          <w:rFonts w:ascii="Times New Roman" w:eastAsia="Times New Roman" w:hAnsi="Times New Roman" w:cs="Times New Roman"/>
+          <w:kern w:val="0"/>
+          <w:lang w:eastAsia="en-GB"/>
+          <w14:ligatures w14:val="none"/>
+        </w:rPr>
+        <w:t xml:space="preserve"> </w:t>
+      </w:r>
+      <w:r>
+        <w:rPr>
+          <w:rFonts w:ascii="Times New Roman" w:eastAsia="Times New Roman" w:hAnsi="Times New Roman" w:cs="Times New Roman"/>
+          <w:kern w:val="0"/>
+          <w:lang w:eastAsia="en-GB"/>
+          <w14:ligatures w14:val="none"/>
+        </w:rPr>
+        <w:t>alternative goals</w:t>
+      </w:r>
+      <w:r>
+        <w:rPr>
+          <w:rFonts w:ascii="Times New Roman" w:eastAsia="Times New Roman" w:hAnsi="Times New Roman" w:cs="Times New Roman"/>
+          <w:kern w:val="0"/>
+          <w:lang w:eastAsia="en-GB"/>
+          <w14:ligatures w14:val="none"/>
+        </w:rPr>
+        <w:t xml:space="preserve"> section</w:t>
+      </w:r>
+      <w:r>
+        <w:rPr>
+          <w:rFonts w:ascii="Times New Roman" w:eastAsia="Times New Roman" w:hAnsi="Times New Roman" w:cs="Times New Roman"/>
+          <w:kern w:val="0"/>
+          <w:lang w:eastAsia="en-GB"/>
+          <w14:ligatures w14:val="none"/>
+        </w:rPr>
+        <w:t xml:space="preserve"> to </w:t>
+      </w:r>
+      <w:r>
+        <w:rPr>
+          <w:rFonts w:ascii="Times New Roman" w:eastAsia="Times New Roman" w:hAnsi="Times New Roman" w:cs="Times New Roman"/>
+          <w:kern w:val="0"/>
+          <w:lang w:eastAsia="en-GB"/>
+          <w14:ligatures w14:val="none"/>
+        </w:rPr>
+        <w:t>alternative total goals.</w:t>
+      </w:r>
+      <w:r>
+        <w:rPr>
+          <w:rFonts w:ascii="Times New Roman" w:eastAsia="Times New Roman" w:hAnsi="Times New Roman" w:cs="Times New Roman"/>
+          <w:kern w:val="0"/>
+          <w:lang w:eastAsia="en-GB"/>
+          <w14:ligatures w14:val="none"/>
+        </w:rPr>
+        <w:br/>
+        <w:t>3. Change best team to score to both teams to score (BTTS).</w:t>
+      </w:r>
+      <w:r>
+        <w:rPr>
+          <w:rFonts w:ascii="Times New Roman" w:eastAsia="Times New Roman" w:hAnsi="Times New Roman" w:cs="Times New Roman"/>
+          <w:kern w:val="0"/>
+          <w:lang w:eastAsia="en-GB"/>
+          <w14:ligatures w14:val="none"/>
+        </w:rPr>
+        <w:br/>
+        <w:t>4. Don’t show the over/under section instead replace it with a table/tally of players with a selection of which player will: score; assist; score or assist. (show a</w:t>
+      </w:r>
+      <w:r>
+        <w:rPr>
+          <w:rFonts w:ascii="Times New Roman" w:eastAsia="Times New Roman" w:hAnsi="Times New Roman" w:cs="Times New Roman"/>
+          <w:kern w:val="0"/>
+          <w:lang w:eastAsia="en-GB"/>
+          <w14:ligatures w14:val="none"/>
+        </w:rPr>
+        <w:t xml:space="preserve"> small</w:t>
+      </w:r>
+      <w:r>
+        <w:rPr>
+          <w:rFonts w:ascii="Times New Roman" w:eastAsia="Times New Roman" w:hAnsi="Times New Roman" w:cs="Times New Roman"/>
+          <w:kern w:val="0"/>
+          <w:lang w:eastAsia="en-GB"/>
+          <w14:ligatures w14:val="none"/>
+        </w:rPr>
+        <w:t xml:space="preserve"> tally of 5 under each row for each player of their last 5 games to see if they scored or assisted in those games</w:t>
+      </w:r>
+      <w:r>
+        <w:rPr>
+          <w:rFonts w:ascii="Times New Roman" w:eastAsia="Times New Roman" w:hAnsi="Times New Roman" w:cs="Times New Roman"/>
+          <w:kern w:val="0"/>
+          <w:lang w:eastAsia="en-GB"/>
+          <w14:ligatures w14:val="none"/>
+        </w:rPr>
+        <w:t>, using red colour for no goal or assist and green for goal scored or assisted and greyed out for player not present in that game that week</w:t>
+      </w:r>
+      <w:r>
+        <w:rPr>
+          <w:rFonts w:ascii="Times New Roman" w:eastAsia="Times New Roman" w:hAnsi="Times New Roman" w:cs="Times New Roman"/>
+          <w:kern w:val="0"/>
+          <w:lang w:eastAsia="en-GB"/>
+          <w14:ligatures w14:val="none"/>
+        </w:rPr>
+        <w:t xml:space="preserve">) use a digital neon green dot style tally to show the last 5 games for each </w:t>
+      </w:r>
+      <w:proofErr w:type="gramStart"/>
+      <w:r>
+        <w:rPr>
+          <w:rFonts w:ascii="Times New Roman" w:eastAsia="Times New Roman" w:hAnsi="Times New Roman" w:cs="Times New Roman"/>
+          <w:kern w:val="0"/>
+          <w:lang w:eastAsia="en-GB"/>
+          <w14:ligatures w14:val="none"/>
+        </w:rPr>
+        <w:t>goals</w:t>
+      </w:r>
+      <w:proofErr w:type="gramEnd"/>
+      <w:r>
+        <w:rPr>
+          <w:rFonts w:ascii="Times New Roman" w:eastAsia="Times New Roman" w:hAnsi="Times New Roman" w:cs="Times New Roman"/>
+          <w:kern w:val="0"/>
+          <w:lang w:eastAsia="en-GB"/>
+          <w14:ligatures w14:val="none"/>
+        </w:rPr>
+        <w:t xml:space="preserve"> and assists.</w:t>
+      </w:r>
+      <w:r>
+        <w:rPr>
+          <w:rFonts w:ascii="Times New Roman" w:eastAsia="Times New Roman" w:hAnsi="Times New Roman" w:cs="Times New Roman"/>
+          <w:kern w:val="0"/>
+          <w:lang w:eastAsia="en-GB"/>
+          <w14:ligatures w14:val="none"/>
+        </w:rPr>
+        <w:t xml:space="preserve"> Make each player have a selection based on </w:t>
+      </w:r>
+      <w:proofErr w:type="spellStart"/>
+      <w:r>
+        <w:rPr>
+          <w:rFonts w:ascii="Times New Roman" w:eastAsia="Times New Roman" w:hAnsi="Times New Roman" w:cs="Times New Roman"/>
+          <w:kern w:val="0"/>
+          <w:lang w:eastAsia="en-GB"/>
+          <w14:ligatures w14:val="none"/>
+        </w:rPr>
+        <w:t>wether</w:t>
+      </w:r>
+      <w:proofErr w:type="spellEnd"/>
+      <w:r>
+        <w:rPr>
+          <w:rFonts w:ascii="Times New Roman" w:eastAsia="Times New Roman" w:hAnsi="Times New Roman" w:cs="Times New Roman"/>
+          <w:kern w:val="0"/>
+          <w:lang w:eastAsia="en-GB"/>
+          <w14:ligatures w14:val="none"/>
+        </w:rPr>
+        <w:t xml:space="preserve"> you think they will score or assist in that game and you will earn a certain amount of points based on how valuable that player is (the</w:t>
+      </w:r>
+      <w:r>
+        <w:rPr>
+          <w:rFonts w:ascii="Times New Roman" w:eastAsia="Times New Roman" w:hAnsi="Times New Roman" w:cs="Times New Roman"/>
+          <w:kern w:val="0"/>
+          <w:lang w:eastAsia="en-GB"/>
+          <w14:ligatures w14:val="none"/>
+        </w:rPr>
+        <w:t xml:space="preserve"> value</w:t>
+      </w:r>
+      <w:r>
+        <w:rPr>
+          <w:rFonts w:ascii="Times New Roman" w:eastAsia="Times New Roman" w:hAnsi="Times New Roman" w:cs="Times New Roman"/>
+          <w:kern w:val="0"/>
+          <w:lang w:eastAsia="en-GB"/>
+          <w14:ligatures w14:val="none"/>
+        </w:rPr>
+        <w:t xml:space="preserve"> of a player will be decided based on his market value + a total of goals, assists, passes, tackles, individual match player rating, total value player rating and player positioning using this models engine capabilities)</w:t>
+      </w:r>
+      <w:r>
+        <w:rPr>
+          <w:rFonts w:ascii="Times New Roman" w:eastAsia="Times New Roman" w:hAnsi="Times New Roman" w:cs="Times New Roman"/>
+          <w:kern w:val="0"/>
+          <w:lang w:eastAsia="en-GB"/>
+          <w14:ligatures w14:val="none"/>
+        </w:rPr>
+        <w:br/>
+        <w:t>Also use these same principles for team bet selections, for example</w:t>
+      </w:r>
+      <w:r>
+        <w:rPr>
+          <w:rFonts w:ascii="Times New Roman" w:eastAsia="Times New Roman" w:hAnsi="Times New Roman" w:cs="Times New Roman"/>
+          <w:kern w:val="0"/>
+          <w:lang w:eastAsia="en-GB"/>
+          <w14:ligatures w14:val="none"/>
+        </w:rPr>
+        <w:t>;</w:t>
+      </w:r>
+      <w:r>
+        <w:rPr>
+          <w:rFonts w:ascii="Times New Roman" w:eastAsia="Times New Roman" w:hAnsi="Times New Roman" w:cs="Times New Roman"/>
+          <w:kern w:val="0"/>
+          <w:lang w:eastAsia="en-GB"/>
+          <w14:ligatures w14:val="none"/>
+        </w:rPr>
+        <w:t xml:space="preserve"> if I select man united to win at home then I will earn points based of the teams total</w:t>
+      </w:r>
+      <w:r>
+        <w:rPr>
+          <w:rFonts w:ascii="Times New Roman" w:eastAsia="Times New Roman" w:hAnsi="Times New Roman" w:cs="Times New Roman"/>
+          <w:kern w:val="0"/>
+          <w:lang w:eastAsia="en-GB"/>
+          <w14:ligatures w14:val="none"/>
+        </w:rPr>
+        <w:t xml:space="preserve"> team currency</w:t>
+      </w:r>
+      <w:r>
+        <w:rPr>
+          <w:rFonts w:ascii="Times New Roman" w:eastAsia="Times New Roman" w:hAnsi="Times New Roman" w:cs="Times New Roman"/>
+          <w:kern w:val="0"/>
+          <w:lang w:eastAsia="en-GB"/>
+          <w14:ligatures w14:val="none"/>
+        </w:rPr>
+        <w:t xml:space="preserve"> value, team player rating overall total, amount of wins, amount of losses</w:t>
+      </w:r>
+      <w:r>
+        <w:rPr>
+          <w:rFonts w:ascii="Times New Roman" w:eastAsia="Times New Roman" w:hAnsi="Times New Roman" w:cs="Times New Roman"/>
+          <w:kern w:val="0"/>
+          <w:lang w:eastAsia="en-GB"/>
+          <w14:ligatures w14:val="none"/>
+        </w:rPr>
+        <w:t xml:space="preserve"> and amount of bets won and logged on that team in this models system.</w:t>
+      </w:r>
+      <w:r>
+        <w:rPr>
+          <w:rFonts w:ascii="Times New Roman" w:eastAsia="Times New Roman" w:hAnsi="Times New Roman" w:cs="Times New Roman"/>
+          <w:kern w:val="0"/>
+          <w:lang w:eastAsia="en-GB"/>
+          <w14:ligatures w14:val="none"/>
+        </w:rPr>
+        <w:br/>
+      </w:r>
+      <w:r>
+        <w:rPr>
+          <w:rFonts w:ascii="Times New Roman" w:eastAsia="Times New Roman" w:hAnsi="Times New Roman" w:cs="Times New Roman"/>
+          <w:kern w:val="0"/>
+          <w:lang w:eastAsia="en-GB"/>
+          <w14:ligatures w14:val="none"/>
+        </w:rPr>
+        <w:t xml:space="preserve">5. Make another section in the predictions section for how many: </w:t>
+      </w:r>
+      <w:r>
+        <w:rPr>
+          <w:rFonts w:ascii="Times New Roman" w:eastAsia="Times New Roman" w:hAnsi="Times New Roman" w:cs="Times New Roman"/>
+          <w:kern w:val="0"/>
+          <w:lang w:eastAsia="en-GB"/>
+          <w14:ligatures w14:val="none"/>
+        </w:rPr>
+        <w:t>cards, fouls and corners</w:t>
+      </w:r>
+      <w:r>
+        <w:rPr>
+          <w:rFonts w:ascii="Times New Roman" w:eastAsia="Times New Roman" w:hAnsi="Times New Roman" w:cs="Times New Roman"/>
+          <w:kern w:val="0"/>
+          <w:lang w:eastAsia="en-GB"/>
+          <w14:ligatures w14:val="none"/>
+        </w:rPr>
+        <w:t xml:space="preserve"> in the tally/table of 1+, 2+, 3+ and use the algorithm/analysis </w:t>
+      </w:r>
+      <w:r>
+        <w:rPr>
+          <w:rFonts w:ascii="Times New Roman" w:eastAsia="Times New Roman" w:hAnsi="Times New Roman" w:cs="Times New Roman"/>
+          <w:kern w:val="0"/>
+          <w:lang w:eastAsia="en-GB"/>
+          <w14:ligatures w14:val="none"/>
+        </w:rPr>
+        <w:t>of sports data collected to decided how many each category should tally out of, for example: Yellow cards on average may only happen 1-5 times per game especially with the form said current team, therefore only use a selection choice that relates to that information and do the same globally for each statistic category, base the probability of your selections happening based off past evens in collected sports data.</w:t>
+      </w:r>
+      <w:r>
+        <w:rPr>
+          <w:rFonts w:ascii="Times New Roman" w:eastAsia="Times New Roman" w:hAnsi="Times New Roman" w:cs="Times New Roman"/>
+          <w:kern w:val="0"/>
+          <w:lang w:eastAsia="en-GB"/>
+          <w14:ligatures w14:val="none"/>
+        </w:rPr>
+        <w:br/>
+        <w:t>6. When hovering over the liver ticker sports game update feed, then hover over box gets hidden under the below section. Make sure that when hovering over any hover section, that the hover section is fully visible and free flowing with fast performance.</w:t>
+      </w:r>
+      <w:r>
+        <w:rPr>
+          <w:rFonts w:ascii="Times New Roman" w:eastAsia="Times New Roman" w:hAnsi="Times New Roman" w:cs="Times New Roman"/>
+          <w:kern w:val="0"/>
+          <w:lang w:eastAsia="en-GB"/>
+          <w14:ligatures w14:val="none"/>
+        </w:rPr>
+        <w:br/>
+        <w:t xml:space="preserve">7. Make player names and teams selectable, make it so that you can bring up a hover over menu describing the player or team selected in rich details. Giving you options to select further to the league tables page (which should show a </w:t>
+      </w:r>
+      <w:r>
+        <w:rPr>
+          <w:rFonts w:ascii="Times New Roman" w:eastAsia="Times New Roman" w:hAnsi="Times New Roman" w:cs="Times New Roman"/>
+          <w:kern w:val="0"/>
+          <w:lang w:eastAsia="en-GB"/>
+          <w14:ligatures w14:val="none"/>
+        </w:rPr>
+        <w:t>selection</w:t>
+      </w:r>
+      <w:r>
+        <w:rPr>
+          <w:rFonts w:ascii="Times New Roman" w:eastAsia="Times New Roman" w:hAnsi="Times New Roman" w:cs="Times New Roman"/>
+          <w:kern w:val="0"/>
+          <w:lang w:eastAsia="en-GB"/>
+          <w14:ligatures w14:val="none"/>
+        </w:rPr>
+        <w:t xml:space="preserve"> field of different leagues, a field for </w:t>
+      </w:r>
+      <w:proofErr w:type="spellStart"/>
+      <w:proofErr w:type="gramStart"/>
+      <w:r>
+        <w:rPr>
+          <w:rFonts w:ascii="Times New Roman" w:eastAsia="Times New Roman" w:hAnsi="Times New Roman" w:cs="Times New Roman"/>
+          <w:kern w:val="0"/>
+          <w:lang w:eastAsia="en-GB"/>
+          <w14:ligatures w14:val="none"/>
+        </w:rPr>
+        <w:t>country’s</w:t>
+      </w:r>
+      <w:proofErr w:type="spellEnd"/>
+      <w:proofErr w:type="gramEnd"/>
+      <w:r>
+        <w:rPr>
+          <w:rFonts w:ascii="Times New Roman" w:eastAsia="Times New Roman" w:hAnsi="Times New Roman" w:cs="Times New Roman"/>
+          <w:kern w:val="0"/>
+          <w:lang w:eastAsia="en-GB"/>
+          <w14:ligatures w14:val="none"/>
+        </w:rPr>
+        <w:t xml:space="preserve"> and a field for searching players on the database</w:t>
+      </w:r>
+      <w:r>
+        <w:rPr>
+          <w:rFonts w:ascii="Times New Roman" w:eastAsia="Times New Roman" w:hAnsi="Times New Roman" w:cs="Times New Roman"/>
+          <w:kern w:val="0"/>
+          <w:lang w:eastAsia="en-GB"/>
+          <w14:ligatures w14:val="none"/>
+        </w:rPr>
+        <w:t xml:space="preserve"> (each selection should bring you to a modern looking table of each leagues and its current status with continuous updates)</w:t>
+      </w:r>
+      <w:r>
+        <w:rPr>
+          <w:rFonts w:ascii="Times New Roman" w:eastAsia="Times New Roman" w:hAnsi="Times New Roman" w:cs="Times New Roman"/>
+          <w:kern w:val="0"/>
+          <w:lang w:eastAsia="en-GB"/>
+          <w14:ligatures w14:val="none"/>
+        </w:rPr>
+        <w:t xml:space="preserve">. each player profile should show a small player profile picture and rich description of their stats, </w:t>
+      </w:r>
+      <w:r>
+        <w:rPr>
+          <w:rFonts w:ascii="Times New Roman" w:eastAsia="Times New Roman" w:hAnsi="Times New Roman" w:cs="Times New Roman"/>
+          <w:kern w:val="0"/>
+          <w:lang w:eastAsia="en-GB"/>
+          <w14:ligatures w14:val="none"/>
+        </w:rPr>
+        <w:t>showing their value based on years of history, and showing their performance</w:t>
+      </w:r>
+      <w:r>
+        <w:rPr>
+          <w:rFonts w:ascii="Times New Roman" w:eastAsia="Times New Roman" w:hAnsi="Times New Roman" w:cs="Times New Roman"/>
+          <w:kern w:val="0"/>
+          <w:lang w:eastAsia="en-GB"/>
+          <w14:ligatures w14:val="none"/>
+        </w:rPr>
+        <w:t xml:space="preserve"> over </w:t>
+      </w:r>
+      <w:r>
+        <w:rPr>
+          <w:rFonts w:ascii="Times New Roman" w:eastAsia="Times New Roman" w:hAnsi="Times New Roman" w:cs="Times New Roman"/>
+          <w:kern w:val="0"/>
+          <w:lang w:eastAsia="en-GB"/>
+          <w14:ligatures w14:val="none"/>
+        </w:rPr>
+        <w:t xml:space="preserve">the last </w:t>
+      </w:r>
+      <w:r>
+        <w:rPr>
+          <w:rFonts w:ascii="Times New Roman" w:eastAsia="Times New Roman" w:hAnsi="Times New Roman" w:cs="Times New Roman"/>
+          <w:kern w:val="0"/>
+          <w:lang w:eastAsia="en-GB"/>
+          <w14:ligatures w14:val="none"/>
+        </w:rPr>
+        <w:t xml:space="preserve">5 games and the </w:t>
+      </w:r>
+      <w:r>
+        <w:rPr>
+          <w:rFonts w:ascii="Times New Roman" w:eastAsia="Times New Roman" w:hAnsi="Times New Roman" w:cs="Times New Roman"/>
+          <w:kern w:val="0"/>
+          <w:lang w:eastAsia="en-GB"/>
+          <w14:ligatures w14:val="none"/>
+        </w:rPr>
+        <w:t xml:space="preserve">current </w:t>
+      </w:r>
+      <w:r>
+        <w:rPr>
+          <w:rFonts w:ascii="Times New Roman" w:eastAsia="Times New Roman" w:hAnsi="Times New Roman" w:cs="Times New Roman"/>
+          <w:kern w:val="0"/>
+          <w:lang w:eastAsia="en-GB"/>
+          <w14:ligatures w14:val="none"/>
+        </w:rPr>
+        <w:t>season.</w:t>
+      </w:r>
+      <w:r>
+        <w:rPr>
+          <w:rFonts w:ascii="Times New Roman" w:eastAsia="Times New Roman" w:hAnsi="Times New Roman" w:cs="Times New Roman"/>
+          <w:kern w:val="0"/>
+          <w:lang w:eastAsia="en-GB"/>
+          <w14:ligatures w14:val="none"/>
+        </w:rPr>
+        <w:br/>
+        <w:t>8. Use correct wording/abbreviating for the football team names so that it matches EPL main standards and stays consistent throughout this model (think using global settings/styles to be able to make changes easier.</w:t>
+      </w:r>
+      <w:r>
+        <w:rPr>
+          <w:rFonts w:ascii="Times New Roman" w:eastAsia="Times New Roman" w:hAnsi="Times New Roman" w:cs="Times New Roman"/>
+          <w:kern w:val="0"/>
+          <w:lang w:eastAsia="en-GB"/>
+          <w14:ligatures w14:val="none"/>
+        </w:rPr>
+        <w:br/>
+        <w:t>9. Make it so that I can pick from a database of which top selections should be displayed for each match bet. For example, half time score/full time score section may be better suited during champions league phase as users tend to make those kinds of bets when the champions league is on. I want this model to learn those sorts of patterns and allow me to adjust this model in accordance to that.</w:t>
+      </w:r>
+      <w:r>
+        <w:rPr>
+          <w:rFonts w:ascii="Times New Roman" w:eastAsia="Times New Roman" w:hAnsi="Times New Roman" w:cs="Times New Roman"/>
+          <w:kern w:val="0"/>
+          <w:lang w:eastAsia="en-GB"/>
+          <w14:ligatures w14:val="none"/>
+        </w:rPr>
+        <w:br/>
+      </w:r>
+      <w:r>
+        <w:rPr>
+          <w:rFonts w:ascii="Times New Roman" w:eastAsia="Times New Roman" w:hAnsi="Times New Roman" w:cs="Times New Roman"/>
+          <w:kern w:val="0"/>
+          <w:lang w:eastAsia="en-GB"/>
+          <w14:ligatures w14:val="none"/>
+        </w:rPr>
+        <w:br/>
+      </w:r>
+      <w:r>
+        <w:rPr>
+          <w:rFonts w:ascii="Times New Roman" w:eastAsia="Times New Roman" w:hAnsi="Times New Roman" w:cs="Times New Roman"/>
+          <w:b/>
+          <w:bCs/>
+          <w:kern w:val="0"/>
+          <w:sz w:val="48"/>
+          <w:szCs w:val="48"/>
+          <w:lang w:eastAsia="en-GB"/>
+          <w14:ligatures w14:val="none"/>
+        </w:rPr>
+        <w:lastRenderedPageBreak/>
+        <w:t>12.</w:t>
+      </w:r>
+      <w:r>
+        <w:rPr>
+          <w:rFonts w:ascii="Times New Roman" w:eastAsia="Times New Roman" w:hAnsi="Times New Roman" w:cs="Times New Roman"/>
+          <w:kern w:val="0"/>
+          <w:lang w:eastAsia="en-GB"/>
+          <w14:ligatures w14:val="none"/>
+        </w:rPr>
+        <w:t xml:space="preserve"> </w:t>
+      </w:r>
+      <w:r>
+        <w:rPr>
+          <w:rFonts w:ascii="Times New Roman" w:eastAsia="Times New Roman" w:hAnsi="Times New Roman" w:cs="Times New Roman"/>
+          <w:kern w:val="0"/>
+          <w:lang w:eastAsia="en-GB"/>
+          <w14:ligatures w14:val="none"/>
+        </w:rPr>
+        <w:br/>
+        <w:t xml:space="preserve">1.Make a name-alias map for the </w:t>
+      </w:r>
+      <w:proofErr w:type="gramStart"/>
+      <w:r>
+        <w:rPr>
+          <w:rFonts w:ascii="Times New Roman" w:eastAsia="Times New Roman" w:hAnsi="Times New Roman" w:cs="Times New Roman"/>
+          <w:kern w:val="0"/>
+          <w:lang w:eastAsia="en-GB"/>
+          <w14:ligatures w14:val="none"/>
+        </w:rPr>
+        <w:t>team</w:t>
+      </w:r>
+      <w:proofErr w:type="gramEnd"/>
+      <w:r>
+        <w:rPr>
+          <w:rFonts w:ascii="Times New Roman" w:eastAsia="Times New Roman" w:hAnsi="Times New Roman" w:cs="Times New Roman"/>
+          <w:kern w:val="0"/>
+          <w:lang w:eastAsia="en-GB"/>
+          <w14:ligatures w14:val="none"/>
+        </w:rPr>
+        <w:t xml:space="preserve"> name titles for when they are displayed in headers and sections to keep them consistent and showing the real names of each team.</w:t>
+      </w:r>
+      <w:r>
+        <w:rPr>
+          <w:rFonts w:ascii="Times New Roman" w:eastAsia="Times New Roman" w:hAnsi="Times New Roman" w:cs="Times New Roman"/>
+          <w:kern w:val="0"/>
+          <w:lang w:eastAsia="en-GB"/>
+          <w14:ligatures w14:val="none"/>
+        </w:rPr>
+        <w:br/>
+        <w:t>2. Make the both teams to score (BTTS) section show a no selection for both teams to score.</w:t>
+      </w:r>
+      <w:r>
+        <w:rPr>
+          <w:rFonts w:ascii="Times New Roman" w:eastAsia="Times New Roman" w:hAnsi="Times New Roman" w:cs="Times New Roman"/>
+          <w:kern w:val="0"/>
+          <w:lang w:eastAsia="en-GB"/>
+          <w14:ligatures w14:val="none"/>
+        </w:rPr>
+        <w:br/>
+        <w:t>3. Make a small selection for home team win, home team win or draw, draw, away team win, away team win or draw and make sure the points rewarded for this selection and other similar easier bet methods can only reward the user a small number of points, in a range of 1-15 only.</w:t>
+      </w:r>
+      <w:r>
+        <w:rPr>
+          <w:rFonts w:ascii="Times New Roman" w:eastAsia="Times New Roman" w:hAnsi="Times New Roman" w:cs="Times New Roman"/>
+          <w:kern w:val="0"/>
+          <w:lang w:eastAsia="en-GB"/>
+          <w14:ligatures w14:val="none"/>
+        </w:rPr>
+        <w:br/>
       </w:r>
     </w:p>
     <w:sectPr>

</xml_diff>

<commit_message>
Vendicator Scoreline engine, bet builder with live points/risk/negatives, season log with friendlies separated, extended player markets, glass nav + CardGrid button, help/FAQ/contact, compare page
</commit_message>
<xml_diff>
--- a/Notes/Vindicator Business Notes Plan.docx
+++ b/Notes/Vindicator Business Notes Plan.docx
@@ -8403,26 +8403,1597 @@
           <w14:ligatures w14:val="none"/>
         </w:rPr>
         <w:br/>
-        <w:t>2. Make the both teams to score (BTTS) section show a no selection for both teams to score.</w:t>
-      </w:r>
-      <w:r>
-        <w:rPr>
-          <w:rFonts w:ascii="Times New Roman" w:eastAsia="Times New Roman" w:hAnsi="Times New Roman" w:cs="Times New Roman"/>
-          <w:kern w:val="0"/>
-          <w:lang w:eastAsia="en-GB"/>
-          <w14:ligatures w14:val="none"/>
-        </w:rPr>
-        <w:br/>
-        <w:t>3. Make a small selection for home team win, home team win or draw, draw, away team win, away team win or draw and make sure the points rewarded for this selection and other similar easier bet methods can only reward the user a small number of points, in a range of 1-15 only.</w:t>
-      </w:r>
-      <w:r>
-        <w:rPr>
-          <w:rFonts w:ascii="Times New Roman" w:eastAsia="Times New Roman" w:hAnsi="Times New Roman" w:cs="Times New Roman"/>
-          <w:kern w:val="0"/>
-          <w:lang w:eastAsia="en-GB"/>
-          <w14:ligatures w14:val="none"/>
-        </w:rPr>
-        <w:br/>
+        <w:t>2. Make the both teams to score (BTTS) section show a no</w:t>
+      </w:r>
+      <w:r>
+        <w:rPr>
+          <w:rFonts w:ascii="Times New Roman" w:eastAsia="Times New Roman" w:hAnsi="Times New Roman" w:cs="Times New Roman"/>
+          <w:kern w:val="0"/>
+          <w:lang w:eastAsia="en-GB"/>
+          <w14:ligatures w14:val="none"/>
+        </w:rPr>
+        <w:t xml:space="preserve"> team to score</w:t>
+      </w:r>
+      <w:r>
+        <w:rPr>
+          <w:rFonts w:ascii="Times New Roman" w:eastAsia="Times New Roman" w:hAnsi="Times New Roman" w:cs="Times New Roman"/>
+          <w:kern w:val="0"/>
+          <w:lang w:eastAsia="en-GB"/>
+          <w14:ligatures w14:val="none"/>
+        </w:rPr>
+        <w:t xml:space="preserve"> selection for </w:t>
+      </w:r>
+      <w:r>
+        <w:rPr>
+          <w:rFonts w:ascii="Times New Roman" w:eastAsia="Times New Roman" w:hAnsi="Times New Roman" w:cs="Times New Roman"/>
+          <w:kern w:val="0"/>
+          <w:lang w:eastAsia="en-GB"/>
+          <w14:ligatures w14:val="none"/>
+        </w:rPr>
+        <w:t>BTTS section</w:t>
+      </w:r>
+      <w:r>
+        <w:rPr>
+          <w:rFonts w:ascii="Times New Roman" w:eastAsia="Times New Roman" w:hAnsi="Times New Roman" w:cs="Times New Roman"/>
+          <w:kern w:val="0"/>
+          <w:lang w:eastAsia="en-GB"/>
+          <w14:ligatures w14:val="none"/>
+        </w:rPr>
+        <w:t>.</w:t>
+      </w:r>
+      <w:r>
+        <w:rPr>
+          <w:rFonts w:ascii="Times New Roman" w:eastAsia="Times New Roman" w:hAnsi="Times New Roman" w:cs="Times New Roman"/>
+          <w:kern w:val="0"/>
+          <w:lang w:eastAsia="en-GB"/>
+          <w14:ligatures w14:val="none"/>
+        </w:rPr>
+        <w:br/>
+        <w:t xml:space="preserve">3. Make a small selection for home team win, home team win or draw, draw, away team win, away team win or draw </w:t>
+      </w:r>
+      <w:r>
+        <w:rPr>
+          <w:rFonts w:ascii="Times New Roman" w:eastAsia="Times New Roman" w:hAnsi="Times New Roman" w:cs="Times New Roman"/>
+          <w:kern w:val="0"/>
+          <w:lang w:eastAsia="en-GB"/>
+          <w14:ligatures w14:val="none"/>
+        </w:rPr>
+        <w:t xml:space="preserve">with only one of these sections in each card </w:t>
+      </w:r>
+      <w:r>
+        <w:rPr>
+          <w:rFonts w:ascii="Times New Roman" w:eastAsia="Times New Roman" w:hAnsi="Times New Roman" w:cs="Times New Roman"/>
+          <w:kern w:val="0"/>
+          <w:lang w:eastAsia="en-GB"/>
+          <w14:ligatures w14:val="none"/>
+        </w:rPr>
+        <w:t xml:space="preserve">and make sure the points rewarded for this selection and other similar easier bet methods can only reward the user a small number of points, </w:t>
+      </w:r>
+      <w:r>
+        <w:rPr>
+          <w:rFonts w:ascii="Times New Roman" w:eastAsia="Times New Roman" w:hAnsi="Times New Roman" w:cs="Times New Roman"/>
+          <w:kern w:val="0"/>
+          <w:lang w:eastAsia="en-GB"/>
+          <w14:ligatures w14:val="none"/>
+        </w:rPr>
+        <w:t xml:space="preserve">or based somewhere in a considerable range based on the system </w:t>
+      </w:r>
+      <w:r>
+        <w:rPr>
+          <w:rFonts w:ascii="Times New Roman" w:eastAsia="Times New Roman" w:hAnsi="Times New Roman" w:cs="Times New Roman"/>
+          <w:kern w:val="0"/>
+          <w:lang w:eastAsia="en-GB"/>
+          <w14:ligatures w14:val="none"/>
+        </w:rPr>
+        <w:t>probability</w:t>
+      </w:r>
+      <w:r>
+        <w:rPr>
+          <w:rFonts w:ascii="Times New Roman" w:eastAsia="Times New Roman" w:hAnsi="Times New Roman" w:cs="Times New Roman"/>
+          <w:kern w:val="0"/>
+          <w:lang w:eastAsia="en-GB"/>
+          <w14:ligatures w14:val="none"/>
+        </w:rPr>
+        <w:t>.</w:t>
+      </w:r>
+      <w:r>
+        <w:rPr>
+          <w:rFonts w:ascii="Times New Roman" w:eastAsia="Times New Roman" w:hAnsi="Times New Roman" w:cs="Times New Roman"/>
+          <w:kern w:val="0"/>
+          <w:lang w:eastAsia="en-GB"/>
+          <w14:ligatures w14:val="none"/>
+        </w:rPr>
+        <w:br/>
+      </w:r>
+      <w:r>
+        <w:rPr>
+          <w:rFonts w:ascii="Times New Roman" w:eastAsia="Times New Roman" w:hAnsi="Times New Roman" w:cs="Times New Roman"/>
+          <w:kern w:val="0"/>
+          <w:lang w:eastAsia="en-GB"/>
+          <w14:ligatures w14:val="none"/>
+        </w:rPr>
+        <w:t>4. start logging all upcoming matches for this season and matches that have already been played for this season period (including friendly matches, but keep their total separate from league and cup games) and start using the data of bets won and lost</w:t>
+      </w:r>
+      <w:r>
+        <w:rPr>
+          <w:rFonts w:ascii="Times New Roman" w:eastAsia="Times New Roman" w:hAnsi="Times New Roman" w:cs="Times New Roman"/>
+          <w:kern w:val="0"/>
+          <w:lang w:eastAsia="en-GB"/>
+          <w14:ligatures w14:val="none"/>
+        </w:rPr>
+        <w:t xml:space="preserve"> </w:t>
+      </w:r>
+      <w:r>
+        <w:rPr>
+          <w:rFonts w:ascii="Times New Roman" w:eastAsia="Times New Roman" w:hAnsi="Times New Roman" w:cs="Times New Roman"/>
+          <w:kern w:val="0"/>
+          <w:lang w:eastAsia="en-GB"/>
+          <w14:ligatures w14:val="none"/>
+        </w:rPr>
+        <w:t xml:space="preserve">to generate a completely separate score called the </w:t>
+      </w:r>
+      <w:proofErr w:type="spellStart"/>
+      <w:r>
+        <w:rPr>
+          <w:rFonts w:ascii="Times New Roman" w:eastAsia="Times New Roman" w:hAnsi="Times New Roman" w:cs="Times New Roman"/>
+          <w:kern w:val="0"/>
+          <w:lang w:eastAsia="en-GB"/>
+          <w14:ligatures w14:val="none"/>
+        </w:rPr>
+        <w:t>Vendicator</w:t>
+      </w:r>
+      <w:proofErr w:type="spellEnd"/>
+      <w:r>
+        <w:rPr>
+          <w:rFonts w:ascii="Times New Roman" w:eastAsia="Times New Roman" w:hAnsi="Times New Roman" w:cs="Times New Roman"/>
+          <w:kern w:val="0"/>
+          <w:lang w:eastAsia="en-GB"/>
+          <w14:ligatures w14:val="none"/>
+        </w:rPr>
+        <w:t xml:space="preserve"> </w:t>
+      </w:r>
+      <w:proofErr w:type="spellStart"/>
+      <w:r>
+        <w:rPr>
+          <w:rFonts w:ascii="Times New Roman" w:eastAsia="Times New Roman" w:hAnsi="Times New Roman" w:cs="Times New Roman"/>
+          <w:kern w:val="0"/>
+          <w:lang w:eastAsia="en-GB"/>
+          <w14:ligatures w14:val="none"/>
+        </w:rPr>
+        <w:t>Score</w:t>
+      </w:r>
+      <w:r>
+        <w:rPr>
+          <w:rFonts w:ascii="Times New Roman" w:eastAsia="Times New Roman" w:hAnsi="Times New Roman" w:cs="Times New Roman"/>
+          <w:kern w:val="0"/>
+          <w:lang w:eastAsia="en-GB"/>
+          <w14:ligatures w14:val="none"/>
+        </w:rPr>
+        <w:t>line</w:t>
+      </w:r>
+      <w:proofErr w:type="spellEnd"/>
+      <w:r>
+        <w:rPr>
+          <w:rFonts w:ascii="Times New Roman" w:eastAsia="Times New Roman" w:hAnsi="Times New Roman" w:cs="Times New Roman"/>
+          <w:kern w:val="0"/>
+          <w:lang w:eastAsia="en-GB"/>
+          <w14:ligatures w14:val="none"/>
+        </w:rPr>
+        <w:t xml:space="preserve"> </w:t>
+      </w:r>
+      <w:r>
+        <w:rPr>
+          <w:rFonts w:ascii="Times New Roman" w:eastAsia="Times New Roman" w:hAnsi="Times New Roman" w:cs="Times New Roman"/>
+          <w:kern w:val="0"/>
+          <w:lang w:eastAsia="en-GB"/>
+          <w14:ligatures w14:val="none"/>
+        </w:rPr>
+        <w:br/>
+        <w:t xml:space="preserve">(this score will be </w:t>
+      </w:r>
+      <w:proofErr w:type="gramStart"/>
+      <w:r>
+        <w:rPr>
+          <w:rFonts w:ascii="Times New Roman" w:eastAsia="Times New Roman" w:hAnsi="Times New Roman" w:cs="Times New Roman"/>
+          <w:kern w:val="0"/>
+          <w:lang w:eastAsia="en-GB"/>
+          <w14:ligatures w14:val="none"/>
+        </w:rPr>
+        <w:t>this models</w:t>
+      </w:r>
+      <w:proofErr w:type="gramEnd"/>
+      <w:r>
+        <w:rPr>
+          <w:rFonts w:ascii="Times New Roman" w:eastAsia="Times New Roman" w:hAnsi="Times New Roman" w:cs="Times New Roman"/>
+          <w:kern w:val="0"/>
+          <w:lang w:eastAsia="en-GB"/>
+          <w14:ligatures w14:val="none"/>
+        </w:rPr>
+        <w:t xml:space="preserve"> main betting feature and will be a different score for each team and each player. The score will be generated through the </w:t>
+      </w:r>
+      <w:proofErr w:type="gramStart"/>
+      <w:r>
+        <w:rPr>
+          <w:rFonts w:ascii="Times New Roman" w:eastAsia="Times New Roman" w:hAnsi="Times New Roman" w:cs="Times New Roman"/>
+          <w:kern w:val="0"/>
+          <w:lang w:eastAsia="en-GB"/>
+          <w14:ligatures w14:val="none"/>
+        </w:rPr>
+        <w:t>models</w:t>
+      </w:r>
+      <w:proofErr w:type="gramEnd"/>
+      <w:r>
+        <w:rPr>
+          <w:rFonts w:ascii="Times New Roman" w:eastAsia="Times New Roman" w:hAnsi="Times New Roman" w:cs="Times New Roman"/>
+          <w:kern w:val="0"/>
+          <w:lang w:eastAsia="en-GB"/>
+          <w14:ligatures w14:val="none"/>
+        </w:rPr>
+        <w:t xml:space="preserve"> collected data and research, but also using the outcomes of. Bets that were close to winning and comparing to why they didn’t win, what tactics could have been done to win, and what betting odds would have won the user points if they picked the right selection). The score will also consist of two different scores, one will be the overall total based on all the collected data mentioned above and the second will a betting odd number in decimal form and fraction form and this will be generated before every match for every team and every player to ensure that the betting odd number will be generated in enough time to be ready for users to use it as a real time bet elsewhere. This score should </w:t>
+      </w:r>
+      <w:r>
+        <w:rPr>
+          <w:rFonts w:ascii="Times New Roman" w:eastAsia="Times New Roman" w:hAnsi="Times New Roman" w:cs="Times New Roman"/>
+          <w:kern w:val="0"/>
+          <w:lang w:eastAsia="en-GB"/>
+          <w14:ligatures w14:val="none"/>
+        </w:rPr>
+        <w:t>display</w:t>
+      </w:r>
+      <w:r>
+        <w:rPr>
+          <w:rFonts w:ascii="Times New Roman" w:eastAsia="Times New Roman" w:hAnsi="Times New Roman" w:cs="Times New Roman"/>
+          <w:kern w:val="0"/>
+          <w:lang w:eastAsia="en-GB"/>
+          <w14:ligatures w14:val="none"/>
+        </w:rPr>
+        <w:t xml:space="preserve"> in top right corner next to and account settings icon and the timestamp clock and the Vindicator numbers next to them.</w:t>
+      </w:r>
+      <w:r>
+        <w:rPr>
+          <w:rFonts w:ascii="Times New Roman" w:eastAsia="Times New Roman" w:hAnsi="Times New Roman" w:cs="Times New Roman"/>
+          <w:kern w:val="0"/>
+          <w:lang w:eastAsia="en-GB"/>
+          <w14:ligatures w14:val="none"/>
+        </w:rPr>
+        <w:br/>
+        <w:t xml:space="preserve">5. Make a help section where users can find answered FAQs and a contact form to send an email to: </w:t>
+      </w:r>
+      <w:hyperlink r:id="rId8" w:history="1">
+        <w:r>
+          <w:rPr>
+            <w:rStyle w:val="Hyperlink"/>
+            <w:rFonts w:ascii="Times New Roman" w:eastAsia="Times New Roman" w:hAnsi="Times New Roman" w:cs="Times New Roman"/>
+            <w:kern w:val="0"/>
+            <w:lang w:eastAsia="en-GB"/>
+            <w14:ligatures w14:val="none"/>
+          </w:rPr>
+          <w:t>contact@vendicator.co.uk</w:t>
+        </w:r>
+      </w:hyperlink>
+      <w:r>
+        <w:rPr>
+          <w:rFonts w:ascii="Times New Roman" w:eastAsia="Times New Roman" w:hAnsi="Times New Roman" w:cs="Times New Roman"/>
+          <w:kern w:val="0"/>
+          <w:lang w:eastAsia="en-GB"/>
+          <w14:ligatures w14:val="none"/>
+        </w:rPr>
+        <w:t xml:space="preserve"> for any help and enquiries. (Please create/find the best free email management system using that email address where I can manage customer queries and invoices/receipts for subscriptions. Report back to me with your finds for me to confirm which is better to use.</w:t>
+      </w:r>
+      <w:r>
+        <w:rPr>
+          <w:rFonts w:ascii="Times New Roman" w:eastAsia="Times New Roman" w:hAnsi="Times New Roman" w:cs="Times New Roman"/>
+          <w:kern w:val="0"/>
+          <w:lang w:eastAsia="en-GB"/>
+          <w14:ligatures w14:val="none"/>
+        </w:rPr>
+        <w:br/>
+        <w:t xml:space="preserve">6. </w:t>
+      </w:r>
+      <w:r>
+        <w:rPr>
+          <w:rFonts w:ascii="Times New Roman" w:eastAsia="Times New Roman" w:hAnsi="Times New Roman" w:cs="Times New Roman"/>
+          <w:kern w:val="0"/>
+          <w:lang w:eastAsia="en-GB"/>
+          <w14:ligatures w14:val="none"/>
+        </w:rPr>
+        <w:t>Replace</w:t>
+      </w:r>
+      <w:r>
+        <w:rPr>
+          <w:rFonts w:ascii="Times New Roman" w:eastAsia="Times New Roman" w:hAnsi="Times New Roman" w:cs="Times New Roman"/>
+          <w:kern w:val="0"/>
+          <w:lang w:eastAsia="en-GB"/>
+          <w14:ligatures w14:val="none"/>
+        </w:rPr>
+        <w:t xml:space="preserve"> the 1x2 </w:t>
+      </w:r>
+      <w:r>
+        <w:rPr>
+          <w:rFonts w:ascii="Times New Roman" w:eastAsia="Times New Roman" w:hAnsi="Times New Roman" w:cs="Times New Roman"/>
+          <w:kern w:val="0"/>
+          <w:lang w:eastAsia="en-GB"/>
+          <w14:ligatures w14:val="none"/>
+        </w:rPr>
+        <w:t xml:space="preserve">card </w:t>
+      </w:r>
+      <w:r>
+        <w:rPr>
+          <w:rFonts w:ascii="Times New Roman" w:eastAsia="Times New Roman" w:hAnsi="Times New Roman" w:cs="Times New Roman"/>
+          <w:kern w:val="0"/>
+          <w:lang w:eastAsia="en-GB"/>
+          <w14:ligatures w14:val="none"/>
+        </w:rPr>
+        <w:t>section more of a home win, home win or draw, draw, away win, away win or draw instead of just home draw and away. Also make the sections have content in each box that is selectable to make a prediction towards a bet. Also showing how much point</w:t>
+      </w:r>
+      <w:r>
+        <w:rPr>
+          <w:rFonts w:ascii="Times New Roman" w:eastAsia="Times New Roman" w:hAnsi="Times New Roman" w:cs="Times New Roman"/>
+          <w:kern w:val="0"/>
+          <w:lang w:eastAsia="en-GB"/>
+          <w14:ligatures w14:val="none"/>
+        </w:rPr>
+        <w:t>s</w:t>
+      </w:r>
+      <w:r>
+        <w:rPr>
+          <w:rFonts w:ascii="Times New Roman" w:eastAsia="Times New Roman" w:hAnsi="Times New Roman" w:cs="Times New Roman"/>
+          <w:kern w:val="0"/>
+          <w:lang w:eastAsia="en-GB"/>
+          <w14:ligatures w14:val="none"/>
+        </w:rPr>
+        <w:t xml:space="preserve"> you will earn for that selection, also showing a live update of that selection </w:t>
+      </w:r>
+      <w:r>
+        <w:rPr>
+          <w:rFonts w:ascii="Times New Roman" w:eastAsia="Times New Roman" w:hAnsi="Times New Roman" w:cs="Times New Roman"/>
+          <w:kern w:val="0"/>
+          <w:lang w:eastAsia="en-GB"/>
+          <w14:ligatures w14:val="none"/>
+        </w:rPr>
+        <w:t>point-</w:t>
+      </w:r>
+      <w:r>
+        <w:rPr>
+          <w:rFonts w:ascii="Times New Roman" w:eastAsia="Times New Roman" w:hAnsi="Times New Roman" w:cs="Times New Roman"/>
+          <w:kern w:val="0"/>
+          <w:lang w:eastAsia="en-GB"/>
+          <w14:ligatures w14:val="none"/>
+        </w:rPr>
+        <w:t>score when you select multiple selections to make a bet builder within the predictions section</w:t>
+      </w:r>
+      <w:r>
+        <w:rPr>
+          <w:rFonts w:ascii="Times New Roman" w:eastAsia="Times New Roman" w:hAnsi="Times New Roman" w:cs="Times New Roman"/>
+          <w:kern w:val="0"/>
+          <w:lang w:eastAsia="en-GB"/>
+          <w14:ligatures w14:val="none"/>
+        </w:rPr>
+        <w:t xml:space="preserve"> as the score will change based on each selection you make</w:t>
+      </w:r>
+      <w:r>
+        <w:rPr>
+          <w:rFonts w:ascii="Times New Roman" w:eastAsia="Times New Roman" w:hAnsi="Times New Roman" w:cs="Times New Roman"/>
+          <w:kern w:val="0"/>
+          <w:lang w:eastAsia="en-GB"/>
+          <w14:ligatures w14:val="none"/>
+        </w:rPr>
+        <w:t>.</w:t>
+      </w:r>
+      <w:r>
+        <w:rPr>
+          <w:rFonts w:ascii="Times New Roman" w:eastAsia="Times New Roman" w:hAnsi="Times New Roman" w:cs="Times New Roman"/>
+          <w:kern w:val="0"/>
+          <w:lang w:eastAsia="en-GB"/>
+          <w14:ligatures w14:val="none"/>
+        </w:rPr>
+        <w:t xml:space="preserve"> This means the score can go up </w:t>
+      </w:r>
+      <w:proofErr w:type="spellStart"/>
+      <w:r>
+        <w:rPr>
+          <w:rFonts w:ascii="Times New Roman" w:eastAsia="Times New Roman" w:hAnsi="Times New Roman" w:cs="Times New Roman"/>
+          <w:kern w:val="0"/>
+          <w:lang w:eastAsia="en-GB"/>
+          <w14:ligatures w14:val="none"/>
+        </w:rPr>
+        <w:t>our</w:t>
+      </w:r>
+      <w:proofErr w:type="spellEnd"/>
+      <w:r>
+        <w:rPr>
+          <w:rFonts w:ascii="Times New Roman" w:eastAsia="Times New Roman" w:hAnsi="Times New Roman" w:cs="Times New Roman"/>
+          <w:kern w:val="0"/>
+          <w:lang w:eastAsia="en-GB"/>
+          <w14:ligatures w14:val="none"/>
+        </w:rPr>
+        <w:t xml:space="preserve"> down and even into minus if you don’t make the right selections (however the odds should always help you win as long as the users selected bet wins, otherwise no points will be earned and if more than 3 selections of the bet builder fails then the user will be </w:t>
+      </w:r>
+      <w:r>
+        <w:rPr>
+          <w:rFonts w:ascii="Times New Roman" w:eastAsia="Times New Roman" w:hAnsi="Times New Roman" w:cs="Times New Roman"/>
+          <w:kern w:val="0"/>
+          <w:lang w:eastAsia="en-GB"/>
+          <w14:ligatures w14:val="none"/>
+        </w:rPr>
+        <w:t>deducted on</w:t>
+      </w:r>
+      <w:r>
+        <w:rPr>
+          <w:rFonts w:ascii="Times New Roman" w:eastAsia="Times New Roman" w:hAnsi="Times New Roman" w:cs="Times New Roman"/>
+          <w:kern w:val="0"/>
+          <w:lang w:eastAsia="en-GB"/>
+          <w14:ligatures w14:val="none"/>
+        </w:rPr>
+        <w:t xml:space="preserve"> points based on their selections</w:t>
+      </w:r>
+      <w:r>
+        <w:rPr>
+          <w:rFonts w:ascii="Times New Roman" w:eastAsia="Times New Roman" w:hAnsi="Times New Roman" w:cs="Times New Roman"/>
+          <w:kern w:val="0"/>
+          <w:lang w:eastAsia="en-GB"/>
+          <w14:ligatures w14:val="none"/>
+        </w:rPr>
+        <w:t xml:space="preserve"> and the points system</w:t>
+      </w:r>
+      <w:r>
+        <w:rPr>
+          <w:rFonts w:ascii="Times New Roman" w:eastAsia="Times New Roman" w:hAnsi="Times New Roman" w:cs="Times New Roman"/>
+          <w:kern w:val="0"/>
+          <w:lang w:eastAsia="en-GB"/>
+          <w14:ligatures w14:val="none"/>
+        </w:rPr>
+        <w:t xml:space="preserve"> (when 3 or more selections fail or a bet loses, that card will be removed but still logged as a loss)</w:t>
+      </w:r>
+      <w:r>
+        <w:rPr>
+          <w:rFonts w:ascii="Times New Roman" w:eastAsia="Times New Roman" w:hAnsi="Times New Roman" w:cs="Times New Roman"/>
+          <w:kern w:val="0"/>
+          <w:lang w:eastAsia="en-GB"/>
+          <w14:ligatures w14:val="none"/>
+        </w:rPr>
+        <w:t>.</w:t>
+      </w:r>
+      <w:r>
+        <w:rPr>
+          <w:rFonts w:ascii="Times New Roman" w:eastAsia="Times New Roman" w:hAnsi="Times New Roman" w:cs="Times New Roman"/>
+          <w:kern w:val="0"/>
+          <w:lang w:eastAsia="en-GB"/>
+          <w14:ligatures w14:val="none"/>
+        </w:rPr>
+        <w:br/>
+      </w:r>
+      <w:r>
+        <w:rPr>
+          <w:rFonts w:ascii="Times New Roman" w:eastAsia="Times New Roman" w:hAnsi="Times New Roman" w:cs="Times New Roman"/>
+          <w:kern w:val="0"/>
+          <w:lang w:eastAsia="en-GB"/>
+          <w14:ligatures w14:val="none"/>
+        </w:rPr>
+        <w:t xml:space="preserve"> This is the main feature of the gaming model where points are collected and users have to carefully think w</w:t>
+      </w:r>
+      <w:r>
+        <w:rPr>
+          <w:rFonts w:ascii="Times New Roman" w:eastAsia="Times New Roman" w:hAnsi="Times New Roman" w:cs="Times New Roman"/>
+          <w:kern w:val="0"/>
+          <w:lang w:eastAsia="en-GB"/>
+          <w14:ligatures w14:val="none"/>
+        </w:rPr>
+        <w:t>hich</w:t>
+      </w:r>
+      <w:r>
+        <w:rPr>
+          <w:rFonts w:ascii="Times New Roman" w:eastAsia="Times New Roman" w:hAnsi="Times New Roman" w:cs="Times New Roman"/>
+          <w:kern w:val="0"/>
+          <w:lang w:eastAsia="en-GB"/>
+          <w14:ligatures w14:val="none"/>
+        </w:rPr>
+        <w:t xml:space="preserve"> team, player and selections will earn them the most</w:t>
+      </w:r>
+      <w:r>
+        <w:rPr>
+          <w:rFonts w:ascii="Times New Roman" w:eastAsia="Times New Roman" w:hAnsi="Times New Roman" w:cs="Times New Roman"/>
+          <w:kern w:val="0"/>
+          <w:lang w:eastAsia="en-GB"/>
+          <w14:ligatures w14:val="none"/>
+        </w:rPr>
+        <w:t>.</w:t>
+      </w:r>
+      <w:r>
+        <w:rPr>
+          <w:rFonts w:ascii="Times New Roman" w:eastAsia="Times New Roman" w:hAnsi="Times New Roman" w:cs="Times New Roman"/>
+          <w:kern w:val="0"/>
+          <w:lang w:eastAsia="en-GB"/>
+          <w14:ligatures w14:val="none"/>
+        </w:rPr>
+        <w:br/>
+        <w:t xml:space="preserve">7. When in accounts section make modern buttons available in top </w:t>
+      </w:r>
+      <w:r>
+        <w:rPr>
+          <w:rFonts w:ascii="Times New Roman" w:eastAsia="Times New Roman" w:hAnsi="Times New Roman" w:cs="Times New Roman"/>
+          <w:kern w:val="0"/>
+          <w:lang w:eastAsia="en-GB"/>
+          <w14:ligatures w14:val="none"/>
+        </w:rPr>
+        <w:t xml:space="preserve">row </w:t>
+      </w:r>
+      <w:r>
+        <w:rPr>
+          <w:rFonts w:ascii="Times New Roman" w:eastAsia="Times New Roman" w:hAnsi="Times New Roman" w:cs="Times New Roman"/>
+          <w:kern w:val="0"/>
+          <w:lang w:eastAsia="en-GB"/>
+          <w14:ligatures w14:val="none"/>
+        </w:rPr>
+        <w:t xml:space="preserve">possibly as a </w:t>
+      </w:r>
+      <w:r>
+        <w:rPr>
+          <w:rFonts w:ascii="Times New Roman" w:eastAsia="Times New Roman" w:hAnsi="Times New Roman" w:cs="Times New Roman"/>
+          <w:kern w:val="0"/>
+          <w:lang w:eastAsia="en-GB"/>
+          <w14:ligatures w14:val="none"/>
+        </w:rPr>
+        <w:t>modern floating header glass themed to show buttons to the home page, account settings, help and predictions zone. So that users can navigate around the whole website model.</w:t>
+      </w:r>
+      <w:r>
+        <w:rPr>
+          <w:rFonts w:ascii="Times New Roman" w:eastAsia="Times New Roman" w:hAnsi="Times New Roman" w:cs="Times New Roman"/>
+          <w:kern w:val="0"/>
+          <w:lang w:eastAsia="en-GB"/>
+          <w14:ligatures w14:val="none"/>
+        </w:rPr>
+        <w:br/>
+        <w:t xml:space="preserve">8. In the live ticker feed, when hovering over the </w:t>
+      </w:r>
+      <w:r>
+        <w:rPr>
+          <w:rFonts w:ascii="Times New Roman" w:eastAsia="Times New Roman" w:hAnsi="Times New Roman" w:cs="Times New Roman"/>
+          <w:kern w:val="0"/>
+          <w:lang w:eastAsia="en-GB"/>
+          <w14:ligatures w14:val="none"/>
+        </w:rPr>
+        <w:t>team’s</w:t>
+      </w:r>
+      <w:r>
+        <w:rPr>
+          <w:rFonts w:ascii="Times New Roman" w:eastAsia="Times New Roman" w:hAnsi="Times New Roman" w:cs="Times New Roman"/>
+          <w:kern w:val="0"/>
+          <w:lang w:eastAsia="en-GB"/>
+          <w14:ligatures w14:val="none"/>
+        </w:rPr>
+        <w:t xml:space="preserve"> player make it selectable to send users to </w:t>
+      </w:r>
+      <w:r>
+        <w:rPr>
+          <w:rFonts w:ascii="Times New Roman" w:eastAsia="Times New Roman" w:hAnsi="Times New Roman" w:cs="Times New Roman"/>
+          <w:kern w:val="0"/>
+          <w:lang w:eastAsia="en-GB"/>
+          <w14:ligatures w14:val="none"/>
+        </w:rPr>
+        <w:t>predictions</w:t>
+      </w:r>
+      <w:r>
+        <w:rPr>
+          <w:rFonts w:ascii="Times New Roman" w:eastAsia="Times New Roman" w:hAnsi="Times New Roman" w:cs="Times New Roman"/>
+          <w:kern w:val="0"/>
+          <w:lang w:eastAsia="en-GB"/>
+          <w14:ligatures w14:val="none"/>
+        </w:rPr>
+        <w:t xml:space="preserve"> compare page. This page will </w:t>
+      </w:r>
+      <w:r>
+        <w:rPr>
+          <w:rFonts w:ascii="Times New Roman" w:eastAsia="Times New Roman" w:hAnsi="Times New Roman" w:cs="Times New Roman"/>
+          <w:kern w:val="0"/>
+          <w:lang w:eastAsia="en-GB"/>
+          <w14:ligatures w14:val="none"/>
+        </w:rPr>
+        <w:t>show the prediction card for that match on a separate page with a go back button available.</w:t>
+      </w:r>
+      <w:r>
+        <w:rPr>
+          <w:rFonts w:ascii="Times New Roman" w:eastAsia="Times New Roman" w:hAnsi="Times New Roman" w:cs="Times New Roman"/>
+          <w:kern w:val="0"/>
+          <w:lang w:eastAsia="en-GB"/>
+          <w14:ligatures w14:val="none"/>
+        </w:rPr>
+        <w:br/>
+      </w:r>
+      <w:r>
+        <w:rPr>
+          <w:rFonts w:ascii="Times New Roman" w:eastAsia="Times New Roman" w:hAnsi="Times New Roman" w:cs="Times New Roman"/>
+          <w:kern w:val="0"/>
+          <w:lang w:eastAsia="en-GB"/>
+          <w14:ligatures w14:val="none"/>
+        </w:rPr>
+        <w:lastRenderedPageBreak/>
+        <w:t>9. Make all the prediction cards globally have the same features. And make</w:t>
+      </w:r>
+      <w:r>
+        <w:rPr>
+          <w:rFonts w:ascii="Times New Roman" w:eastAsia="Times New Roman" w:hAnsi="Times New Roman" w:cs="Times New Roman"/>
+          <w:kern w:val="0"/>
+          <w:lang w:eastAsia="en-GB"/>
+          <w14:ligatures w14:val="none"/>
+        </w:rPr>
+        <w:t xml:space="preserve"> sure</w:t>
+      </w:r>
+      <w:r>
+        <w:rPr>
+          <w:rFonts w:ascii="Times New Roman" w:eastAsia="Times New Roman" w:hAnsi="Times New Roman" w:cs="Times New Roman"/>
+          <w:kern w:val="0"/>
+          <w:lang w:eastAsia="en-GB"/>
+          <w14:ligatures w14:val="none"/>
+        </w:rPr>
+        <w:t xml:space="preserve"> each section in each prediction card has selectable choices for each section. Also showing the number of points earned for each selection, causing the amount of the total points for that card to change with each selection the users </w:t>
+      </w:r>
+      <w:proofErr w:type="gramStart"/>
+      <w:r>
+        <w:rPr>
+          <w:rFonts w:ascii="Times New Roman" w:eastAsia="Times New Roman" w:hAnsi="Times New Roman" w:cs="Times New Roman"/>
+          <w:kern w:val="0"/>
+          <w:lang w:eastAsia="en-GB"/>
+          <w14:ligatures w14:val="none"/>
+        </w:rPr>
+        <w:t>selects</w:t>
+      </w:r>
+      <w:proofErr w:type="gramEnd"/>
+      <w:r>
+        <w:rPr>
+          <w:rFonts w:ascii="Times New Roman" w:eastAsia="Times New Roman" w:hAnsi="Times New Roman" w:cs="Times New Roman"/>
+          <w:kern w:val="0"/>
+          <w:lang w:eastAsia="en-GB"/>
+          <w14:ligatures w14:val="none"/>
+        </w:rPr>
+        <w:t xml:space="preserve"> based on the generated points system. (note; the points system should also factor into it the Vindicator </w:t>
+      </w:r>
+      <w:proofErr w:type="spellStart"/>
+      <w:r>
+        <w:rPr>
+          <w:rFonts w:ascii="Times New Roman" w:eastAsia="Times New Roman" w:hAnsi="Times New Roman" w:cs="Times New Roman"/>
+          <w:kern w:val="0"/>
+          <w:lang w:eastAsia="en-GB"/>
+          <w14:ligatures w14:val="none"/>
+        </w:rPr>
+        <w:t>Scoreline</w:t>
+      </w:r>
+      <w:proofErr w:type="spellEnd"/>
+      <w:r>
+        <w:rPr>
+          <w:rFonts w:ascii="Times New Roman" w:eastAsia="Times New Roman" w:hAnsi="Times New Roman" w:cs="Times New Roman"/>
+          <w:kern w:val="0"/>
+          <w:lang w:eastAsia="en-GB"/>
+          <w14:ligatures w14:val="none"/>
+        </w:rPr>
+        <w:t xml:space="preserve"> numbers to either generate a bonus total if the bet wins (full house) or to generate deduction points if the bet loses with 3 or more selections</w:t>
+      </w:r>
+      <w:r>
+        <w:rPr>
+          <w:rFonts w:ascii="Times New Roman" w:eastAsia="Times New Roman" w:hAnsi="Times New Roman" w:cs="Times New Roman"/>
+          <w:kern w:val="0"/>
+          <w:lang w:eastAsia="en-GB"/>
+          <w14:ligatures w14:val="none"/>
+        </w:rPr>
+        <w:t xml:space="preserve"> </w:t>
+      </w:r>
+      <w:r>
+        <w:rPr>
+          <w:rFonts w:ascii="Times New Roman" w:eastAsia="Times New Roman" w:hAnsi="Times New Roman" w:cs="Times New Roman"/>
+          <w:kern w:val="0"/>
+          <w:lang w:eastAsia="en-GB"/>
+          <w14:ligatures w14:val="none"/>
+        </w:rPr>
+        <w:br/>
+      </w:r>
+      <w:r>
+        <w:rPr>
+          <w:rFonts w:ascii="Times New Roman" w:eastAsia="Times New Roman" w:hAnsi="Times New Roman" w:cs="Times New Roman"/>
+          <w:kern w:val="0"/>
+          <w:lang w:eastAsia="en-GB"/>
+          <w14:ligatures w14:val="none"/>
+        </w:rPr>
+        <w:t xml:space="preserve">(points can also be deducted if a user loses a bet </w:t>
+      </w:r>
+      <w:r>
+        <w:rPr>
+          <w:rFonts w:ascii="Times New Roman" w:eastAsia="Times New Roman" w:hAnsi="Times New Roman" w:cs="Times New Roman"/>
+          <w:kern w:val="0"/>
+          <w:lang w:eastAsia="en-GB"/>
+          <w14:ligatures w14:val="none"/>
+        </w:rPr>
+        <w:t xml:space="preserve">with less than 3 selections if the points tally up to a risk factor in the points system it will show a generated – red number for loss of points earning if you make the current selections or it can be a + green number showing it </w:t>
+      </w:r>
+      <w:r>
+        <w:rPr>
+          <w:rFonts w:ascii="Times New Roman" w:eastAsia="Times New Roman" w:hAnsi="Times New Roman" w:cs="Times New Roman"/>
+          <w:kern w:val="0"/>
+          <w:lang w:eastAsia="en-GB"/>
+          <w14:ligatures w14:val="none"/>
+        </w:rPr>
+        <w:t>can</w:t>
+      </w:r>
+      <w:r>
+        <w:rPr>
+          <w:rFonts w:ascii="Times New Roman" w:eastAsia="Times New Roman" w:hAnsi="Times New Roman" w:cs="Times New Roman"/>
+          <w:kern w:val="0"/>
+          <w:lang w:eastAsia="en-GB"/>
+          <w14:ligatures w14:val="none"/>
+        </w:rPr>
+        <w:t xml:space="preserve"> reward points</w:t>
+      </w:r>
+      <w:r>
+        <w:rPr>
+          <w:rFonts w:ascii="Times New Roman" w:eastAsia="Times New Roman" w:hAnsi="Times New Roman" w:cs="Times New Roman"/>
+          <w:kern w:val="0"/>
+          <w:lang w:eastAsia="en-GB"/>
+          <w14:ligatures w14:val="none"/>
+        </w:rPr>
+        <w:t xml:space="preserve"> if the bet wins). This is the system for the prediction game that I want to implement to this model.</w:t>
+      </w:r>
+      <w:r>
+        <w:rPr>
+          <w:rFonts w:ascii="Times New Roman" w:eastAsia="Times New Roman" w:hAnsi="Times New Roman" w:cs="Times New Roman"/>
+          <w:kern w:val="0"/>
+          <w:lang w:eastAsia="en-GB"/>
+          <w14:ligatures w14:val="none"/>
+        </w:rPr>
+        <w:br/>
+        <w:t xml:space="preserve">10. When </w:t>
+      </w:r>
+      <w:r>
+        <w:rPr>
+          <w:rFonts w:ascii="Times New Roman" w:eastAsia="Times New Roman" w:hAnsi="Times New Roman" w:cs="Times New Roman"/>
+          <w:kern w:val="0"/>
+          <w:lang w:eastAsia="en-GB"/>
+          <w14:ligatures w14:val="none"/>
+        </w:rPr>
+        <w:t>displaying</w:t>
+      </w:r>
+      <w:r>
+        <w:rPr>
+          <w:rFonts w:ascii="Times New Roman" w:eastAsia="Times New Roman" w:hAnsi="Times New Roman" w:cs="Times New Roman"/>
+          <w:kern w:val="0"/>
+          <w:lang w:eastAsia="en-GB"/>
+          <w14:ligatures w14:val="none"/>
+        </w:rPr>
+        <w:t xml:space="preserve"> the score/assist section, show all players </w:t>
+      </w:r>
+      <w:r>
+        <w:rPr>
+          <w:rFonts w:ascii="Times New Roman" w:eastAsia="Times New Roman" w:hAnsi="Times New Roman" w:cs="Times New Roman"/>
+          <w:kern w:val="0"/>
+          <w:lang w:eastAsia="en-GB"/>
+          <w14:ligatures w14:val="none"/>
+        </w:rPr>
+        <w:t xml:space="preserve">of the team in the lists </w:t>
+      </w:r>
+      <w:r>
+        <w:rPr>
+          <w:rFonts w:ascii="Times New Roman" w:eastAsia="Times New Roman" w:hAnsi="Times New Roman" w:cs="Times New Roman"/>
+          <w:kern w:val="0"/>
+          <w:lang w:eastAsia="en-GB"/>
+          <w14:ligatures w14:val="none"/>
+        </w:rPr>
+        <w:t xml:space="preserve">with the top preforming </w:t>
+      </w:r>
+      <w:r>
+        <w:rPr>
+          <w:rFonts w:ascii="Times New Roman" w:eastAsia="Times New Roman" w:hAnsi="Times New Roman" w:cs="Times New Roman"/>
+          <w:kern w:val="0"/>
+          <w:lang w:eastAsia="en-GB"/>
+          <w14:ligatures w14:val="none"/>
+        </w:rPr>
+        <w:t xml:space="preserve">of each column </w:t>
+      </w:r>
+      <w:r>
+        <w:rPr>
+          <w:rFonts w:ascii="Times New Roman" w:eastAsia="Times New Roman" w:hAnsi="Times New Roman" w:cs="Times New Roman"/>
+          <w:kern w:val="0"/>
+          <w:lang w:eastAsia="en-GB"/>
+          <w14:ligatures w14:val="none"/>
+        </w:rPr>
+        <w:t>players at the top of each column</w:t>
+      </w:r>
+      <w:r>
+        <w:rPr>
+          <w:rFonts w:ascii="Times New Roman" w:eastAsia="Times New Roman" w:hAnsi="Times New Roman" w:cs="Times New Roman"/>
+          <w:kern w:val="0"/>
+          <w:lang w:eastAsia="en-GB"/>
+          <w14:ligatures w14:val="none"/>
+        </w:rPr>
+        <w:t xml:space="preserve"> in descending order</w:t>
+      </w:r>
+      <w:r>
+        <w:rPr>
+          <w:rFonts w:ascii="Times New Roman" w:eastAsia="Times New Roman" w:hAnsi="Times New Roman" w:cs="Times New Roman"/>
+          <w:kern w:val="0"/>
+          <w:lang w:eastAsia="en-GB"/>
+          <w14:ligatures w14:val="none"/>
+        </w:rPr>
+        <w:t xml:space="preserve"> </w:t>
+      </w:r>
+      <w:r>
+        <w:rPr>
+          <w:rFonts w:ascii="Times New Roman" w:eastAsia="Times New Roman" w:hAnsi="Times New Roman" w:cs="Times New Roman"/>
+          <w:kern w:val="0"/>
+          <w:lang w:eastAsia="en-GB"/>
+          <w14:ligatures w14:val="none"/>
+        </w:rPr>
+        <w:t xml:space="preserve">in a split tally but also add a column for </w:t>
+      </w:r>
+      <w:r>
+        <w:rPr>
+          <w:rFonts w:ascii="Times New Roman" w:eastAsia="Times New Roman" w:hAnsi="Times New Roman" w:cs="Times New Roman"/>
+          <w:kern w:val="0"/>
+          <w:lang w:eastAsia="en-GB"/>
+          <w14:ligatures w14:val="none"/>
+        </w:rPr>
+        <w:t>passes</w:t>
+      </w:r>
+      <w:r>
+        <w:rPr>
+          <w:rFonts w:ascii="Times New Roman" w:eastAsia="Times New Roman" w:hAnsi="Times New Roman" w:cs="Times New Roman"/>
+          <w:kern w:val="0"/>
+          <w:lang w:eastAsia="en-GB"/>
+          <w14:ligatures w14:val="none"/>
+        </w:rPr>
+        <w:t>, tackles, yellow cards and red cards</w:t>
+      </w:r>
+      <w:r>
+        <w:rPr>
+          <w:rFonts w:ascii="Times New Roman" w:eastAsia="Times New Roman" w:hAnsi="Times New Roman" w:cs="Times New Roman"/>
+          <w:kern w:val="0"/>
+          <w:lang w:eastAsia="en-GB"/>
+          <w14:ligatures w14:val="none"/>
+        </w:rPr>
+        <w:t xml:space="preserve"> </w:t>
+      </w:r>
+      <w:r>
+        <w:rPr>
+          <w:rFonts w:ascii="Times New Roman" w:eastAsia="Times New Roman" w:hAnsi="Times New Roman" w:cs="Times New Roman"/>
+          <w:kern w:val="0"/>
+          <w:lang w:eastAsia="en-GB"/>
+          <w14:ligatures w14:val="none"/>
+        </w:rPr>
+        <w:t>to the tally</w:t>
+      </w:r>
+      <w:r>
+        <w:rPr>
+          <w:rFonts w:ascii="Times New Roman" w:eastAsia="Times New Roman" w:hAnsi="Times New Roman" w:cs="Times New Roman"/>
+          <w:kern w:val="0"/>
+          <w:lang w:eastAsia="en-GB"/>
+          <w14:ligatures w14:val="none"/>
+        </w:rPr>
+        <w:t xml:space="preserve"> with them all being selectable gaming bets</w:t>
+      </w:r>
+      <w:r>
+        <w:rPr>
+          <w:rFonts w:ascii="Times New Roman" w:eastAsia="Times New Roman" w:hAnsi="Times New Roman" w:cs="Times New Roman"/>
+          <w:kern w:val="0"/>
+          <w:lang w:eastAsia="en-GB"/>
+          <w14:ligatures w14:val="none"/>
+        </w:rPr>
+        <w:t xml:space="preserve">. </w:t>
+      </w:r>
+      <w:r>
+        <w:rPr>
+          <w:rFonts w:ascii="Times New Roman" w:eastAsia="Times New Roman" w:hAnsi="Times New Roman" w:cs="Times New Roman"/>
+          <w:kern w:val="0"/>
+          <w:lang w:eastAsia="en-GB"/>
+          <w14:ligatures w14:val="none"/>
+        </w:rPr>
+        <w:br/>
+      </w:r>
+      <w:r>
+        <w:rPr>
+          <w:rFonts w:ascii="Times New Roman" w:eastAsia="Times New Roman" w:hAnsi="Times New Roman" w:cs="Times New Roman"/>
+          <w:kern w:val="0"/>
+          <w:lang w:eastAsia="en-GB"/>
+          <w14:ligatures w14:val="none"/>
+        </w:rPr>
+        <w:t xml:space="preserve">Still show the current data </w:t>
+      </w:r>
+      <w:r>
+        <w:rPr>
+          <w:rFonts w:ascii="Times New Roman" w:eastAsia="Times New Roman" w:hAnsi="Times New Roman" w:cs="Times New Roman"/>
+          <w:kern w:val="0"/>
+          <w:lang w:eastAsia="en-GB"/>
+          <w14:ligatures w14:val="none"/>
+        </w:rPr>
+        <w:t xml:space="preserve">with the value </w:t>
+      </w:r>
+      <w:r>
+        <w:rPr>
+          <w:rFonts w:ascii="Times New Roman" w:eastAsia="Times New Roman" w:hAnsi="Times New Roman" w:cs="Times New Roman"/>
+          <w:kern w:val="0"/>
+          <w:lang w:eastAsia="en-GB"/>
+          <w14:ligatures w14:val="none"/>
+        </w:rPr>
+        <w:t xml:space="preserve">but place it a bit smaller </w:t>
+      </w:r>
+      <w:r>
+        <w:rPr>
+          <w:rFonts w:ascii="Times New Roman" w:eastAsia="Times New Roman" w:hAnsi="Times New Roman" w:cs="Times New Roman"/>
+          <w:kern w:val="0"/>
+          <w:lang w:eastAsia="en-GB"/>
+          <w14:ligatures w14:val="none"/>
+        </w:rPr>
+        <w:t xml:space="preserve">underneath player name and icon with the same style and colour of buttons and icons, in those columns. </w:t>
+      </w:r>
+      <w:r>
+        <w:rPr>
+          <w:rFonts w:ascii="Times New Roman" w:eastAsia="Times New Roman" w:hAnsi="Times New Roman" w:cs="Times New Roman"/>
+          <w:kern w:val="0"/>
+          <w:lang w:eastAsia="en-GB"/>
+          <w14:ligatures w14:val="none"/>
+        </w:rPr>
+        <w:t xml:space="preserve">Just show the </w:t>
+      </w:r>
+      <w:r>
+        <w:rPr>
+          <w:rFonts w:ascii="Times New Roman" w:eastAsia="Times New Roman" w:hAnsi="Times New Roman" w:cs="Times New Roman"/>
+          <w:kern w:val="0"/>
+          <w:lang w:eastAsia="en-GB"/>
+          <w14:ligatures w14:val="none"/>
+        </w:rPr>
+        <w:t xml:space="preserve">column </w:t>
+      </w:r>
+      <w:r>
+        <w:rPr>
+          <w:rFonts w:ascii="Times New Roman" w:eastAsia="Times New Roman" w:hAnsi="Times New Roman" w:cs="Times New Roman"/>
+          <w:kern w:val="0"/>
+          <w:lang w:eastAsia="en-GB"/>
+          <w14:ligatures w14:val="none"/>
+        </w:rPr>
+        <w:t xml:space="preserve">selections of </w:t>
+      </w:r>
+      <w:r>
+        <w:rPr>
+          <w:rFonts w:ascii="Times New Roman" w:eastAsia="Times New Roman" w:hAnsi="Times New Roman" w:cs="Times New Roman"/>
+          <w:kern w:val="0"/>
+          <w:lang w:eastAsia="en-GB"/>
+          <w14:ligatures w14:val="none"/>
+        </w:rPr>
+        <w:t>score</w:t>
+      </w:r>
+      <w:r>
+        <w:rPr>
+          <w:rFonts w:ascii="Times New Roman" w:eastAsia="Times New Roman" w:hAnsi="Times New Roman" w:cs="Times New Roman"/>
+          <w:kern w:val="0"/>
+          <w:lang w:eastAsia="en-GB"/>
+          <w14:ligatures w14:val="none"/>
+        </w:rPr>
+        <w:t>d</w:t>
+      </w:r>
+      <w:r>
+        <w:rPr>
+          <w:rFonts w:ascii="Times New Roman" w:eastAsia="Times New Roman" w:hAnsi="Times New Roman" w:cs="Times New Roman"/>
+          <w:kern w:val="0"/>
+          <w:lang w:eastAsia="en-GB"/>
+          <w14:ligatures w14:val="none"/>
+        </w:rPr>
+        <w:t>/assist</w:t>
+      </w:r>
+      <w:r>
+        <w:rPr>
+          <w:rFonts w:ascii="Times New Roman" w:eastAsia="Times New Roman" w:hAnsi="Times New Roman" w:cs="Times New Roman"/>
+          <w:kern w:val="0"/>
+          <w:lang w:eastAsia="en-GB"/>
+          <w14:ligatures w14:val="none"/>
+        </w:rPr>
+        <w:t>ed</w:t>
+      </w:r>
+      <w:r>
+        <w:rPr>
+          <w:rFonts w:ascii="Times New Roman" w:eastAsia="Times New Roman" w:hAnsi="Times New Roman" w:cs="Times New Roman"/>
+          <w:kern w:val="0"/>
+          <w:lang w:eastAsia="en-GB"/>
+          <w14:ligatures w14:val="none"/>
+        </w:rPr>
+        <w:t>/</w:t>
+      </w:r>
+      <w:r>
+        <w:rPr>
+          <w:rFonts w:ascii="Times New Roman" w:eastAsia="Times New Roman" w:hAnsi="Times New Roman" w:cs="Times New Roman"/>
+          <w:kern w:val="0"/>
+          <w:lang w:eastAsia="en-GB"/>
+          <w14:ligatures w14:val="none"/>
+        </w:rPr>
+        <w:t>n</w:t>
+      </w:r>
+      <w:r>
+        <w:rPr>
+          <w:rFonts w:ascii="Times New Roman" w:eastAsia="Times New Roman" w:hAnsi="Times New Roman" w:cs="Times New Roman"/>
+          <w:kern w:val="0"/>
+          <w:lang w:eastAsia="en-GB"/>
+          <w14:ligatures w14:val="none"/>
+        </w:rPr>
+        <w:t>either/</w:t>
+      </w:r>
+      <w:r>
+        <w:rPr>
+          <w:rFonts w:ascii="Times New Roman" w:eastAsia="Times New Roman" w:hAnsi="Times New Roman" w:cs="Times New Roman"/>
+          <w:kern w:val="0"/>
+          <w:lang w:eastAsia="en-GB"/>
+          <w14:ligatures w14:val="none"/>
+        </w:rPr>
+        <w:t>did not play</w:t>
+      </w:r>
+      <w:r>
+        <w:rPr>
+          <w:rFonts w:ascii="Times New Roman" w:eastAsia="Times New Roman" w:hAnsi="Times New Roman" w:cs="Times New Roman"/>
+          <w:kern w:val="0"/>
+          <w:lang w:eastAsia="en-GB"/>
+          <w14:ligatures w14:val="none"/>
+        </w:rPr>
+        <w:t>, passes, tackles, yellow cards and red cards</w:t>
+      </w:r>
+      <w:r>
+        <w:rPr>
+          <w:rFonts w:ascii="Times New Roman" w:eastAsia="Times New Roman" w:hAnsi="Times New Roman" w:cs="Times New Roman"/>
+          <w:kern w:val="0"/>
+          <w:lang w:eastAsia="en-GB"/>
+          <w14:ligatures w14:val="none"/>
+        </w:rPr>
+        <w:t xml:space="preserve"> (total number of each red and yellow cards in each column of each player for the current season).</w:t>
+      </w:r>
+      <w:r>
+        <w:rPr>
+          <w:rFonts w:ascii="Times New Roman" w:eastAsia="Times New Roman" w:hAnsi="Times New Roman" w:cs="Times New Roman"/>
+          <w:kern w:val="0"/>
+          <w:lang w:eastAsia="en-GB"/>
+          <w14:ligatures w14:val="none"/>
+        </w:rPr>
+        <w:t xml:space="preserve"> </w:t>
+      </w:r>
+      <w:r>
+        <w:rPr>
+          <w:rFonts w:ascii="Times New Roman" w:eastAsia="Times New Roman" w:hAnsi="Times New Roman" w:cs="Times New Roman"/>
+          <w:kern w:val="0"/>
+          <w:lang w:eastAsia="en-GB"/>
+          <w14:ligatures w14:val="none"/>
+        </w:rPr>
+        <w:t xml:space="preserve">Also </w:t>
+      </w:r>
+      <w:r>
+        <w:rPr>
+          <w:rFonts w:ascii="Times New Roman" w:eastAsia="Times New Roman" w:hAnsi="Times New Roman" w:cs="Times New Roman"/>
+          <w:kern w:val="0"/>
+          <w:lang w:eastAsia="en-GB"/>
+          <w14:ligatures w14:val="none"/>
+        </w:rPr>
+        <w:t>make sure to allocat</w:t>
+      </w:r>
+      <w:r>
+        <w:rPr>
+          <w:rFonts w:ascii="Times New Roman" w:eastAsia="Times New Roman" w:hAnsi="Times New Roman" w:cs="Times New Roman"/>
+          <w:kern w:val="0"/>
+          <w:lang w:eastAsia="en-GB"/>
+          <w14:ligatures w14:val="none"/>
+        </w:rPr>
+        <w:t xml:space="preserve">e </w:t>
+      </w:r>
+      <w:r>
+        <w:rPr>
+          <w:rFonts w:ascii="Times New Roman" w:eastAsia="Times New Roman" w:hAnsi="Times New Roman" w:cs="Times New Roman"/>
+          <w:kern w:val="0"/>
+          <w:lang w:eastAsia="en-GB"/>
+          <w14:ligatures w14:val="none"/>
+        </w:rPr>
+        <w:t>points to each selection accordingly showing how much you can win for each selection.</w:t>
+      </w:r>
+      <w:r>
+        <w:rPr>
+          <w:rFonts w:ascii="Times New Roman" w:eastAsia="Times New Roman" w:hAnsi="Times New Roman" w:cs="Times New Roman"/>
+          <w:kern w:val="0"/>
+          <w:lang w:eastAsia="en-GB"/>
+          <w14:ligatures w14:val="none"/>
+        </w:rPr>
+        <w:br/>
+      </w:r>
+      <w:r>
+        <w:rPr>
+          <w:rFonts w:ascii="Times New Roman" w:eastAsia="Times New Roman" w:hAnsi="Times New Roman" w:cs="Times New Roman"/>
+          <w:kern w:val="0"/>
+          <w:lang w:eastAsia="en-GB"/>
+          <w14:ligatures w14:val="none"/>
+        </w:rPr>
+        <w:t>(When the user places bets in this section, make sure the users can only be selective about their options. For example, if a user selects too many players this will flag the system to add a risk factor calculator</w:t>
+      </w:r>
+      <w:r>
+        <w:rPr>
+          <w:rFonts w:ascii="Times New Roman" w:eastAsia="Times New Roman" w:hAnsi="Times New Roman" w:cs="Times New Roman"/>
+          <w:kern w:val="0"/>
+          <w:lang w:eastAsia="en-GB"/>
+          <w14:ligatures w14:val="none"/>
+        </w:rPr>
+        <w:t xml:space="preserve"> in</w:t>
+      </w:r>
+      <w:r>
+        <w:rPr>
+          <w:rFonts w:ascii="Times New Roman" w:eastAsia="Times New Roman" w:hAnsi="Times New Roman" w:cs="Times New Roman"/>
+          <w:kern w:val="0"/>
+          <w:lang w:eastAsia="en-GB"/>
+          <w14:ligatures w14:val="none"/>
+        </w:rPr>
+        <w:t xml:space="preserve"> to the equation based on likelihood of those selections happening</w:t>
+      </w:r>
+      <w:r>
+        <w:rPr>
+          <w:rFonts w:ascii="Times New Roman" w:eastAsia="Times New Roman" w:hAnsi="Times New Roman" w:cs="Times New Roman"/>
+          <w:kern w:val="0"/>
+          <w:lang w:eastAsia="en-GB"/>
+          <w14:ligatures w14:val="none"/>
+        </w:rPr>
+        <w:t xml:space="preserve"> in conjunction with the odds for that selection.</w:t>
+      </w:r>
+      <w:r>
+        <w:rPr>
+          <w:rFonts w:ascii="Times New Roman" w:eastAsia="Times New Roman" w:hAnsi="Times New Roman" w:cs="Times New Roman"/>
+          <w:kern w:val="0"/>
+          <w:lang w:eastAsia="en-GB"/>
+          <w14:ligatures w14:val="none"/>
+        </w:rPr>
+        <w:br/>
+      </w:r>
+      <w:r>
+        <w:rPr>
+          <w:rFonts w:ascii="Times New Roman" w:eastAsia="Times New Roman" w:hAnsi="Times New Roman" w:cs="Times New Roman"/>
+          <w:kern w:val="0"/>
+          <w:lang w:eastAsia="en-GB"/>
+          <w14:ligatures w14:val="none"/>
+        </w:rPr>
+        <w:t xml:space="preserve">11. Keep the data of best odds - top 3 bookmakers but remove that section from each card and replace it with a selectable </w:t>
+      </w:r>
+    </w:p>
+    <w:p>
+      <w:pPr>
+        <w:spacing w:before="100" w:beforeAutospacing="1" w:after="100" w:afterAutospacing="1"/>
+        <w:rPr>
+          <w:rFonts w:ascii="Times New Roman" w:eastAsia="Times New Roman" w:hAnsi="Times New Roman" w:cs="Times New Roman"/>
+          <w:kern w:val="0"/>
+          <w:lang w:eastAsia="en-GB"/>
+          <w14:ligatures w14:val="none"/>
+        </w:rPr>
+      </w:pPr>
+      <w:r>
+        <w:rPr>
+          <w:rFonts w:ascii="Times New Roman" w:eastAsia="Times New Roman" w:hAnsi="Times New Roman" w:cs="Times New Roman"/>
+          <w:kern w:val="0"/>
+          <w:lang w:eastAsia="en-GB"/>
+          <w14:ligatures w14:val="none"/>
+        </w:rPr>
+        <w:t xml:space="preserve">12. show the date of the game day and the number of the </w:t>
+      </w:r>
+      <w:r>
+        <w:rPr>
+          <w:rFonts w:ascii="Times New Roman" w:eastAsia="Times New Roman" w:hAnsi="Times New Roman" w:cs="Times New Roman"/>
+          <w:kern w:val="0"/>
+          <w:lang w:eastAsia="en-GB"/>
+          <w14:ligatures w14:val="none"/>
+        </w:rPr>
+        <w:t>game week</w:t>
+      </w:r>
+      <w:r>
+        <w:rPr>
+          <w:rFonts w:ascii="Times New Roman" w:eastAsia="Times New Roman" w:hAnsi="Times New Roman" w:cs="Times New Roman"/>
+          <w:kern w:val="0"/>
+          <w:lang w:eastAsia="en-GB"/>
+          <w14:ligatures w14:val="none"/>
+        </w:rPr>
+        <w:t xml:space="preserve"> for each league this season doing the same for each season period. </w:t>
+      </w:r>
+      <w:r>
+        <w:rPr>
+          <w:rFonts w:ascii="Times New Roman" w:eastAsia="Times New Roman" w:hAnsi="Times New Roman" w:cs="Times New Roman"/>
+          <w:kern w:val="0"/>
+          <w:lang w:eastAsia="en-GB"/>
+          <w14:ligatures w14:val="none"/>
+        </w:rPr>
+        <w:br/>
+        <w:t>find all matches from the leagues selected for continuous updates.</w:t>
+      </w:r>
+      <w:r>
+        <w:rPr>
+          <w:rFonts w:ascii="Times New Roman" w:eastAsia="Times New Roman" w:hAnsi="Times New Roman" w:cs="Times New Roman"/>
+          <w:kern w:val="0"/>
+          <w:lang w:eastAsia="en-GB"/>
+          <w14:ligatures w14:val="none"/>
+        </w:rPr>
+        <w:br/>
+        <w:t>13. Use the filter section to</w:t>
+      </w:r>
+      <w:r>
+        <w:rPr>
+          <w:rFonts w:ascii="Times New Roman" w:eastAsia="Times New Roman" w:hAnsi="Times New Roman" w:cs="Times New Roman"/>
+          <w:kern w:val="0"/>
+          <w:lang w:eastAsia="en-GB"/>
+          <w14:ligatures w14:val="none"/>
+        </w:rPr>
+        <w:t xml:space="preserve"> filter each prediction card based on either by; default (normal viewing showing a star card with the best value at the top and the rest in order of league category and date and time of the card event time), </w:t>
+      </w:r>
+      <w:proofErr w:type="spellStart"/>
+      <w:r>
+        <w:rPr>
+          <w:rFonts w:ascii="Times New Roman" w:eastAsia="Times New Roman" w:hAnsi="Times New Roman" w:cs="Times New Roman"/>
+          <w:kern w:val="0"/>
+          <w:lang w:eastAsia="en-GB"/>
+          <w14:ligatures w14:val="none"/>
+        </w:rPr>
+        <w:t>Vendicator</w:t>
+      </w:r>
+      <w:proofErr w:type="spellEnd"/>
+      <w:r>
+        <w:rPr>
+          <w:rFonts w:ascii="Times New Roman" w:eastAsia="Times New Roman" w:hAnsi="Times New Roman" w:cs="Times New Roman"/>
+          <w:kern w:val="0"/>
+          <w:lang w:eastAsia="en-GB"/>
+          <w14:ligatures w14:val="none"/>
+        </w:rPr>
+        <w:t xml:space="preserve"> </w:t>
+      </w:r>
+      <w:proofErr w:type="spellStart"/>
+      <w:r>
+        <w:rPr>
+          <w:rFonts w:ascii="Times New Roman" w:eastAsia="Times New Roman" w:hAnsi="Times New Roman" w:cs="Times New Roman"/>
+          <w:kern w:val="0"/>
+          <w:lang w:eastAsia="en-GB"/>
+          <w14:ligatures w14:val="none"/>
+        </w:rPr>
+        <w:t>scoreline</w:t>
+      </w:r>
+      <w:proofErr w:type="spellEnd"/>
+      <w:r>
+        <w:rPr>
+          <w:rFonts w:ascii="Times New Roman" w:eastAsia="Times New Roman" w:hAnsi="Times New Roman" w:cs="Times New Roman"/>
+          <w:kern w:val="0"/>
+          <w:lang w:eastAsia="en-GB"/>
+          <w14:ligatures w14:val="none"/>
+        </w:rPr>
+        <w:t xml:space="preserve"> in ascending or descending order, by alphabetical order, date (showing cards only from either a certain gaming date week for the season or by date order).</w:t>
+      </w:r>
+      <w:r>
+        <w:rPr>
+          <w:rFonts w:ascii="Times New Roman" w:eastAsia="Times New Roman" w:hAnsi="Times New Roman" w:cs="Times New Roman"/>
+          <w:kern w:val="0"/>
+          <w:lang w:eastAsia="en-GB"/>
+          <w14:ligatures w14:val="none"/>
+        </w:rPr>
+        <w:br/>
+      </w:r>
+      <w:r>
+        <w:rPr>
+          <w:rFonts w:ascii="Times New Roman" w:eastAsia="Times New Roman" w:hAnsi="Times New Roman" w:cs="Times New Roman"/>
+          <w:kern w:val="0"/>
+          <w:lang w:eastAsia="en-GB"/>
+          <w14:ligatures w14:val="none"/>
+        </w:rPr>
+        <w:t>14. When user clicks more fixtures at the bottom of the predictions list, make the next page be a grid view showing all the available cards for the next 3 days in a modern</w:t>
+      </w:r>
+      <w:r>
+        <w:rPr>
+          <w:rFonts w:ascii="Times New Roman" w:eastAsia="Times New Roman" w:hAnsi="Times New Roman" w:cs="Times New Roman"/>
+          <w:kern w:val="0"/>
+          <w:lang w:eastAsia="en-GB"/>
+          <w14:ligatures w14:val="none"/>
+        </w:rPr>
+        <w:t xml:space="preserve"> smooth grid style in sections of each own league, with the ability to click into each card to go the compare page for that card (include hover over brief info glass window over each card).</w:t>
+      </w:r>
+      <w:r>
+        <w:rPr>
+          <w:rFonts w:ascii="Times New Roman" w:eastAsia="Times New Roman" w:hAnsi="Times New Roman" w:cs="Times New Roman"/>
+          <w:kern w:val="0"/>
+          <w:lang w:eastAsia="en-GB"/>
+          <w14:ligatures w14:val="none"/>
+        </w:rPr>
+        <w:br/>
+        <w:t xml:space="preserve">This page will be called the </w:t>
+      </w:r>
+      <w:proofErr w:type="spellStart"/>
+      <w:r>
+        <w:rPr>
+          <w:rFonts w:ascii="Times New Roman" w:eastAsia="Times New Roman" w:hAnsi="Times New Roman" w:cs="Times New Roman"/>
+          <w:kern w:val="0"/>
+          <w:lang w:eastAsia="en-GB"/>
+          <w14:ligatures w14:val="none"/>
+        </w:rPr>
+        <w:t>CardGrid</w:t>
+      </w:r>
+      <w:proofErr w:type="spellEnd"/>
+      <w:r>
+        <w:rPr>
+          <w:rFonts w:ascii="Times New Roman" w:eastAsia="Times New Roman" w:hAnsi="Times New Roman" w:cs="Times New Roman"/>
+          <w:kern w:val="0"/>
+          <w:lang w:eastAsia="en-GB"/>
+          <w14:ligatures w14:val="none"/>
+        </w:rPr>
+        <w:t xml:space="preserve"> and its where cards will disappear when a bet starts if you haven’t selected it for live in-play bet gaming before the sports match starts.</w:t>
+      </w:r>
+      <w:r>
+        <w:rPr>
+          <w:rFonts w:ascii="Times New Roman" w:eastAsia="Times New Roman" w:hAnsi="Times New Roman" w:cs="Times New Roman"/>
+          <w:kern w:val="0"/>
+          <w:lang w:eastAsia="en-GB"/>
+          <w14:ligatures w14:val="none"/>
+        </w:rPr>
+        <w:br/>
+        <w:t>(the live in bet feature will only be available to higher tiered users and will be a feature implemented in the future, just make it available to be advertised as coming soon for now as an icon button).</w:t>
+      </w:r>
+      <w:r>
+        <w:rPr>
+          <w:rFonts w:ascii="Times New Roman" w:eastAsia="Times New Roman" w:hAnsi="Times New Roman" w:cs="Times New Roman"/>
+          <w:kern w:val="0"/>
+          <w:lang w:eastAsia="en-GB"/>
+          <w14:ligatures w14:val="none"/>
+        </w:rPr>
+        <w:br/>
+        <w:t xml:space="preserve">cards with the best odds will show more frequently for higher tiered paid subscribers and the card will shine a silver or gold colour based on your </w:t>
+      </w:r>
+      <w:r>
+        <w:rPr>
+          <w:rFonts w:ascii="Times New Roman" w:eastAsia="Times New Roman" w:hAnsi="Times New Roman" w:cs="Times New Roman"/>
+          <w:kern w:val="0"/>
+          <w:lang w:eastAsia="en-GB"/>
+          <w14:ligatures w14:val="none"/>
+        </w:rPr>
+        <w:t>tier</w:t>
+      </w:r>
+      <w:r>
+        <w:rPr>
+          <w:rFonts w:ascii="Times New Roman" w:eastAsia="Times New Roman" w:hAnsi="Times New Roman" w:cs="Times New Roman"/>
+          <w:kern w:val="0"/>
+          <w:lang w:eastAsia="en-GB"/>
+          <w14:ligatures w14:val="none"/>
+        </w:rPr>
+        <w:t xml:space="preserve">. </w:t>
+      </w:r>
+      <w:r>
+        <w:rPr>
+          <w:rFonts w:ascii="Times New Roman" w:eastAsia="Times New Roman" w:hAnsi="Times New Roman" w:cs="Times New Roman"/>
+          <w:kern w:val="0"/>
+          <w:lang w:eastAsia="en-GB"/>
+          <w14:ligatures w14:val="none"/>
+        </w:rPr>
+        <w:br/>
+      </w:r>
+      <w:r>
+        <w:rPr>
+          <w:rFonts w:ascii="Times New Roman" w:eastAsia="Times New Roman" w:hAnsi="Times New Roman" w:cs="Times New Roman"/>
+          <w:kern w:val="0"/>
+          <w:lang w:eastAsia="en-GB"/>
+          <w14:ligatures w14:val="none"/>
+        </w:rPr>
+        <w:t>15. When selecting a team to go</w:t>
+      </w:r>
+      <w:r>
+        <w:rPr>
+          <w:rFonts w:ascii="Times New Roman" w:eastAsia="Times New Roman" w:hAnsi="Times New Roman" w:cs="Times New Roman"/>
+          <w:kern w:val="0"/>
+          <w:lang w:eastAsia="en-GB"/>
+          <w14:ligatures w14:val="none"/>
+        </w:rPr>
+        <w:t xml:space="preserve"> to</w:t>
+      </w:r>
+      <w:r>
+        <w:rPr>
+          <w:rFonts w:ascii="Times New Roman" w:eastAsia="Times New Roman" w:hAnsi="Times New Roman" w:cs="Times New Roman"/>
+          <w:kern w:val="0"/>
+          <w:lang w:eastAsia="en-GB"/>
+          <w14:ligatures w14:val="none"/>
+        </w:rPr>
+        <w:t xml:space="preserve"> the </w:t>
+      </w:r>
+      <w:r>
+        <w:rPr>
+          <w:rFonts w:ascii="Times New Roman" w:eastAsia="Times New Roman" w:hAnsi="Times New Roman" w:cs="Times New Roman"/>
+          <w:kern w:val="0"/>
+          <w:lang w:eastAsia="en-GB"/>
+          <w14:ligatures w14:val="none"/>
+        </w:rPr>
+        <w:t>team page</w:t>
+      </w:r>
+      <w:r>
+        <w:rPr>
+          <w:rFonts w:ascii="Times New Roman" w:eastAsia="Times New Roman" w:hAnsi="Times New Roman" w:cs="Times New Roman"/>
+          <w:kern w:val="0"/>
+          <w:lang w:eastAsia="en-GB"/>
+          <w14:ligatures w14:val="none"/>
+        </w:rPr>
+        <w:t xml:space="preserve">, make the league table </w:t>
+      </w:r>
+      <w:r>
+        <w:rPr>
+          <w:rFonts w:ascii="Times New Roman" w:eastAsia="Times New Roman" w:hAnsi="Times New Roman" w:cs="Times New Roman"/>
+          <w:kern w:val="0"/>
+          <w:lang w:eastAsia="en-GB"/>
+          <w14:ligatures w14:val="none"/>
+        </w:rPr>
+        <w:t>richer</w:t>
+      </w:r>
+      <w:r>
+        <w:rPr>
+          <w:rFonts w:ascii="Times New Roman" w:eastAsia="Times New Roman" w:hAnsi="Times New Roman" w:cs="Times New Roman"/>
+          <w:kern w:val="0"/>
+          <w:lang w:eastAsia="en-GB"/>
+          <w14:ligatures w14:val="none"/>
+        </w:rPr>
+        <w:t xml:space="preserve"> with league table information</w:t>
+      </w:r>
+      <w:r>
+        <w:rPr>
+          <w:rFonts w:ascii="Times New Roman" w:eastAsia="Times New Roman" w:hAnsi="Times New Roman" w:cs="Times New Roman"/>
+          <w:kern w:val="0"/>
+          <w:lang w:eastAsia="en-GB"/>
+          <w14:ligatures w14:val="none"/>
+        </w:rPr>
+        <w:t xml:space="preserve"> (show things like who could be potentially going up or down the table with </w:t>
+      </w:r>
+      <w:r>
+        <w:rPr>
+          <w:rFonts w:ascii="Times New Roman" w:eastAsia="Times New Roman" w:hAnsi="Times New Roman" w:cs="Times New Roman"/>
+          <w:kern w:val="0"/>
+          <w:lang w:eastAsia="en-GB"/>
+          <w14:ligatures w14:val="none"/>
+        </w:rPr>
+        <w:lastRenderedPageBreak/>
+        <w:t>red and green arrows)</w:t>
+      </w:r>
+      <w:r>
+        <w:rPr>
+          <w:rFonts w:ascii="Times New Roman" w:eastAsia="Times New Roman" w:hAnsi="Times New Roman" w:cs="Times New Roman"/>
+          <w:kern w:val="0"/>
+          <w:lang w:eastAsia="en-GB"/>
+          <w14:ligatures w14:val="none"/>
+        </w:rPr>
+        <w:t xml:space="preserve"> and make </w:t>
+      </w:r>
+      <w:r>
+        <w:rPr>
+          <w:rFonts w:ascii="Times New Roman" w:eastAsia="Times New Roman" w:hAnsi="Times New Roman" w:cs="Times New Roman"/>
+          <w:kern w:val="0"/>
+          <w:lang w:eastAsia="en-GB"/>
+          <w14:ligatures w14:val="none"/>
+        </w:rPr>
+        <w:t xml:space="preserve">each </w:t>
+      </w:r>
+      <w:r>
+        <w:rPr>
+          <w:rFonts w:ascii="Times New Roman" w:eastAsia="Times New Roman" w:hAnsi="Times New Roman" w:cs="Times New Roman"/>
+          <w:kern w:val="0"/>
+          <w:lang w:eastAsia="en-GB"/>
+          <w14:ligatures w14:val="none"/>
+        </w:rPr>
+        <w:t xml:space="preserve">team </w:t>
+      </w:r>
+      <w:r>
+        <w:rPr>
+          <w:rFonts w:ascii="Times New Roman" w:eastAsia="Times New Roman" w:hAnsi="Times New Roman" w:cs="Times New Roman"/>
+          <w:kern w:val="0"/>
+          <w:lang w:eastAsia="en-GB"/>
+          <w14:ligatures w14:val="none"/>
+        </w:rPr>
+        <w:t>selectable</w:t>
+      </w:r>
+      <w:r>
+        <w:rPr>
+          <w:rFonts w:ascii="Times New Roman" w:eastAsia="Times New Roman" w:hAnsi="Times New Roman" w:cs="Times New Roman"/>
+          <w:kern w:val="0"/>
+          <w:lang w:eastAsia="en-GB"/>
+          <w14:ligatures w14:val="none"/>
+        </w:rPr>
+        <w:t xml:space="preserve"> to be able to go to their team page</w:t>
+      </w:r>
+      <w:r>
+        <w:rPr>
+          <w:rFonts w:ascii="Times New Roman" w:eastAsia="Times New Roman" w:hAnsi="Times New Roman" w:cs="Times New Roman"/>
+          <w:kern w:val="0"/>
+          <w:lang w:eastAsia="en-GB"/>
+          <w14:ligatures w14:val="none"/>
+        </w:rPr>
+        <w:t xml:space="preserve">. Also make a compare selection button on each team page so you can pick a team from that same league or </w:t>
+      </w:r>
+      <w:r>
+        <w:rPr>
+          <w:rFonts w:ascii="Times New Roman" w:eastAsia="Times New Roman" w:hAnsi="Times New Roman" w:cs="Times New Roman"/>
+          <w:kern w:val="0"/>
+          <w:lang w:eastAsia="en-GB"/>
+          <w14:ligatures w14:val="none"/>
+        </w:rPr>
+        <w:t>competition</w:t>
+      </w:r>
+      <w:r>
+        <w:rPr>
+          <w:rFonts w:ascii="Times New Roman" w:eastAsia="Times New Roman" w:hAnsi="Times New Roman" w:cs="Times New Roman"/>
+          <w:kern w:val="0"/>
+          <w:lang w:eastAsia="en-GB"/>
+          <w14:ligatures w14:val="none"/>
+        </w:rPr>
+        <w:t xml:space="preserve"> to compare and compare with other league teams for a description of who values more and the history of both teams compared generated by the system model</w:t>
+      </w:r>
+      <w:r>
+        <w:rPr>
+          <w:rFonts w:ascii="Times New Roman" w:eastAsia="Times New Roman" w:hAnsi="Times New Roman" w:cs="Times New Roman"/>
+          <w:kern w:val="0"/>
+          <w:lang w:eastAsia="en-GB"/>
+          <w14:ligatures w14:val="none"/>
+        </w:rPr>
+        <w:t xml:space="preserve"> (this can be done </w:t>
+      </w:r>
+      <w:r>
+        <w:rPr>
+          <w:rFonts w:ascii="Times New Roman" w:eastAsia="Times New Roman" w:hAnsi="Times New Roman" w:cs="Times New Roman"/>
+          <w:kern w:val="0"/>
+          <w:lang w:eastAsia="en-GB"/>
+          <w14:ligatures w14:val="none"/>
+        </w:rPr>
+        <w:t>for users to compare</w:t>
+      </w:r>
+      <w:r>
+        <w:rPr>
+          <w:rFonts w:ascii="Times New Roman" w:eastAsia="Times New Roman" w:hAnsi="Times New Roman" w:cs="Times New Roman"/>
+          <w:kern w:val="0"/>
+          <w:lang w:eastAsia="en-GB"/>
+          <w14:ligatures w14:val="none"/>
+        </w:rPr>
+        <w:t xml:space="preserve"> for future fixtures)</w:t>
+      </w:r>
+      <w:r>
+        <w:rPr>
+          <w:rFonts w:ascii="Times New Roman" w:eastAsia="Times New Roman" w:hAnsi="Times New Roman" w:cs="Times New Roman"/>
+          <w:kern w:val="0"/>
+          <w:lang w:eastAsia="en-GB"/>
+          <w14:ligatures w14:val="none"/>
+        </w:rPr>
+        <w:t>.</w:t>
+      </w:r>
+      <w:r>
+        <w:rPr>
+          <w:rFonts w:ascii="Times New Roman" w:eastAsia="Times New Roman" w:hAnsi="Times New Roman" w:cs="Times New Roman"/>
+          <w:kern w:val="0"/>
+          <w:lang w:eastAsia="en-GB"/>
+          <w14:ligatures w14:val="none"/>
+        </w:rPr>
+        <w:br/>
+        <w:t xml:space="preserve">16. Make the home logo selectable to go the main predictions page. Also make a button at the top to go to the </w:t>
+      </w:r>
+      <w:proofErr w:type="spellStart"/>
+      <w:r>
+        <w:rPr>
+          <w:rFonts w:ascii="Times New Roman" w:eastAsia="Times New Roman" w:hAnsi="Times New Roman" w:cs="Times New Roman"/>
+          <w:kern w:val="0"/>
+          <w:lang w:eastAsia="en-GB"/>
+          <w14:ligatures w14:val="none"/>
+        </w:rPr>
+        <w:t>CardGrid</w:t>
+      </w:r>
+      <w:proofErr w:type="spellEnd"/>
+      <w:r>
+        <w:rPr>
+          <w:rFonts w:ascii="Times New Roman" w:eastAsia="Times New Roman" w:hAnsi="Times New Roman" w:cs="Times New Roman"/>
+          <w:kern w:val="0"/>
+          <w:lang w:eastAsia="en-GB"/>
+          <w14:ligatures w14:val="none"/>
+        </w:rPr>
+        <w:t xml:space="preserve"> page</w:t>
+      </w:r>
+      <w:r>
+        <w:rPr>
+          <w:rFonts w:ascii="Times New Roman" w:eastAsia="Times New Roman" w:hAnsi="Times New Roman" w:cs="Times New Roman"/>
+          <w:kern w:val="0"/>
+          <w:lang w:eastAsia="en-GB"/>
+          <w14:ligatures w14:val="none"/>
+        </w:rPr>
+        <w:t xml:space="preserve"> </w:t>
+      </w:r>
+      <w:r>
+        <w:rPr>
+          <w:rFonts w:ascii="Times New Roman" w:eastAsia="Times New Roman" w:hAnsi="Times New Roman" w:cs="Times New Roman"/>
+          <w:kern w:val="0"/>
+          <w:lang w:eastAsia="en-GB"/>
+          <w14:ligatures w14:val="none"/>
+        </w:rPr>
+        <w:t>which is the main feature of this card and the button should be more of a mascot/icon to stand out and show fun professional gaming is ahead after clicking that button.</w:t>
       </w:r>
     </w:p>
     <w:sectPr>

</xml_diff>

<commit_message>
Add session transcript to PDF exporter
</commit_message>
<xml_diff>
--- a/Notes/Vindicator Business Notes Plan.docx
+++ b/Notes/Vindicator Business Notes Plan.docx
@@ -16,15 +16,7 @@
         <w:t>st</w:t>
       </w:r>
       <w:r>
-        <w:t xml:space="preserve"> </w:t>
-      </w:r>
-      <w:proofErr w:type="spellStart"/>
-      <w:r>
-        <w:t>claude</w:t>
-      </w:r>
-      <w:proofErr w:type="spellEnd"/>
-      <w:r>
-        <w:t xml:space="preserve"> Q:</w:t>
+        <w:t xml:space="preserve"> claude Q:</w:t>
       </w:r>
       <w:r>
         <w:br/>
@@ -45,15 +37,7 @@
         <w:t xml:space="preserve"> </w:t>
       </w:r>
       <w:r>
-        <w:t xml:space="preserve">I want to make a football betting and future score and bet prediction model to upload to my </w:t>
-      </w:r>
-      <w:proofErr w:type="spellStart"/>
-      <w:r>
-        <w:t>hostinger</w:t>
-      </w:r>
-      <w:proofErr w:type="spellEnd"/>
-      <w:r>
-        <w:t xml:space="preserve"> hosting. This model will feature both a system that will predict future football scores from all football leagues, with live updates but also feature a system where users can login and earn points to gain rewards. </w:t>
+        <w:t xml:space="preserve">I want to make a football betting and future score and bet prediction model to upload to my hostinger hosting. This model will feature both a system that will predict future football scores from all football leagues, with live updates but also feature a system where users can login and earn points to gain rewards. </w:t>
       </w:r>
     </w:p>
     <w:p>
@@ -61,47 +45,7 @@
         <w:pStyle w:val="NormalWeb"/>
       </w:pPr>
       <w:r>
-        <w:t xml:space="preserve">But first </w:t>
-      </w:r>
-      <w:proofErr w:type="spellStart"/>
-      <w:r>
-        <w:t>i</w:t>
-      </w:r>
-      <w:proofErr w:type="spellEnd"/>
-      <w:r>
-        <w:t xml:space="preserve"> want you to plan setup where </w:t>
-      </w:r>
-      <w:proofErr w:type="spellStart"/>
-      <w:r>
-        <w:t>i</w:t>
-      </w:r>
-      <w:proofErr w:type="spellEnd"/>
-      <w:r>
-        <w:t xml:space="preserve"> can use </w:t>
-      </w:r>
-      <w:proofErr w:type="spellStart"/>
-      <w:r>
-        <w:t>claude</w:t>
-      </w:r>
-      <w:proofErr w:type="spellEnd"/>
-      <w:r>
-        <w:t xml:space="preserve"> to push and pull git and upload all the models records to my local computer folder in the </w:t>
-      </w:r>
-      <w:proofErr w:type="spellStart"/>
-      <w:r>
-        <w:t>vidicator</w:t>
-      </w:r>
-      <w:proofErr w:type="spellEnd"/>
-      <w:r>
-        <w:t xml:space="preserve"> folder on my external SSD (without giving </w:t>
-      </w:r>
-      <w:proofErr w:type="spellStart"/>
-      <w:r>
-        <w:t>claude</w:t>
-      </w:r>
-      <w:proofErr w:type="spellEnd"/>
-      <w:r>
-        <w:t xml:space="preserve"> admin access to my computer files or admin abilities) via a document that records users accounts, rewards, invoices, a separate document that records all data from the model to keep history for improved football analysis.</w:t>
+        <w:t>But first i want you to plan setup where i can use claude to push and pull git and upload all the models records to my local computer folder in the vidicator folder on my external SSD (without giving claude admin access to my computer files or admin abilities) via a document that records users accounts, rewards, invoices, a separate document that records all data from the model to keep history for improved football analysis.</w:t>
       </w:r>
     </w:p>
     <w:p>
@@ -114,39 +58,7 @@
       </w:r>
       <w:proofErr w:type="gramEnd"/>
       <w:r>
-        <w:t xml:space="preserve"> to allow </w:t>
-      </w:r>
-      <w:proofErr w:type="spellStart"/>
-      <w:r>
-        <w:t>claude</w:t>
-      </w:r>
-      <w:proofErr w:type="spellEnd"/>
-      <w:r>
-        <w:t xml:space="preserve"> to upload this model as a final product to my staging website created in </w:t>
-      </w:r>
-      <w:proofErr w:type="spellStart"/>
-      <w:r>
-        <w:t>hostinger</w:t>
-      </w:r>
-      <w:proofErr w:type="spellEnd"/>
-      <w:r>
-        <w:t xml:space="preserve"> (https://forestgreen-gazelle-406881.hostingersite.com) via </w:t>
-      </w:r>
-      <w:proofErr w:type="spellStart"/>
-      <w:r>
-        <w:t>wordpress</w:t>
-      </w:r>
-      <w:proofErr w:type="spellEnd"/>
-      <w:r>
-        <w:t xml:space="preserve"> and </w:t>
-      </w:r>
-      <w:proofErr w:type="spellStart"/>
-      <w:r>
-        <w:t>novamira</w:t>
-      </w:r>
-      <w:proofErr w:type="spellEnd"/>
-      <w:r>
-        <w:t xml:space="preserve"> pro, which will build this website/model using bricks builder.</w:t>
+        <w:t xml:space="preserve"> to allow claude to upload this model as a final product to my staging website created in hostinger (https://forestgreen-gazelle-406881.hostingersite.com) via wordpress and novamira pro, which will build this website/model using bricks builder.</w:t>
       </w:r>
     </w:p>
     <w:p>
@@ -154,39 +66,7 @@
         <w:pStyle w:val="NormalWeb"/>
       </w:pPr>
       <w:r>
-        <w:t xml:space="preserve">I do not want </w:t>
-      </w:r>
-      <w:proofErr w:type="spellStart"/>
-      <w:r>
-        <w:t>claude</w:t>
-      </w:r>
-      <w:proofErr w:type="spellEnd"/>
-      <w:r>
-        <w:t xml:space="preserve"> to have any administrative access to my account on </w:t>
-      </w:r>
-      <w:proofErr w:type="spellStart"/>
-      <w:r>
-        <w:t>hostinger</w:t>
-      </w:r>
-      <w:proofErr w:type="spellEnd"/>
-      <w:r>
-        <w:t xml:space="preserve"> or </w:t>
-      </w:r>
-      <w:proofErr w:type="spellStart"/>
-      <w:r>
-        <w:t>wordpress</w:t>
-      </w:r>
-      <w:proofErr w:type="spellEnd"/>
-      <w:r>
-        <w:t xml:space="preserve">, instead create a separate user on </w:t>
-      </w:r>
-      <w:proofErr w:type="spellStart"/>
-      <w:r>
-        <w:t>wordpress</w:t>
-      </w:r>
-      <w:proofErr w:type="spellEnd"/>
-      <w:r>
-        <w:t xml:space="preserve"> with less permissions than an admin.</w:t>
+        <w:t>I do not want claude to have any administrative access to my account on hostinger or wordpress, instead create a separate user on wordpress with less permissions than an admin.</w:t>
       </w:r>
       <w:r>
         <w:br/>
@@ -207,23 +87,7 @@
         <w:t xml:space="preserve"> </w:t>
       </w:r>
       <w:r>
-        <w:t xml:space="preserve">1. I have created a private repo on my </w:t>
-      </w:r>
-      <w:proofErr w:type="spellStart"/>
-      <w:r>
-        <w:t>Igrafu</w:t>
-      </w:r>
-      <w:proofErr w:type="spellEnd"/>
-      <w:r>
-        <w:t xml:space="preserve"> </w:t>
-      </w:r>
-      <w:proofErr w:type="spellStart"/>
-      <w:r>
-        <w:t>github</w:t>
-      </w:r>
-      <w:proofErr w:type="spellEnd"/>
-      <w:r>
-        <w:t xml:space="preserve"> account. This is the token: </w:t>
+        <w:t xml:space="preserve">1. I have created a private repo on my Igrafu github account. This is the token: </w:t>
       </w:r>
     </w:p>
     <w:p>
@@ -242,23 +106,7 @@
         <w:t xml:space="preserve">2. </w:t>
       </w:r>
       <w:r>
-        <w:t xml:space="preserve">1. I have created a private repo on my </w:t>
-      </w:r>
-      <w:proofErr w:type="spellStart"/>
-      <w:r>
-        <w:t>Igrafu</w:t>
-      </w:r>
-      <w:proofErr w:type="spellEnd"/>
-      <w:r>
-        <w:t xml:space="preserve"> </w:t>
-      </w:r>
-      <w:proofErr w:type="spellStart"/>
-      <w:r>
-        <w:t>github</w:t>
-      </w:r>
-      <w:proofErr w:type="spellEnd"/>
-      <w:r>
-        <w:t xml:space="preserve"> account. This is the token: </w:t>
+        <w:t xml:space="preserve">1. I have created a private repo on my Igrafu github account. This is the token: </w:t>
       </w:r>
     </w:p>
     <w:p>
@@ -274,15 +122,7 @@
         <w:pStyle w:val="NormalWeb"/>
       </w:pPr>
       <w:r>
-        <w:t xml:space="preserve">2. Find the best 10 free and 5 best paid API football </w:t>
-      </w:r>
-      <w:proofErr w:type="spellStart"/>
-      <w:r>
-        <w:t>anaylsis</w:t>
-      </w:r>
-      <w:proofErr w:type="spellEnd"/>
-      <w:r>
-        <w:t xml:space="preserve">, live scores and data on match days and match predictions models that legitimately allows for data retrieving. Then ask me which to choose for basing my model off it. (also use websites such as </w:t>
+        <w:t xml:space="preserve">2. Find the best 10 free and 5 best paid API football anaylsis, live scores and data on match days and match predictions models that legitimately allows for data retrieving. Then ask me which to choose for basing my model off it. (also use websites such as </w:t>
       </w:r>
       <w:hyperlink r:id="rId5" w:tgtFrame="_blank" w:history="1">
         <w:r>
@@ -293,121 +133,15 @@
         </w:r>
       </w:hyperlink>
       <w:r>
-        <w:t xml:space="preserve">, </w:t>
-      </w:r>
-      <w:proofErr w:type="spellStart"/>
-      <w:r>
-        <w:t>FBref</w:t>
-      </w:r>
-      <w:proofErr w:type="spellEnd"/>
-      <w:r>
-        <w:t xml:space="preserve">, </w:t>
-      </w:r>
-      <w:proofErr w:type="spellStart"/>
-      <w:r>
-        <w:t>Sportradar</w:t>
-      </w:r>
-      <w:proofErr w:type="spellEnd"/>
-      <w:r>
-        <w:t xml:space="preserve">, </w:t>
-      </w:r>
-      <w:proofErr w:type="spellStart"/>
-      <w:r>
-        <w:t>Trasnfermarkt</w:t>
-      </w:r>
-      <w:proofErr w:type="spellEnd"/>
-      <w:r>
-        <w:t xml:space="preserve">, API-football, </w:t>
-      </w:r>
-      <w:proofErr w:type="spellStart"/>
-      <w:r>
-        <w:t>Sofascore</w:t>
-      </w:r>
-      <w:proofErr w:type="spellEnd"/>
-      <w:r>
-        <w:t xml:space="preserve">, </w:t>
-      </w:r>
-      <w:proofErr w:type="spellStart"/>
-      <w:r>
-        <w:t>FotMob</w:t>
-      </w:r>
-      <w:proofErr w:type="spellEnd"/>
-      <w:r>
-        <w:t xml:space="preserve">, Football-data (for logging historical data), </w:t>
-      </w:r>
-      <w:proofErr w:type="spellStart"/>
-      <w:r>
-        <w:t>understat</w:t>
-      </w:r>
-      <w:proofErr w:type="spellEnd"/>
-      <w:r>
-        <w:t xml:space="preserve">, bet365, </w:t>
-      </w:r>
-      <w:proofErr w:type="spellStart"/>
-      <w:r>
-        <w:t>betexplorer</w:t>
-      </w:r>
-      <w:proofErr w:type="spellEnd"/>
-      <w:r>
-        <w:t xml:space="preserve">, </w:t>
-      </w:r>
-      <w:proofErr w:type="spellStart"/>
-      <w:r>
-        <w:t>Opta</w:t>
-      </w:r>
-      <w:proofErr w:type="spellEnd"/>
-      <w:r>
-        <w:t xml:space="preserve"> analyst/ </w:t>
-      </w:r>
-      <w:proofErr w:type="spellStart"/>
-      <w:r>
-        <w:t>Opta</w:t>
-      </w:r>
-      <w:proofErr w:type="spellEnd"/>
-      <w:r>
-        <w:t xml:space="preserve"> supercomputer and </w:t>
-      </w:r>
-      <w:proofErr w:type="spellStart"/>
-      <w:r>
-        <w:t>betfair</w:t>
-      </w:r>
-      <w:proofErr w:type="spellEnd"/>
-      <w:r>
-        <w:t xml:space="preserve"> exchange to shape a modern looking football and betting prediction and game rewards model all in one with user accounts and a login system to build your own top 5 players and top 5 teams to compete for rewards against other users. think to user player profile pictures and </w:t>
-      </w:r>
-      <w:proofErr w:type="spellStart"/>
-      <w:r>
-        <w:t>mdoern</w:t>
-      </w:r>
-      <w:proofErr w:type="spellEnd"/>
-      <w:r>
-        <w:t xml:space="preserve"> looking icons and team badges.) I want you to find a better free alternative with a lot more data to retrieve and find another paid option that is best. If you </w:t>
-      </w:r>
-      <w:proofErr w:type="spellStart"/>
+        <w:t xml:space="preserve">, FBref, Sportradar, Trasnfermarkt, API-football, Sofascore, FotMob, Football-data (for logging historical data), understat, bet365, betexplorer, Opta analyst/ Opta supercomputer and betfair exchange to shape a modern looking football and betting prediction and game rewards model all in one with user accounts and a login system to build your own top 5 players and top 5 teams to compete for rewards against other users. think to user player profile pictures and mdoern looking icons and team badges.) I want you to find a better free alternative with a lot more data to retrieve and find another paid option that is best. If you </w:t>
+      </w:r>
       <w:proofErr w:type="gramStart"/>
       <w:r>
         <w:t>cant</w:t>
       </w:r>
-      <w:proofErr w:type="spellEnd"/>
       <w:proofErr w:type="gramEnd"/>
       <w:r>
-        <w:t xml:space="preserve"> find any better </w:t>
-      </w:r>
-      <w:proofErr w:type="spellStart"/>
-      <w:r>
-        <w:t>then</w:t>
-      </w:r>
-      <w:proofErr w:type="spellEnd"/>
-      <w:r>
-        <w:t xml:space="preserve"> this is my API-</w:t>
-      </w:r>
-      <w:proofErr w:type="spellStart"/>
-      <w:r>
-        <w:t>footbal</w:t>
-      </w:r>
-      <w:proofErr w:type="spellEnd"/>
-      <w:r>
-        <w:t xml:space="preserve"> key: 63b49a4c7ba9e997dad12f948f511b5b </w:t>
+        <w:t xml:space="preserve"> find any better then this is my API-footbal key: 63b49a4c7ba9e997dad12f948f511b5b </w:t>
       </w:r>
     </w:p>
     <w:p>
@@ -415,23 +149,7 @@
         <w:pStyle w:val="NormalWeb"/>
       </w:pPr>
       <w:r>
-        <w:t xml:space="preserve">3. In </w:t>
-      </w:r>
-      <w:proofErr w:type="spellStart"/>
-      <w:r>
-        <w:t>wordpress</w:t>
-      </w:r>
-      <w:proofErr w:type="spellEnd"/>
-      <w:r>
-        <w:t xml:space="preserve"> </w:t>
-      </w:r>
-      <w:proofErr w:type="spellStart"/>
-      <w:r>
-        <w:t>i</w:t>
-      </w:r>
-      <w:proofErr w:type="spellEnd"/>
-      <w:r>
-        <w:t xml:space="preserve"> have decided to give you admin privileges with this account: User is Claudio and the password is; &amp;!898jQ7*74UeYR%GMKM4nf5</w:t>
+        <w:t>3. In wordpress i have decided to give you admin privileges with this account: User is Claudio and the password is; &amp;!898jQ7*74UeYR%GMKM4nf5</w:t>
       </w:r>
     </w:p>
     <w:p>
@@ -444,23 +162,7 @@
       </w:pPr>
       <w:r>
         <w:lastRenderedPageBreak/>
-        <w:t xml:space="preserve">I created a </w:t>
-      </w:r>
-      <w:proofErr w:type="spellStart"/>
-      <w:r>
-        <w:t>hostinger</w:t>
-      </w:r>
-      <w:proofErr w:type="spellEnd"/>
-      <w:r>
-        <w:t xml:space="preserve"> ftp account for you to use to manage this project when needed and only on requests approved by me will this website be managed. These are ftp user login details: user is </w:t>
-      </w:r>
-      <w:proofErr w:type="spellStart"/>
-      <w:r>
-        <w:t>claudio</w:t>
-      </w:r>
-      <w:proofErr w:type="spellEnd"/>
-      <w:r>
-        <w:t xml:space="preserve"> and password is; Aktive01666</w:t>
+        <w:t>I created a hostinger ftp account for you to use to manage this project when needed and only on requests approved by me will this website be managed. These are ftp user login details: user is claudio and password is; Aktive01666</w:t>
       </w:r>
     </w:p>
     <w:p>
@@ -472,23 +174,7 @@
         </w:numPr>
       </w:pPr>
       <w:r>
-        <w:t xml:space="preserve">you now have admin access through the ftp account and admin user named </w:t>
-      </w:r>
-      <w:proofErr w:type="spellStart"/>
-      <w:r>
-        <w:t>claudio</w:t>
-      </w:r>
-      <w:proofErr w:type="spellEnd"/>
-      <w:r>
-        <w:t xml:space="preserve"> in </w:t>
-      </w:r>
-      <w:proofErr w:type="spellStart"/>
-      <w:r>
-        <w:t>wordpress</w:t>
-      </w:r>
-      <w:proofErr w:type="spellEnd"/>
-      <w:r>
-        <w:t xml:space="preserve">. </w:t>
+        <w:t xml:space="preserve">you now have admin access through the ftp account and admin user named claudio in wordpress. </w:t>
       </w:r>
       <w:proofErr w:type="gramStart"/>
       <w:r>
@@ -496,15 +182,7 @@
       </w:r>
       <w:proofErr w:type="gramEnd"/>
       <w:r>
-        <w:t xml:space="preserve"> you have </w:t>
-      </w:r>
-      <w:proofErr w:type="spellStart"/>
-      <w:r>
-        <w:t>novamira</w:t>
-      </w:r>
-      <w:proofErr w:type="spellEnd"/>
-      <w:r>
-        <w:t xml:space="preserve"> pro. </w:t>
+        <w:t xml:space="preserve"> you have novamira pro. </w:t>
       </w:r>
       <w:proofErr w:type="gramStart"/>
       <w:r>
@@ -512,15 +190,7 @@
       </w:r>
       <w:proofErr w:type="gramEnd"/>
       <w:r>
-        <w:t xml:space="preserve"> this is how </w:t>
-      </w:r>
-      <w:proofErr w:type="spellStart"/>
-      <w:r>
-        <w:t>i</w:t>
-      </w:r>
-      <w:proofErr w:type="spellEnd"/>
-      <w:r>
-        <w:t xml:space="preserve"> want the setup to generally work: Claude</w:t>
+        <w:t xml:space="preserve"> this is how i want the setup to generally work: Claude</w:t>
       </w:r>
     </w:p>
     <w:p>
@@ -537,11 +207,9 @@
         <w:pStyle w:val="NormalWeb"/>
         <w:ind w:left="720"/>
       </w:pPr>
-      <w:proofErr w:type="spellStart"/>
       <w:r>
         <w:t>Novamira</w:t>
       </w:r>
-      <w:proofErr w:type="spellEnd"/>
     </w:p>
     <w:p>
       <w:pPr>
@@ -666,13 +334,8 @@
         <w:ind w:left="720"/>
       </w:pPr>
       <w:r>
-        <w:t xml:space="preserve">Chrome </w:t>
-      </w:r>
-      <w:proofErr w:type="spellStart"/>
-      <w:r>
-        <w:t>DevTools</w:t>
-      </w:r>
-      <w:proofErr w:type="spellEnd"/>
+        <w:t>Chrome DevTools</w:t>
+      </w:r>
     </w:p>
     <w:p>
       <w:pPr>
@@ -743,45 +406,8 @@
         <w:pStyle w:val="NormalWeb"/>
         <w:ind w:left="720"/>
       </w:pPr>
-      <w:proofErr w:type="spellStart"/>
-      <w:r>
-        <w:t>Hostinger</w:t>
-      </w:r>
-      <w:proofErr w:type="spellEnd"/>
-      <w:r>
-        <w:t xml:space="preserve"> production ... I want it to basically work in that order and this means you will have to install playwright </w:t>
-      </w:r>
-      <w:proofErr w:type="spellStart"/>
-      <w:r>
-        <w:t>mcp</w:t>
-      </w:r>
-      <w:proofErr w:type="spellEnd"/>
-      <w:r>
-        <w:t xml:space="preserve"> and chrome </w:t>
-      </w:r>
-      <w:proofErr w:type="spellStart"/>
-      <w:r>
-        <w:t>devtools</w:t>
-      </w:r>
-      <w:proofErr w:type="spellEnd"/>
-      <w:r>
-        <w:t xml:space="preserve"> </w:t>
-      </w:r>
-      <w:proofErr w:type="spellStart"/>
-      <w:r>
-        <w:t>mcp</w:t>
-      </w:r>
-      <w:proofErr w:type="spellEnd"/>
-      <w:r>
-        <w:t xml:space="preserve"> for </w:t>
-      </w:r>
-      <w:proofErr w:type="spellStart"/>
-      <w:r>
-        <w:t>debuggin</w:t>
-      </w:r>
-      <w:proofErr w:type="spellEnd"/>
-      <w:r>
-        <w:t xml:space="preserve"> unless you suggest otherwise?</w:t>
+      <w:r>
+        <w:t>Hostinger production ... I want it to basically work in that order and this means you will have to install playwright mcp and chrome devtools mcp for debuggin unless you suggest otherwise?</w:t>
       </w:r>
     </w:p>
     <w:p>
@@ -793,23 +419,7 @@
         </w:numPr>
       </w:pPr>
       <w:r>
-        <w:t xml:space="preserve">Can we use this structure to plan the model first and generate a model and shows future updates with live data feeds and instant betting and football match score predictions in </w:t>
-      </w:r>
-      <w:proofErr w:type="spellStart"/>
-      <w:r>
-        <w:t>conjuction</w:t>
-      </w:r>
-      <w:proofErr w:type="spellEnd"/>
-      <w:r>
-        <w:t xml:space="preserve"> with live odds available to view before each game for all the leagues. Using only the lower leagues for lower </w:t>
-      </w:r>
-      <w:proofErr w:type="spellStart"/>
-      <w:r>
-        <w:t>teir</w:t>
-      </w:r>
-      <w:proofErr w:type="spellEnd"/>
-      <w:r>
-        <w:t xml:space="preserve"> members based on the ranking system that will be implemented.</w:t>
+        <w:t>Can we use this structure to plan the model first and generate a model and shows future updates with live data feeds and instant betting and football match score predictions in conjuction with live odds available to view before each game for all the leagues. Using only the lower leagues for lower teir members based on the ranking system that will be implemented.</w:t>
       </w:r>
     </w:p>
     <w:p>
@@ -829,39 +439,7 @@
       </w:r>
       <w:proofErr w:type="gramEnd"/>
       <w:r>
-        <w:t xml:space="preserve"> bookmaker suggestions, odds, timestamp, </w:t>
-      </w:r>
-      <w:proofErr w:type="spellStart"/>
-      <w:r>
-        <w:t>match_id</w:t>
-      </w:r>
-      <w:proofErr w:type="spellEnd"/>
-      <w:r>
-        <w:t xml:space="preserve">, market, double chance, top goal scorers, top </w:t>
-      </w:r>
-      <w:proofErr w:type="spellStart"/>
-      <w:r>
-        <w:t>asists</w:t>
-      </w:r>
-      <w:proofErr w:type="spellEnd"/>
-      <w:r>
-        <w:t xml:space="preserve">, over/under, handicaps, exact score, 1x2, </w:t>
-      </w:r>
-      <w:proofErr w:type="spellStart"/>
-      <w:r>
-        <w:t>xG</w:t>
-      </w:r>
-      <w:proofErr w:type="spellEnd"/>
-      <w:r>
-        <w:t xml:space="preserve"> etc. (</w:t>
-      </w:r>
-      <w:proofErr w:type="spellStart"/>
-      <w:r>
-        <w:t>Forebet</w:t>
-      </w:r>
-      <w:proofErr w:type="spellEnd"/>
-      <w:r>
-        <w:t xml:space="preserve"> is a good example for this but suggest better).</w:t>
+        <w:t xml:space="preserve"> bookmaker suggestions, odds, timestamp, match_id, market, double chance, top goal scorers, top asists, over/under, handicaps, exact score, 1x2, xG etc. (Forebet is a good example for this but suggest better).</w:t>
       </w:r>
     </w:p>
     <w:p>
@@ -893,47 +471,7 @@
         </w:numPr>
       </w:pPr>
       <w:r>
-        <w:t xml:space="preserve">look into modern models and reliable models to shape my model such as: Elo, </w:t>
-      </w:r>
-      <w:proofErr w:type="spellStart"/>
-      <w:r>
-        <w:t>OnThePitch</w:t>
-      </w:r>
-      <w:proofErr w:type="spellEnd"/>
-      <w:r>
-        <w:t xml:space="preserve">, </w:t>
-      </w:r>
-      <w:proofErr w:type="spellStart"/>
-      <w:r>
-        <w:t>Bucephus</w:t>
-      </w:r>
-      <w:proofErr w:type="spellEnd"/>
-      <w:r>
-        <w:t>, Dixon-</w:t>
-      </w:r>
-      <w:proofErr w:type="spellStart"/>
-      <w:r>
-        <w:t>coles</w:t>
-      </w:r>
-      <w:proofErr w:type="spellEnd"/>
-      <w:r>
-        <w:t xml:space="preserve"> Poisson, performance quality, machine learning (calibrated </w:t>
-      </w:r>
-      <w:proofErr w:type="spellStart"/>
-      <w:r>
-        <w:t>LightGBM</w:t>
-      </w:r>
-      <w:proofErr w:type="spellEnd"/>
-      <w:r>
-        <w:t>), de-</w:t>
-      </w:r>
-      <w:proofErr w:type="spellStart"/>
-      <w:r>
-        <w:t>vigged</w:t>
-      </w:r>
-      <w:proofErr w:type="spellEnd"/>
-      <w:r>
-        <w:t xml:space="preserve"> bookmaker</w:t>
+        <w:t>look into modern models and reliable models to shape my model such as: Elo, OnThePitch, Bucephus, Dixon-coles Poisson, performance quality, machine learning (calibrated LightGBM), de-vigged bookmaker</w:t>
       </w:r>
     </w:p>
     <w:p>
@@ -985,24 +523,17 @@
         <w:br/>
         <w:t xml:space="preserve">2. </w:t>
       </w:r>
-      <w:proofErr w:type="spellStart"/>
       <w:proofErr w:type="gramStart"/>
       <w:r>
         <w:t>accounts.json</w:t>
       </w:r>
-      <w:proofErr w:type="spellEnd"/>
       <w:proofErr w:type="gramEnd"/>
       <w:r>
         <w:t xml:space="preserve"> and </w:t>
       </w:r>
       <w:r>
-        <w:t>model-</w:t>
-      </w:r>
-      <w:proofErr w:type="spellStart"/>
-      <w:r>
-        <w:t>history.jsonl</w:t>
-      </w:r>
-      <w:proofErr w:type="spellEnd"/>
+        <w:t>model-history.jsonl</w:t>
+      </w:r>
       <w:r>
         <w:t xml:space="preserve"> I would these record files to be used and also converted into a viewable spreadsheet or pdf recorded file that can be viewed/read only not edited. But </w:t>
       </w:r>
@@ -1128,7 +659,6 @@
           <w14:ligatures w14:val="none"/>
         </w:rPr>
       </w:pPr>
-      <w:proofErr w:type="spellStart"/>
       <w:r>
         <w:rPr>
           <w:rFonts w:ascii="Times New Roman" w:eastAsia="Times New Roman" w:hAnsi="Times New Roman" w:cs="Times New Roman"/>
@@ -1138,9 +668,19 @@
           <w:lang w:eastAsia="en-GB"/>
           <w14:ligatures w14:val="none"/>
         </w:rPr>
-        <w:t>Opta</w:t>
-      </w:r>
-      <w:proofErr w:type="spellEnd"/>
+        <w:t>Opta/Sportmonks/Sportradar = data</w:t>
+      </w:r>
+    </w:p>
+    <w:p>
+      <w:pPr>
+        <w:spacing w:before="100" w:beforeAutospacing="1" w:after="100" w:afterAutospacing="1"/>
+        <w:rPr>
+          <w:rFonts w:ascii="Times New Roman" w:eastAsia="Times New Roman" w:hAnsi="Times New Roman" w:cs="Times New Roman"/>
+          <w:kern w:val="0"/>
+          <w:lang w:eastAsia="en-GB"/>
+          <w14:ligatures w14:val="none"/>
+        </w:rPr>
+      </w:pPr>
       <w:r>
         <w:rPr>
           <w:rFonts w:ascii="Times New Roman" w:eastAsia="Times New Roman" w:hAnsi="Times New Roman" w:cs="Times New Roman"/>
@@ -1150,9 +690,8 @@
           <w:lang w:eastAsia="en-GB"/>
           <w14:ligatures w14:val="none"/>
         </w:rPr>
-        <w:t>/</w:t>
-      </w:r>
-      <w:proofErr w:type="spellStart"/>
+        <w:t>Exchange/bookmaker feeds = market</w:t>
+      </w:r>
       <w:r>
         <w:rPr>
           <w:rFonts w:ascii="Times New Roman" w:eastAsia="Times New Roman" w:hAnsi="Times New Roman" w:cs="Times New Roman"/>
@@ -1162,75 +701,6 @@
           <w:lang w:eastAsia="en-GB"/>
           <w14:ligatures w14:val="none"/>
         </w:rPr>
-        <w:t>Sportmonks</w:t>
-      </w:r>
-      <w:proofErr w:type="spellEnd"/>
-      <w:r>
-        <w:rPr>
-          <w:rFonts w:ascii="Times New Roman" w:eastAsia="Times New Roman" w:hAnsi="Times New Roman" w:cs="Times New Roman"/>
-          <w:b/>
-          <w:bCs/>
-          <w:kern w:val="0"/>
-          <w:lang w:eastAsia="en-GB"/>
-          <w14:ligatures w14:val="none"/>
-        </w:rPr>
-        <w:t>/</w:t>
-      </w:r>
-      <w:proofErr w:type="spellStart"/>
-      <w:r>
-        <w:rPr>
-          <w:rFonts w:ascii="Times New Roman" w:eastAsia="Times New Roman" w:hAnsi="Times New Roman" w:cs="Times New Roman"/>
-          <w:b/>
-          <w:bCs/>
-          <w:kern w:val="0"/>
-          <w:lang w:eastAsia="en-GB"/>
-          <w14:ligatures w14:val="none"/>
-        </w:rPr>
-        <w:t>Sportradar</w:t>
-      </w:r>
-      <w:proofErr w:type="spellEnd"/>
-      <w:r>
-        <w:rPr>
-          <w:rFonts w:ascii="Times New Roman" w:eastAsia="Times New Roman" w:hAnsi="Times New Roman" w:cs="Times New Roman"/>
-          <w:b/>
-          <w:bCs/>
-          <w:kern w:val="0"/>
-          <w:lang w:eastAsia="en-GB"/>
-          <w14:ligatures w14:val="none"/>
-        </w:rPr>
-        <w:t xml:space="preserve"> = data</w:t>
-      </w:r>
-    </w:p>
-    <w:p>
-      <w:pPr>
-        <w:spacing w:before="100" w:beforeAutospacing="1" w:after="100" w:afterAutospacing="1"/>
-        <w:rPr>
-          <w:rFonts w:ascii="Times New Roman" w:eastAsia="Times New Roman" w:hAnsi="Times New Roman" w:cs="Times New Roman"/>
-          <w:kern w:val="0"/>
-          <w:lang w:eastAsia="en-GB"/>
-          <w14:ligatures w14:val="none"/>
-        </w:rPr>
-      </w:pPr>
-      <w:r>
-        <w:rPr>
-          <w:rFonts w:ascii="Times New Roman" w:eastAsia="Times New Roman" w:hAnsi="Times New Roman" w:cs="Times New Roman"/>
-          <w:b/>
-          <w:bCs/>
-          <w:kern w:val="0"/>
-          <w:lang w:eastAsia="en-GB"/>
-          <w14:ligatures w14:val="none"/>
-        </w:rPr>
-        <w:t>Exchange/bookmaker feeds = market</w:t>
-      </w:r>
-      <w:r>
-        <w:rPr>
-          <w:rFonts w:ascii="Times New Roman" w:eastAsia="Times New Roman" w:hAnsi="Times New Roman" w:cs="Times New Roman"/>
-          <w:b/>
-          <w:bCs/>
-          <w:kern w:val="0"/>
-          <w:lang w:eastAsia="en-GB"/>
-          <w14:ligatures w14:val="none"/>
-        </w:rPr>
         <w:br/>
       </w:r>
       <w:r>
@@ -1303,27 +773,7 @@
           <w:lang w:eastAsia="en-GB"/>
           <w14:ligatures w14:val="none"/>
         </w:rPr>
-        <w:t xml:space="preserve">d from: </w:t>
-      </w:r>
-      <w:proofErr w:type="spellStart"/>
-      <w:r>
-        <w:rPr>
-          <w:rFonts w:ascii="Times New Roman" w:eastAsia="Times New Roman" w:hAnsi="Times New Roman" w:cs="Times New Roman"/>
-          <w:kern w:val="0"/>
-          <w:lang w:eastAsia="en-GB"/>
-          <w14:ligatures w14:val="none"/>
-        </w:rPr>
-        <w:t>Sportradar</w:t>
-      </w:r>
-      <w:proofErr w:type="spellEnd"/>
-      <w:r>
-        <w:rPr>
-          <w:rFonts w:ascii="Times New Roman" w:eastAsia="Times New Roman" w:hAnsi="Times New Roman" w:cs="Times New Roman"/>
-          <w:kern w:val="0"/>
-          <w:lang w:eastAsia="en-GB"/>
-          <w14:ligatures w14:val="none"/>
-        </w:rPr>
-        <w:t xml:space="preserve"> and sport monks</w:t>
+        <w:t>d from: Sportradar and sport monks</w:t>
       </w:r>
       <w:r>
         <w:rPr>
@@ -1344,23 +794,7 @@
         <w:t xml:space="preserve"> + </w:t>
       </w:r>
       <w:r>
-        <w:t xml:space="preserve">football-data.org + </w:t>
-      </w:r>
-      <w:proofErr w:type="spellStart"/>
-      <w:r>
-        <w:t>OpenLigaDB</w:t>
-      </w:r>
-      <w:proofErr w:type="spellEnd"/>
-      <w:r>
-        <w:t xml:space="preserve"> + </w:t>
-      </w:r>
-      <w:proofErr w:type="spellStart"/>
-      <w:r>
-        <w:t>TheSportsDB</w:t>
-      </w:r>
-      <w:proofErr w:type="spellEnd"/>
-      <w:r>
-        <w:t xml:space="preserve"> → Python Elo/Dixon-Coles</w:t>
+        <w:t>football-data.org + OpenLigaDB + TheSportsDB → Python Elo/Dixon-Coles</w:t>
       </w:r>
       <w:r>
         <w:br/>
@@ -1369,19 +803,9 @@
         <w:lastRenderedPageBreak/>
         <w:t xml:space="preserve">Then make a prediction system like: </w:t>
       </w:r>
-      <w:proofErr w:type="spellStart"/>
-      <w:r>
-        <w:t>xG</w:t>
-      </w:r>
-      <w:proofErr w:type="spellEnd"/>
-      <w:r>
-        <w:t xml:space="preserve">/data +injuries + </w:t>
-      </w:r>
-      <w:proofErr w:type="spellStart"/>
-      <w:r>
-        <w:t>lineups</w:t>
-      </w:r>
-      <w:proofErr w:type="spellEnd"/>
+      <w:r>
+        <w:t>xG/data +injuries + lineups</w:t>
+      </w:r>
       <w:r>
         <w:br/>
       </w:r>
@@ -1389,31 +813,7 @@
         <w:t xml:space="preserve">Which generates into a </w:t>
       </w:r>
       <w:r>
-        <w:t>prediction engine: Elo, Dixon-</w:t>
-      </w:r>
-      <w:proofErr w:type="spellStart"/>
-      <w:r>
-        <w:t>coles</w:t>
-      </w:r>
-      <w:proofErr w:type="spellEnd"/>
-      <w:r>
-        <w:t xml:space="preserve">, </w:t>
-      </w:r>
-      <w:proofErr w:type="spellStart"/>
-      <w:r>
-        <w:t>poisson</w:t>
-      </w:r>
-      <w:proofErr w:type="spellEnd"/>
-      <w:r>
-        <w:t xml:space="preserve">, </w:t>
-      </w:r>
-      <w:proofErr w:type="spellStart"/>
-      <w:r>
-        <w:t>xG</w:t>
-      </w:r>
-      <w:proofErr w:type="spellEnd"/>
-      <w:r>
-        <w:t>, ML</w:t>
+        <w:t>prediction engine: Elo, Dixon-coles, poisson, xG, ML</w:t>
       </w:r>
       <w:r>
         <w:br/>
@@ -1422,23 +822,7 @@
         <w:t>Pulling m</w:t>
       </w:r>
       <w:r>
-        <w:t xml:space="preserve">arket data: </w:t>
-      </w:r>
-      <w:proofErr w:type="spellStart"/>
-      <w:r>
-        <w:t>sportradar</w:t>
-      </w:r>
-      <w:proofErr w:type="spellEnd"/>
-      <w:r>
-        <w:t xml:space="preserve"> + genius sports + </w:t>
-      </w:r>
-      <w:proofErr w:type="spellStart"/>
-      <w:r>
-        <w:t>Opta</w:t>
-      </w:r>
-      <w:proofErr w:type="spellEnd"/>
-      <w:r>
-        <w:t>/RB (if can retrieve legit data)</w:t>
+        <w:t>arket data: sportradar + genius sports + Opta/RB (if can retrieve legit data)</w:t>
       </w:r>
       <w:r>
         <w:rPr>
@@ -1504,25 +888,14 @@
         <w:br/>
         <w:t xml:space="preserve">5. </w:t>
       </w:r>
-      <w:proofErr w:type="spellStart"/>
-      <w:r>
-        <w:rPr>
-          <w:rFonts w:ascii="Times New Roman" w:eastAsia="Times New Roman" w:hAnsi="Times New Roman" w:cs="Times New Roman"/>
-          <w:kern w:val="0"/>
-          <w:lang w:eastAsia="en-GB"/>
-          <w14:ligatures w14:val="none"/>
-        </w:rPr>
-        <w:t>Opta</w:t>
-      </w:r>
-      <w:proofErr w:type="spellEnd"/>
-      <w:r>
-        <w:rPr>
-          <w:rFonts w:ascii="Times New Roman" w:eastAsia="Times New Roman" w:hAnsi="Times New Roman" w:cs="Times New Roman"/>
-          <w:kern w:val="0"/>
-          <w:lang w:eastAsia="en-GB"/>
-          <w14:ligatures w14:val="none"/>
-        </w:rPr>
-        <w:t xml:space="preserve"> Analyst Supercompute</w:t>
+      <w:r>
+        <w:rPr>
+          <w:rFonts w:ascii="Times New Roman" w:eastAsia="Times New Roman" w:hAnsi="Times New Roman" w:cs="Times New Roman"/>
+          <w:kern w:val="0"/>
+          <w:lang w:eastAsia="en-GB"/>
+          <w14:ligatures w14:val="none"/>
+        </w:rPr>
+        <w:t>Opta Analyst Supercompute</w:t>
       </w:r>
       <w:r>
         <w:rPr>
@@ -1631,47 +1004,7 @@
           <w14:ligatures w14:val="none"/>
         </w:rPr>
         <w:br/>
-        <w:t xml:space="preserve">Also use </w:t>
-      </w:r>
-      <w:proofErr w:type="spellStart"/>
-      <w:r>
-        <w:rPr>
-          <w:rFonts w:ascii="Times New Roman" w:eastAsia="Times New Roman" w:hAnsi="Times New Roman" w:cs="Times New Roman"/>
-          <w:kern w:val="0"/>
-          <w:lang w:eastAsia="en-GB"/>
-          <w14:ligatures w14:val="none"/>
-        </w:rPr>
-        <w:t>OnThePitch</w:t>
-      </w:r>
-      <w:proofErr w:type="spellEnd"/>
-      <w:r>
-        <w:rPr>
-          <w:rFonts w:ascii="Times New Roman" w:eastAsia="Times New Roman" w:hAnsi="Times New Roman" w:cs="Times New Roman"/>
-          <w:kern w:val="0"/>
-          <w:lang w:eastAsia="en-GB"/>
-          <w14:ligatures w14:val="none"/>
-        </w:rPr>
-        <w:t xml:space="preserve"> and </w:t>
-      </w:r>
-      <w:proofErr w:type="spellStart"/>
-      <w:r>
-        <w:rPr>
-          <w:rFonts w:ascii="Times New Roman" w:eastAsia="Times New Roman" w:hAnsi="Times New Roman" w:cs="Times New Roman"/>
-          <w:kern w:val="0"/>
-          <w:lang w:eastAsia="en-GB"/>
-          <w14:ligatures w14:val="none"/>
-        </w:rPr>
-        <w:t>Forebet</w:t>
-      </w:r>
-      <w:proofErr w:type="spellEnd"/>
-      <w:r>
-        <w:rPr>
-          <w:rFonts w:ascii="Times New Roman" w:eastAsia="Times New Roman" w:hAnsi="Times New Roman" w:cs="Times New Roman"/>
-          <w:kern w:val="0"/>
-          <w:lang w:eastAsia="en-GB"/>
-          <w14:ligatures w14:val="none"/>
-        </w:rPr>
-        <w:t xml:space="preserve"> for structure and data pulling where free and legit to do so.</w:t>
+        <w:t>Also use OnThePitch and Forebet for structure and data pulling where free and legit to do so.</w:t>
       </w:r>
       <w:r>
         <w:rPr>
@@ -1698,27 +1031,7 @@
           <w:lang w:eastAsia="en-GB"/>
           <w14:ligatures w14:val="none"/>
         </w:rPr>
-        <w:t xml:space="preserve">. So </w:t>
-      </w:r>
-      <w:proofErr w:type="spellStart"/>
-      <w:r>
-        <w:rPr>
-          <w:rFonts w:ascii="Times New Roman" w:eastAsia="Times New Roman" w:hAnsi="Times New Roman" w:cs="Times New Roman"/>
-          <w:kern w:val="0"/>
-          <w:lang w:eastAsia="en-GB"/>
-          <w14:ligatures w14:val="none"/>
-        </w:rPr>
-        <w:t>baiscially</w:t>
-      </w:r>
-      <w:proofErr w:type="spellEnd"/>
-      <w:r>
-        <w:rPr>
-          <w:rFonts w:ascii="Times New Roman" w:eastAsia="Times New Roman" w:hAnsi="Times New Roman" w:cs="Times New Roman"/>
-          <w:kern w:val="0"/>
-          <w:lang w:eastAsia="en-GB"/>
-          <w14:ligatures w14:val="none"/>
-        </w:rPr>
-        <w:t xml:space="preserve"> using this sort of model</w:t>
+        <w:t>. So baiscially using this sort of model</w:t>
       </w:r>
       <w:r>
         <w:rPr>
@@ -1781,27 +1094,7 @@
           <w:lang w:eastAsia="en-GB"/>
           <w14:ligatures w14:val="none"/>
         </w:rPr>
-        <w:t xml:space="preserve">scale) as the backbone + </w:t>
-      </w:r>
-      <w:proofErr w:type="spellStart"/>
-      <w:r>
-        <w:rPr>
-          <w:rFonts w:ascii="Times New Roman" w:eastAsia="Times New Roman" w:hAnsi="Times New Roman" w:cs="Times New Roman"/>
-          <w:kern w:val="0"/>
-          <w:lang w:eastAsia="en-GB"/>
-          <w14:ligatures w14:val="none"/>
-        </w:rPr>
-        <w:t>TheSportsDB</w:t>
-      </w:r>
-      <w:proofErr w:type="spellEnd"/>
-      <w:r>
-        <w:rPr>
-          <w:rFonts w:ascii="Times New Roman" w:eastAsia="Times New Roman" w:hAnsi="Times New Roman" w:cs="Times New Roman"/>
-          <w:kern w:val="0"/>
-          <w:lang w:eastAsia="en-GB"/>
-          <w14:ligatures w14:val="none"/>
-        </w:rPr>
-        <w:t xml:space="preserve"> for badges/player art + Football-Data.co.uk CSVs to train the models</w:t>
+        <w:t>scale) as the backbone + TheSportsDB for badges/player art + Football-Data.co.uk CSVs to train the models</w:t>
       </w:r>
       <w:r>
         <w:rPr>
@@ -1867,11 +1160,9 @@
       <w:r>
         <w:br/>
       </w:r>
-      <w:proofErr w:type="spellStart"/>
       <w:r>
         <w:t>LightGBM</w:t>
       </w:r>
-      <w:proofErr w:type="spellEnd"/>
     </w:p>
     <w:p>
       <w:pPr>
@@ -1881,11 +1172,9 @@
           <w:numId w:val="3"/>
         </w:numPr>
       </w:pPr>
-      <w:proofErr w:type="spellStart"/>
       <w:r>
         <w:t>XGBoost</w:t>
       </w:r>
-      <w:proofErr w:type="spellEnd"/>
     </w:p>
     <w:p>
       <w:pPr>
@@ -1895,11 +1184,9 @@
           <w:numId w:val="3"/>
         </w:numPr>
       </w:pPr>
-      <w:proofErr w:type="spellStart"/>
       <w:r>
         <w:t>CatBoost</w:t>
       </w:r>
-      <w:proofErr w:type="spellEnd"/>
     </w:p>
     <w:p>
       <w:pPr>
@@ -1933,13 +1220,8 @@
           <w:numId w:val="3"/>
         </w:numPr>
       </w:pPr>
-      <w:proofErr w:type="spellStart"/>
-      <w:r>
-        <w:t>xG</w:t>
-      </w:r>
-      <w:proofErr w:type="spellEnd"/>
-      <w:r>
-        <w:t xml:space="preserve"> model</w:t>
+      <w:r>
+        <w:t>xG model</w:t>
       </w:r>
     </w:p>
     <w:p>
@@ -2015,15 +1297,7 @@
         <w:t>Bayesian hierarchical models</w:t>
       </w:r>
       <w:r>
-        <w:t xml:space="preserve"> for uncertainty </w:t>
-      </w:r>
-      <w:proofErr w:type="spellStart"/>
-      <w:r>
-        <w:t>distrubutions</w:t>
-      </w:r>
-      <w:proofErr w:type="spellEnd"/>
-      <w:r>
-        <w:t xml:space="preserve"> for the rewards gaming system and probability.</w:t>
+        <w:t xml:space="preserve"> for uncertainty distrubutions for the rewards gaming system and probability.</w:t>
       </w:r>
       <w:r>
         <w:br/>
@@ -2032,13 +1306,8 @@
         <w:br/>
         <w:t xml:space="preserve">3. For live in play predictions think to use </w:t>
       </w:r>
-      <w:proofErr w:type="spellStart"/>
-      <w:r>
-        <w:t>use</w:t>
-      </w:r>
-      <w:proofErr w:type="spellEnd"/>
-      <w:r>
-        <w:t xml:space="preserve"> a </w:t>
+      <w:r>
+        <w:t xml:space="preserve">use a </w:t>
       </w:r>
       <w:r>
         <w:rPr>
@@ -2050,15 +1319,7 @@
         <w:t xml:space="preserve"> rather than a giant generic Transformer.</w:t>
       </w:r>
       <w:r>
-        <w:t xml:space="preserve"> This can be used for continuous updates for things such as; </w:t>
-      </w:r>
-      <w:proofErr w:type="spellStart"/>
-      <w:r>
-        <w:t>kickoff</w:t>
-      </w:r>
-      <w:proofErr w:type="spellEnd"/>
-      <w:r>
-        <w:t xml:space="preserve"> time, cards, substitutions, win probability, next goal probability, over/under probability, momentum state, expected final score etc.</w:t>
+        <w:t xml:space="preserve"> This can be used for continuous updates for things such as; kickoff time, cards, substitutions, win probability, next goal probability, over/under probability, momentum state, expected final score etc.</w:t>
       </w:r>
       <w:r>
         <w:br/>
@@ -2120,35 +1381,11 @@
       </w:r>
       <w:proofErr w:type="gramEnd"/>
       <w:r>
-        <w:t xml:space="preserve"> suited for things such as; what team the user likes most, what the user usually predicts, watch hat-</w:t>
-      </w:r>
-      <w:proofErr w:type="spellStart"/>
-      <w:r>
-        <w:t>rik</w:t>
-      </w:r>
-      <w:proofErr w:type="spellEnd"/>
-      <w:r>
-        <w:t xml:space="preserve"> match streak the user has. For it then calculate things such as; reward points (+50 for example), bonus points, double points for tonight’s match/game and </w:t>
-      </w:r>
-      <w:proofErr w:type="spellStart"/>
-      <w:r>
-        <w:t>leaderboard</w:t>
-      </w:r>
-      <w:proofErr w:type="spellEnd"/>
-      <w:r>
-        <w:t xml:space="preserve"> challenges in competition leagues.</w:t>
-      </w:r>
-      <w:r>
-        <w:br/>
-        <w:t xml:space="preserve">8. Use probability calibration, isotonic regression and/or </w:t>
-      </w:r>
-      <w:proofErr w:type="spellStart"/>
-      <w:r>
-        <w:t>platt</w:t>
-      </w:r>
-      <w:proofErr w:type="spellEnd"/>
-      <w:r>
-        <w:t xml:space="preserve"> scaling /logistic calibration on the ensemble output</w:t>
+        <w:t xml:space="preserve"> suited for things such as; what team the user likes most, what the user usually predicts, watch hat-rik match streak the user has. For it then calculate things such as; reward points (+50 for example), bonus points, double points for tonight’s match/game and leaderboard challenges in competition leagues.</w:t>
+      </w:r>
+      <w:r>
+        <w:br/>
+        <w:t>8. Use probability calibration, isotonic regression and/or platt scaling /logistic calibration on the ensemble output</w:t>
       </w:r>
       <w:r>
         <w:br/>
@@ -2299,7 +1536,6 @@
           <w14:ligatures w14:val="none"/>
         </w:rPr>
       </w:pPr>
-      <w:proofErr w:type="spellStart"/>
       <w:r>
         <w:rPr>
           <w:rFonts w:ascii="Courier New" w:eastAsia="Times New Roman" w:hAnsi="Courier New" w:cs="Courier New"/>
@@ -2309,19 +1545,7 @@
           <w:lang w:eastAsia="en-GB"/>
           <w14:ligatures w14:val="none"/>
         </w:rPr>
-        <w:t>xG</w:t>
-      </w:r>
-      <w:proofErr w:type="spellEnd"/>
-      <w:r>
-        <w:rPr>
-          <w:rFonts w:ascii="Courier New" w:eastAsia="Times New Roman" w:hAnsi="Courier New" w:cs="Courier New"/>
-          <w:kern w:val="0"/>
-          <w:sz w:val="20"/>
-          <w:szCs w:val="20"/>
-          <w:lang w:eastAsia="en-GB"/>
-          <w14:ligatures w14:val="none"/>
-        </w:rPr>
-        <w:t xml:space="preserve"> model        → 55%</w:t>
+        <w:t>xG model        → 55%</w:t>
       </w:r>
     </w:p>
     <w:p>
@@ -3177,27 +2401,7 @@
           <w:lang w:eastAsia="en-GB"/>
           <w14:ligatures w14:val="none"/>
         </w:rPr>
-        <w:t xml:space="preserve">                │ </w:t>
-      </w:r>
-      <w:proofErr w:type="spellStart"/>
-      <w:r>
-        <w:rPr>
-          <w:rFonts w:ascii="Times New Roman" w:eastAsia="Times New Roman" w:hAnsi="Times New Roman" w:cs="Times New Roman"/>
-          <w:kern w:val="0"/>
-          <w:lang w:eastAsia="en-GB"/>
-          <w14:ligatures w14:val="none"/>
-        </w:rPr>
-        <w:t>xG</w:t>
-      </w:r>
-      <w:proofErr w:type="spellEnd"/>
-      <w:r>
-        <w:rPr>
-          <w:rFonts w:ascii="Times New Roman" w:eastAsia="Times New Roman" w:hAnsi="Times New Roman" w:cs="Times New Roman"/>
-          <w:kern w:val="0"/>
-          <w:lang w:eastAsia="en-GB"/>
-          <w14:ligatures w14:val="none"/>
-        </w:rPr>
-        <w:t xml:space="preserve"> / form / etc. │</w:t>
+        <w:t xml:space="preserve">                │ xG / form / etc. │</w:t>
       </w:r>
     </w:p>
     <w:p>
@@ -4119,21 +3323,8 @@
                 <w:lang w:eastAsia="en-GB"/>
                 <w14:ligatures w14:val="none"/>
               </w:rPr>
-              <w:t xml:space="preserve">Polars + </w:t>
+              <w:t>Polars + DuckDB</w:t>
             </w:r>
-            <w:proofErr w:type="spellStart"/>
-            <w:r>
-              <w:rPr>
-                <w:rFonts w:ascii="Times New Roman" w:eastAsia="Times New Roman" w:hAnsi="Times New Roman" w:cs="Times New Roman"/>
-                <w:b/>
-                <w:bCs/>
-                <w:kern w:val="0"/>
-                <w:lang w:eastAsia="en-GB"/>
-                <w14:ligatures w14:val="none"/>
-              </w:rPr>
-              <w:t>DuckDB</w:t>
-            </w:r>
-            <w:proofErr w:type="spellEnd"/>
           </w:p>
         </w:tc>
       </w:tr>
@@ -4239,7 +3430,6 @@
                 <w14:ligatures w14:val="none"/>
               </w:rPr>
             </w:pPr>
-            <w:proofErr w:type="spellStart"/>
             <w:r>
               <w:rPr>
                 <w:rFonts w:ascii="Times New Roman" w:eastAsia="Times New Roman" w:hAnsi="Times New Roman" w:cs="Times New Roman"/>
@@ -4249,57 +3439,8 @@
                 <w:lang w:eastAsia="en-GB"/>
                 <w14:ligatures w14:val="none"/>
               </w:rPr>
-              <w:t>LightGBM</w:t>
+              <w:t>LightGBM + XGBoost + CatBoost</w:t>
             </w:r>
-            <w:proofErr w:type="spellEnd"/>
-            <w:r>
-              <w:rPr>
-                <w:rFonts w:ascii="Times New Roman" w:eastAsia="Times New Roman" w:hAnsi="Times New Roman" w:cs="Times New Roman"/>
-                <w:b/>
-                <w:bCs/>
-                <w:kern w:val="0"/>
-                <w:lang w:eastAsia="en-GB"/>
-                <w14:ligatures w14:val="none"/>
-              </w:rPr>
-              <w:t xml:space="preserve"> + </w:t>
-            </w:r>
-            <w:proofErr w:type="spellStart"/>
-            <w:r>
-              <w:rPr>
-                <w:rFonts w:ascii="Times New Roman" w:eastAsia="Times New Roman" w:hAnsi="Times New Roman" w:cs="Times New Roman"/>
-                <w:b/>
-                <w:bCs/>
-                <w:kern w:val="0"/>
-                <w:lang w:eastAsia="en-GB"/>
-                <w14:ligatures w14:val="none"/>
-              </w:rPr>
-              <w:t>XGBoost</w:t>
-            </w:r>
-            <w:proofErr w:type="spellEnd"/>
-            <w:r>
-              <w:rPr>
-                <w:rFonts w:ascii="Times New Roman" w:eastAsia="Times New Roman" w:hAnsi="Times New Roman" w:cs="Times New Roman"/>
-                <w:b/>
-                <w:bCs/>
-                <w:kern w:val="0"/>
-                <w:lang w:eastAsia="en-GB"/>
-                <w14:ligatures w14:val="none"/>
-              </w:rPr>
-              <w:t xml:space="preserve"> + </w:t>
-            </w:r>
-            <w:proofErr w:type="spellStart"/>
-            <w:r>
-              <w:rPr>
-                <w:rFonts w:ascii="Times New Roman" w:eastAsia="Times New Roman" w:hAnsi="Times New Roman" w:cs="Times New Roman"/>
-                <w:b/>
-                <w:bCs/>
-                <w:kern w:val="0"/>
-                <w:lang w:eastAsia="en-GB"/>
-                <w14:ligatures w14:val="none"/>
-              </w:rPr>
-              <w:t>CatBoost</w:t>
-            </w:r>
-            <w:proofErr w:type="spellEnd"/>
           </w:p>
         </w:tc>
       </w:tr>
@@ -5006,21 +4147,8 @@
                 <w:lang w:eastAsia="en-GB"/>
                 <w14:ligatures w14:val="none"/>
               </w:rPr>
-              <w:t>Kafka/</w:t>
+              <w:t>Kafka/Redpanda</w:t>
             </w:r>
-            <w:proofErr w:type="spellStart"/>
-            <w:r>
-              <w:rPr>
-                <w:rFonts w:ascii="Times New Roman" w:eastAsia="Times New Roman" w:hAnsi="Times New Roman" w:cs="Times New Roman"/>
-                <w:b/>
-                <w:bCs/>
-                <w:kern w:val="0"/>
-                <w:lang w:eastAsia="en-GB"/>
-                <w14:ligatures w14:val="none"/>
-              </w:rPr>
-              <w:t>Redpanda</w:t>
-            </w:r>
-            <w:proofErr w:type="spellEnd"/>
           </w:p>
         </w:tc>
       </w:tr>
@@ -5128,7 +4256,6 @@
                 <w14:ligatures w14:val="none"/>
               </w:rPr>
             </w:pPr>
-            <w:proofErr w:type="spellStart"/>
             <w:r>
               <w:rPr>
                 <w:rFonts w:ascii="Times New Roman" w:eastAsia="Times New Roman" w:hAnsi="Times New Roman" w:cs="Times New Roman"/>
@@ -5140,7 +4267,6 @@
               </w:rPr>
               <w:t>MLflow</w:t>
             </w:r>
-            <w:proofErr w:type="spellEnd"/>
           </w:p>
         </w:tc>
       </w:tr>
@@ -5189,7 +4315,6 @@
                 <w14:ligatures w14:val="none"/>
               </w:rPr>
             </w:pPr>
-            <w:proofErr w:type="spellStart"/>
             <w:r>
               <w:rPr>
                 <w:rFonts w:ascii="Times New Roman" w:eastAsia="Times New Roman" w:hAnsi="Times New Roman" w:cs="Times New Roman"/>
@@ -5199,19 +4324,7 @@
                 <w:lang w:eastAsia="en-GB"/>
                 <w14:ligatures w14:val="none"/>
               </w:rPr>
-              <w:t>FastAPI</w:t>
-            </w:r>
-            <w:proofErr w:type="spellEnd"/>
-            <w:r>
-              <w:rPr>
-                <w:rFonts w:ascii="Times New Roman" w:eastAsia="Times New Roman" w:hAnsi="Times New Roman" w:cs="Times New Roman"/>
-                <w:b/>
-                <w:bCs/>
-                <w:kern w:val="0"/>
-                <w:lang w:eastAsia="en-GB"/>
-                <w14:ligatures w14:val="none"/>
-              </w:rPr>
-              <w:t xml:space="preserve"> + ONNX/Triton where appropriate</w:t>
+              <w:t>FastAPI + ONNX/Triton where appropriate</w:t>
             </w:r>
           </w:p>
         </w:tc>
@@ -5270,21 +4383,8 @@
                 <w:lang w:eastAsia="en-GB"/>
                 <w14:ligatures w14:val="none"/>
               </w:rPr>
-              <w:t xml:space="preserve">PostgreSQL + </w:t>
+              <w:t>PostgreSQL + TimescaleDB</w:t>
             </w:r>
-            <w:proofErr w:type="spellStart"/>
-            <w:r>
-              <w:rPr>
-                <w:rFonts w:ascii="Times New Roman" w:eastAsia="Times New Roman" w:hAnsi="Times New Roman" w:cs="Times New Roman"/>
-                <w:b/>
-                <w:bCs/>
-                <w:kern w:val="0"/>
-                <w:lang w:eastAsia="en-GB"/>
-                <w14:ligatures w14:val="none"/>
-              </w:rPr>
-              <w:t>TimescaleDB</w:t>
-            </w:r>
-            <w:proofErr w:type="spellEnd"/>
           </w:p>
         </w:tc>
       </w:tr>
@@ -5352,7 +4452,6 @@
           <w14:ligatures w14:val="none"/>
         </w:rPr>
       </w:pPr>
-      <w:proofErr w:type="spellStart"/>
       <w:r>
         <w:rPr>
           <w:rFonts w:ascii="Times New Roman" w:eastAsia="Times New Roman" w:hAnsi="Times New Roman" w:cs="Times New Roman"/>
@@ -5362,67 +4461,7 @@
           <w:lang w:eastAsia="en-GB"/>
           <w14:ligatures w14:val="none"/>
         </w:rPr>
-        <w:t>LightGBM</w:t>
-      </w:r>
-      <w:proofErr w:type="spellEnd"/>
-      <w:r>
-        <w:rPr>
-          <w:rFonts w:ascii="Times New Roman" w:eastAsia="Times New Roman" w:hAnsi="Times New Roman" w:cs="Times New Roman"/>
-          <w:b/>
-          <w:bCs/>
-          <w:kern w:val="0"/>
-          <w:lang w:eastAsia="en-GB"/>
-          <w14:ligatures w14:val="none"/>
-        </w:rPr>
-        <w:t>/</w:t>
-      </w:r>
-      <w:proofErr w:type="spellStart"/>
-      <w:r>
-        <w:rPr>
-          <w:rFonts w:ascii="Times New Roman" w:eastAsia="Times New Roman" w:hAnsi="Times New Roman" w:cs="Times New Roman"/>
-          <w:b/>
-          <w:bCs/>
-          <w:kern w:val="0"/>
-          <w:lang w:eastAsia="en-GB"/>
-          <w14:ligatures w14:val="none"/>
-        </w:rPr>
-        <w:t>XGBoost</w:t>
-      </w:r>
-      <w:proofErr w:type="spellEnd"/>
-      <w:r>
-        <w:rPr>
-          <w:rFonts w:ascii="Times New Roman" w:eastAsia="Times New Roman" w:hAnsi="Times New Roman" w:cs="Times New Roman"/>
-          <w:b/>
-          <w:bCs/>
-          <w:kern w:val="0"/>
-          <w:lang w:eastAsia="en-GB"/>
-          <w14:ligatures w14:val="none"/>
-        </w:rPr>
-        <w:t>/</w:t>
-      </w:r>
-      <w:proofErr w:type="spellStart"/>
-      <w:r>
-        <w:rPr>
-          <w:rFonts w:ascii="Times New Roman" w:eastAsia="Times New Roman" w:hAnsi="Times New Roman" w:cs="Times New Roman"/>
-          <w:b/>
-          <w:bCs/>
-          <w:kern w:val="0"/>
-          <w:lang w:eastAsia="en-GB"/>
-          <w14:ligatures w14:val="none"/>
-        </w:rPr>
-        <w:t>CatBoost</w:t>
-      </w:r>
-      <w:proofErr w:type="spellEnd"/>
-      <w:r>
-        <w:rPr>
-          <w:rFonts w:ascii="Times New Roman" w:eastAsia="Times New Roman" w:hAnsi="Times New Roman" w:cs="Times New Roman"/>
-          <w:b/>
-          <w:bCs/>
-          <w:kern w:val="0"/>
-          <w:lang w:eastAsia="en-GB"/>
-          <w14:ligatures w14:val="none"/>
-        </w:rPr>
-        <w:t xml:space="preserve"> ensemble</w:t>
+        <w:t>LightGBM/XGBoost/CatBoost ensemble</w:t>
       </w:r>
     </w:p>
     <w:p>
@@ -5952,25 +4991,14 @@
           <w14:ligatures w14:val="none"/>
         </w:rPr>
       </w:pPr>
-      <w:proofErr w:type="spellStart"/>
-      <w:r>
-        <w:rPr>
-          <w:rFonts w:ascii="Times New Roman" w:eastAsia="Times New Roman" w:hAnsi="Times New Roman" w:cs="Times New Roman"/>
-          <w:kern w:val="0"/>
-          <w:lang w:eastAsia="en-GB"/>
-          <w14:ligatures w14:val="none"/>
-        </w:rPr>
-        <w:t>leaderboards</w:t>
-      </w:r>
-      <w:proofErr w:type="spellEnd"/>
-      <w:r>
-        <w:rPr>
-          <w:rFonts w:ascii="Times New Roman" w:eastAsia="Times New Roman" w:hAnsi="Times New Roman" w:cs="Times New Roman"/>
-          <w:kern w:val="0"/>
-          <w:lang w:eastAsia="en-GB"/>
-          <w14:ligatures w14:val="none"/>
-        </w:rPr>
-        <w:t xml:space="preserve"> </w:t>
+      <w:r>
+        <w:rPr>
+          <w:rFonts w:ascii="Times New Roman" w:eastAsia="Times New Roman" w:hAnsi="Times New Roman" w:cs="Times New Roman"/>
+          <w:kern w:val="0"/>
+          <w:lang w:eastAsia="en-GB"/>
+          <w14:ligatures w14:val="none"/>
+        </w:rPr>
+        <w:t xml:space="preserve">leaderboards </w:t>
       </w:r>
     </w:p>
     <w:p>
@@ -6127,61 +5155,8 @@
         <w:lastRenderedPageBreak/>
         <w:t xml:space="preserve">15. Think something like this as a stack: </w:t>
       </w:r>
-      <w:proofErr w:type="spellStart"/>
-      <w:r>
-        <w:t>Sportmonks</w:t>
-      </w:r>
-      <w:proofErr w:type="spellEnd"/>
-      <w:r>
-        <w:t>/</w:t>
-      </w:r>
-      <w:proofErr w:type="spellStart"/>
-      <w:r>
-        <w:t>Opta</w:t>
-      </w:r>
-      <w:proofErr w:type="spellEnd"/>
-      <w:r>
-        <w:t>/</w:t>
-      </w:r>
-      <w:proofErr w:type="spellStart"/>
-      <w:r>
-        <w:t>Sportradar</w:t>
-      </w:r>
-      <w:proofErr w:type="spellEnd"/>
-      <w:r>
-        <w:t xml:space="preserve"> data → Polars/</w:t>
-      </w:r>
-      <w:proofErr w:type="spellStart"/>
-      <w:r>
-        <w:t>DuckDB</w:t>
-      </w:r>
-      <w:proofErr w:type="spellEnd"/>
-      <w:r>
-        <w:t xml:space="preserve"> → </w:t>
-      </w:r>
-      <w:proofErr w:type="spellStart"/>
-      <w:r>
-        <w:t>XGBoost</w:t>
-      </w:r>
-      <w:proofErr w:type="spellEnd"/>
-      <w:r>
-        <w:t xml:space="preserve"> + </w:t>
-      </w:r>
-      <w:proofErr w:type="spellStart"/>
-      <w:r>
-        <w:t>LightGBM</w:t>
-      </w:r>
-      <w:proofErr w:type="spellEnd"/>
-      <w:r>
-        <w:t xml:space="preserve"> + </w:t>
-      </w:r>
-      <w:proofErr w:type="spellStart"/>
-      <w:r>
-        <w:t>CatBoost</w:t>
-      </w:r>
-      <w:proofErr w:type="spellEnd"/>
-      <w:r>
-        <w:t xml:space="preserve"> → Bayesian model → Transformer → GNN → calibrated stacking → Monte Carlo → contextual-bandit rewards → Claude interface.</w:t>
+      <w:r>
+        <w:t>Sportmonks/Opta/Sportradar data → Polars/DuckDB → XGBoost + LightGBM + CatBoost → Bayesian model → Transformer → GNN → calibrated stacking → Monte Carlo → contextual-bandit rewards → Claude interface.</w:t>
       </w:r>
     </w:p>
     <w:p>
@@ -6234,15 +5209,7 @@
         <w:t>btw</w:t>
       </w:r>
       <w:r>
-        <w:t xml:space="preserve"> can you make the design modern with global colours using SaaS style for any of the website entries and a clean coded design which is easy to edit with the styles (preferably with bricks if used for editing it) and </w:t>
-      </w:r>
-      <w:proofErr w:type="spellStart"/>
-      <w:r>
-        <w:t>divs</w:t>
-      </w:r>
-      <w:proofErr w:type="spellEnd"/>
-      <w:r>
-        <w:t xml:space="preserve"> and blocks where necessary. Use classes if needed to keep the structure tidy and able to modify each section easily. With headers and hear section able to change globally.</w:t>
+        <w:t xml:space="preserve"> can you make the design modern with global colours using SaaS style for any of the website entries and a clean coded design which is easy to edit with the styles (preferably with bricks if used for editing it) and divs and blocks where necessary. Use classes if needed to keep the structure tidy and able to modify each section easily. With headers and hear section able to change globally.</w:t>
       </w:r>
     </w:p>
     <w:p>
@@ -6290,31 +5257,7 @@
         <w:t xml:space="preserve"> </w:t>
       </w:r>
       <w:r>
-        <w:t>The stacked ensemble scores Brier 0.594 / log-loss 0.995 — better than every individual model, and the meta-learner correctly gave the de-</w:t>
-      </w:r>
-      <w:proofErr w:type="spellStart"/>
-      <w:r>
-        <w:t>vigged</w:t>
-      </w:r>
-      <w:proofErr w:type="spellEnd"/>
-      <w:r>
-        <w:t xml:space="preserve"> market the biggest trust weight (0.60). The market itself sits at 0.581, so we're ~1 Brier point behind the closing line using only free historical data. That's the expected starting position; the levers to close the gap are </w:t>
-      </w:r>
-      <w:proofErr w:type="spellStart"/>
-      <w:r>
-        <w:t>xG</w:t>
-      </w:r>
-      <w:proofErr w:type="spellEnd"/>
-      <w:r>
-        <w:t xml:space="preserve"> features, </w:t>
-      </w:r>
-      <w:proofErr w:type="spellStart"/>
-      <w:r>
-        <w:t>lineups</w:t>
-      </w:r>
-      <w:proofErr w:type="spellEnd"/>
-      <w:r>
-        <w:t>/injuries from API-Football, and the full GBM roster.</w:t>
+        <w:t>The stacked ensemble scores Brier 0.594 / log-loss 0.995 — better than every individual model, and the meta-learner correctly gave the de-vigged market the biggest trust weight (0.60). The market itself sits at 0.581, so we're ~1 Brier point behind the closing line using only free historical data. That's the expected starting position; the levers to close the gap are xG features, lineups/injuries from API-Football, and the full GBM roster.</w:t>
       </w:r>
       <w:r>
         <w:br/>
@@ -6322,57 +5265,17 @@
       </w:r>
       <w:r>
         <w:br/>
-        <w:t xml:space="preserve">5. Make the </w:t>
-      </w:r>
-      <w:proofErr w:type="spellStart"/>
-      <w:r>
-        <w:t>wordpress</w:t>
-      </w:r>
-      <w:proofErr w:type="spellEnd"/>
-      <w:r>
-        <w:t>/</w:t>
-      </w:r>
-      <w:proofErr w:type="spellStart"/>
-      <w:r>
-        <w:t>novamira</w:t>
-      </w:r>
-      <w:proofErr w:type="spellEnd"/>
-      <w:r>
-        <w:t xml:space="preserve"> connection active for this session.</w:t>
-      </w:r>
-      <w:r>
-        <w:br/>
-        <w:t xml:space="preserve">6. </w:t>
-      </w:r>
-      <w:proofErr w:type="spellStart"/>
-      <w:r>
-        <w:t>Im</w:t>
-      </w:r>
-      <w:proofErr w:type="spellEnd"/>
-      <w:r>
-        <w:t xml:space="preserve"> not ready to buy VPS hosting yet, can you find alternatives</w:t>
+        <w:t>5. Make the wordpress/novamira connection active for this session.</w:t>
+      </w:r>
+      <w:r>
+        <w:br/>
+        <w:t>6. Im not ready to buy VPS hosting yet, can you find alternatives</w:t>
       </w:r>
       <w:r>
         <w:t xml:space="preserve"> for: (</w:t>
       </w:r>
       <w:r>
-        <w:t xml:space="preserve">Kafka, Feast, </w:t>
-      </w:r>
-      <w:proofErr w:type="spellStart"/>
-      <w:r>
-        <w:t>MLflow</w:t>
-      </w:r>
-      <w:proofErr w:type="spellEnd"/>
-      <w:r>
-        <w:t xml:space="preserve">, PostgreSQL/Timescale, </w:t>
-      </w:r>
-      <w:proofErr w:type="spellStart"/>
-      <w:r>
-        <w:t>FastAPI</w:t>
-      </w:r>
-      <w:proofErr w:type="spellEnd"/>
-      <w:r>
-        <w:t xml:space="preserve"> serving</w:t>
+        <w:t>Kafka, Feast, MLflow, PostgreSQL/Timescale, FastAPI serving</w:t>
       </w:r>
       <w:r>
         <w:t>)</w:t>
@@ -6391,37 +5294,8 @@
         <w:t xml:space="preserve">7. This is the application password you requestion in bullet point 3 (WordPress) of your recommendations (user: Claudio): </w:t>
       </w:r>
       <w:r>
-        <w:t xml:space="preserve">XZFZ </w:t>
-      </w:r>
-      <w:proofErr w:type="spellStart"/>
-      <w:r>
-        <w:t>xuJx</w:t>
-      </w:r>
-      <w:proofErr w:type="spellEnd"/>
-      <w:r>
-        <w:t xml:space="preserve"> </w:t>
-      </w:r>
-      <w:proofErr w:type="spellStart"/>
-      <w:r>
-        <w:t>fdaB</w:t>
-      </w:r>
-      <w:proofErr w:type="spellEnd"/>
-      <w:r>
-        <w:t xml:space="preserve"> F68w </w:t>
-      </w:r>
-      <w:proofErr w:type="spellStart"/>
-      <w:r>
-        <w:t>PaSj</w:t>
-      </w:r>
-      <w:proofErr w:type="spellEnd"/>
-      <w:r>
-        <w:t xml:space="preserve"> </w:t>
-      </w:r>
-      <w:proofErr w:type="spellStart"/>
-      <w:r>
-        <w:t>BrJT</w:t>
-      </w:r>
-      <w:proofErr w:type="spellEnd"/>
+        <w:t>XZFZ xuJx fdaB F68w PaSj BrJT</w:t>
+      </w:r>
       <w:r>
         <w:br/>
         <w:t xml:space="preserve">8. Phase 2 bullet point 1; my answer is for you to find a free </w:t>
@@ -6483,7 +5357,6 @@
         <w:br/>
         <w:t xml:space="preserve">1. The name of the model is </w:t>
       </w:r>
-      <w:proofErr w:type="spellStart"/>
       <w:r>
         <w:rPr>
           <w:rFonts w:ascii="Times New Roman" w:eastAsia="Times New Roman" w:hAnsi="Times New Roman" w:cs="Times New Roman"/>
@@ -6500,47 +5373,17 @@
           <w:lang w:eastAsia="en-GB"/>
           <w14:ligatures w14:val="none"/>
         </w:rPr>
-        <w:t>ndicator</w:t>
-      </w:r>
-      <w:proofErr w:type="spellEnd"/>
-      <w:r>
-        <w:rPr>
-          <w:rFonts w:ascii="Times New Roman" w:eastAsia="Times New Roman" w:hAnsi="Times New Roman" w:cs="Times New Roman"/>
-          <w:kern w:val="0"/>
-          <w:lang w:eastAsia="en-GB"/>
-          <w14:ligatures w14:val="none"/>
-        </w:rPr>
-        <w:t xml:space="preserve"> not vindicator.</w:t>
-      </w:r>
-      <w:r>
-        <w:rPr>
-          <w:rFonts w:ascii="Times New Roman" w:eastAsia="Times New Roman" w:hAnsi="Times New Roman" w:cs="Times New Roman"/>
-          <w:kern w:val="0"/>
-          <w:lang w:eastAsia="en-GB"/>
-          <w14:ligatures w14:val="none"/>
-        </w:rPr>
-        <w:br/>
-        <w:t xml:space="preserve">2. Use more modern tone colours like </w:t>
-      </w:r>
-      <w:proofErr w:type="spellStart"/>
-      <w:r>
-        <w:rPr>
-          <w:rFonts w:ascii="Times New Roman" w:eastAsia="Times New Roman" w:hAnsi="Times New Roman" w:cs="Times New Roman"/>
-          <w:kern w:val="0"/>
-          <w:lang w:eastAsia="en-GB"/>
-          <w14:ligatures w14:val="none"/>
-        </w:rPr>
-        <w:t>patone</w:t>
-      </w:r>
-      <w:proofErr w:type="spellEnd"/>
-      <w:r>
-        <w:rPr>
-          <w:rFonts w:ascii="Times New Roman" w:eastAsia="Times New Roman" w:hAnsi="Times New Roman" w:cs="Times New Roman"/>
-          <w:kern w:val="0"/>
-          <w:lang w:eastAsia="en-GB"/>
-          <w14:ligatures w14:val="none"/>
-        </w:rPr>
-        <w:t xml:space="preserve"> and </w:t>
+        <w:t>ndicator not vindicator.</w:t>
+      </w:r>
+      <w:r>
+        <w:rPr>
+          <w:rFonts w:ascii="Times New Roman" w:eastAsia="Times New Roman" w:hAnsi="Times New Roman" w:cs="Times New Roman"/>
+          <w:kern w:val="0"/>
+          <w:lang w:eastAsia="en-GB"/>
+          <w14:ligatures w14:val="none"/>
+        </w:rPr>
+        <w:br/>
+        <w:t xml:space="preserve">2. Use more modern tone colours like patone and </w:t>
       </w:r>
       <w:r>
         <w:rPr>
@@ -6637,7 +5480,6 @@
         </w:rPr>
         <w:t xml:space="preserve"> (using the staging setup). Displaying the login screen with a signup option to access the model. Then create a system where the login credentials save to the </w:t>
       </w:r>
-      <w:proofErr w:type="spellStart"/>
       <w:proofErr w:type="gramStart"/>
       <w:r>
         <w:rPr>
@@ -6648,7 +5490,6 @@
         </w:rPr>
         <w:t>records.json</w:t>
       </w:r>
-      <w:proofErr w:type="spellEnd"/>
       <w:proofErr w:type="gramEnd"/>
       <w:r>
         <w:rPr>
@@ -6667,67 +5508,16 @@
           <w14:ligatures w14:val="none"/>
         </w:rPr>
         <w:br/>
-        <w:t xml:space="preserve">5. Complete this next step for the data pulling and </w:t>
-      </w:r>
-      <w:proofErr w:type="spellStart"/>
-      <w:r>
-        <w:rPr>
-          <w:rFonts w:ascii="Times New Roman" w:eastAsia="Times New Roman" w:hAnsi="Times New Roman" w:cs="Times New Roman"/>
-          <w:kern w:val="0"/>
-          <w:lang w:eastAsia="en-GB"/>
-          <w14:ligatures w14:val="none"/>
-        </w:rPr>
-        <w:t>intergration</w:t>
-      </w:r>
-      <w:proofErr w:type="spellEnd"/>
-      <w:r>
-        <w:rPr>
-          <w:rFonts w:ascii="Times New Roman" w:eastAsia="Times New Roman" w:hAnsi="Times New Roman" w:cs="Times New Roman"/>
-          <w:kern w:val="0"/>
-          <w:lang w:eastAsia="en-GB"/>
-          <w14:ligatures w14:val="none"/>
-        </w:rPr>
-        <w:t xml:space="preserve">: </w:t>
-      </w:r>
-      <w:proofErr w:type="spellStart"/>
-      <w:r>
-        <w:rPr>
-          <w:rFonts w:ascii="Times New Roman" w:eastAsia="Times New Roman" w:hAnsi="Times New Roman" w:cs="Times New Roman"/>
-          <w:kern w:val="0"/>
-          <w:lang w:eastAsia="en-GB"/>
-          <w14:ligatures w14:val="none"/>
-        </w:rPr>
-        <w:t>StatsBomb</w:t>
-      </w:r>
-      <w:proofErr w:type="spellEnd"/>
-      <w:r>
-        <w:rPr>
-          <w:rFonts w:ascii="Times New Roman" w:eastAsia="Times New Roman" w:hAnsi="Times New Roman" w:cs="Times New Roman"/>
-          <w:kern w:val="0"/>
-          <w:lang w:eastAsia="en-GB"/>
-          <w14:ligatures w14:val="none"/>
-        </w:rPr>
-        <w:t xml:space="preserve"> Open Data and API-Football injuries/</w:t>
-      </w:r>
-      <w:proofErr w:type="spellStart"/>
-      <w:r>
-        <w:rPr>
-          <w:rFonts w:ascii="Times New Roman" w:eastAsia="Times New Roman" w:hAnsi="Times New Roman" w:cs="Times New Roman"/>
-          <w:kern w:val="0"/>
-          <w:lang w:eastAsia="en-GB"/>
-          <w14:ligatures w14:val="none"/>
-        </w:rPr>
-        <w:t>lineups</w:t>
-      </w:r>
-      <w:proofErr w:type="spellEnd"/>
-      <w:r>
-        <w:rPr>
-          <w:rFonts w:ascii="Times New Roman" w:eastAsia="Times New Roman" w:hAnsi="Times New Roman" w:cs="Times New Roman"/>
-          <w:kern w:val="0"/>
-          <w:lang w:eastAsia="en-GB"/>
-          <w14:ligatures w14:val="none"/>
-        </w:rPr>
-        <w:t xml:space="preserve"> adapters are also in place for the next step</w:t>
+        <w:t xml:space="preserve">5. Complete this next step for the data pulling and intergration: </w:t>
+      </w:r>
+      <w:r>
+        <w:rPr>
+          <w:rFonts w:ascii="Times New Roman" w:eastAsia="Times New Roman" w:hAnsi="Times New Roman" w:cs="Times New Roman"/>
+          <w:kern w:val="0"/>
+          <w:lang w:eastAsia="en-GB"/>
+          <w14:ligatures w14:val="none"/>
+        </w:rPr>
+        <w:t>StatsBomb Open Data and API-Football injuries/lineups adapters are also in place for the next step</w:t>
       </w:r>
       <w:r>
         <w:rPr>
@@ -6774,47 +5564,7 @@
           <w:lang w:eastAsia="en-GB"/>
           <w14:ligatures w14:val="none"/>
         </w:rPr>
-        <w:t xml:space="preserve"> (but also find </w:t>
-      </w:r>
-      <w:proofErr w:type="spellStart"/>
-      <w:r>
-        <w:rPr>
-          <w:rFonts w:ascii="Times New Roman" w:eastAsia="Times New Roman" w:hAnsi="Times New Roman" w:cs="Times New Roman"/>
-          <w:kern w:val="0"/>
-          <w:lang w:eastAsia="en-GB"/>
-          <w14:ligatures w14:val="none"/>
-        </w:rPr>
-        <w:t>english</w:t>
-      </w:r>
-      <w:proofErr w:type="spellEnd"/>
-      <w:r>
-        <w:rPr>
-          <w:rFonts w:ascii="Times New Roman" w:eastAsia="Times New Roman" w:hAnsi="Times New Roman" w:cs="Times New Roman"/>
-          <w:kern w:val="0"/>
-          <w:lang w:eastAsia="en-GB"/>
-          <w14:ligatures w14:val="none"/>
-        </w:rPr>
-        <w:t xml:space="preserve"> championship, league 1, league 2 and champions league and </w:t>
-      </w:r>
-      <w:proofErr w:type="spellStart"/>
-      <w:r>
-        <w:rPr>
-          <w:rFonts w:ascii="Times New Roman" w:eastAsia="Times New Roman" w:hAnsi="Times New Roman" w:cs="Times New Roman"/>
-          <w:kern w:val="0"/>
-          <w:lang w:eastAsia="en-GB"/>
-          <w14:ligatures w14:val="none"/>
-        </w:rPr>
-        <w:t>uefa</w:t>
-      </w:r>
-      <w:proofErr w:type="spellEnd"/>
-      <w:r>
-        <w:rPr>
-          <w:rFonts w:ascii="Times New Roman" w:eastAsia="Times New Roman" w:hAnsi="Times New Roman" w:cs="Times New Roman"/>
-          <w:kern w:val="0"/>
-          <w:lang w:eastAsia="en-GB"/>
-          <w14:ligatures w14:val="none"/>
-        </w:rPr>
-        <w:t xml:space="preserve"> league free data source and historical data to use.</w:t>
+        <w:t xml:space="preserve"> (but also find english championship, league 1, league 2 and champions league and uefa league free data source and historical data to use.</w:t>
       </w:r>
       <w:r>
         <w:rPr>
@@ -6974,27 +5724,7 @@
           <w:lang w:eastAsia="en-GB"/>
           <w14:ligatures w14:val="none"/>
         </w:rPr>
-        <w:t xml:space="preserve">The temporal Transformer + GNN will be prototyped free on </w:t>
-      </w:r>
-      <w:proofErr w:type="spellStart"/>
-      <w:r>
-        <w:rPr>
-          <w:rFonts w:ascii="Times New Roman" w:eastAsia="Times New Roman" w:hAnsi="Times New Roman" w:cs="Times New Roman"/>
-          <w:kern w:val="0"/>
-          <w:lang w:eastAsia="en-GB"/>
-          <w14:ligatures w14:val="none"/>
-        </w:rPr>
-        <w:t>StatsBomb</w:t>
-      </w:r>
-      <w:proofErr w:type="spellEnd"/>
-      <w:r>
-        <w:rPr>
-          <w:rFonts w:ascii="Times New Roman" w:eastAsia="Times New Roman" w:hAnsi="Times New Roman" w:cs="Times New Roman"/>
-          <w:kern w:val="0"/>
-          <w:lang w:eastAsia="en-GB"/>
-          <w14:ligatures w14:val="none"/>
-        </w:rPr>
-        <w:t xml:space="preserve"> Open Data (adapter ready), and appear in the admin panel as an upgradable model option next to the others — switchable when you later buy an event feed and the trained models beat the analytic engine on live Brier.</w:t>
+        <w:t>The temporal Transformer + GNN will be prototyped free on StatsBomb Open Data (adapter ready), and appear in the admin panel as an upgradable model option next to the others — switchable when you later buy an event feed and the trained models beat the analytic engine on live Brier.</w:t>
       </w:r>
       <w:r>
         <w:rPr>
@@ -7013,47 +5743,7 @@
           <w:lang w:eastAsia="en-GB"/>
           <w14:ligatures w14:val="none"/>
         </w:rPr>
-        <w:t>Next step when you're ready: build the WordPress plugin (</w:t>
-      </w:r>
-      <w:proofErr w:type="spellStart"/>
-      <w:r>
-        <w:rPr>
-          <w:rFonts w:ascii="Times New Roman" w:eastAsia="Times New Roman" w:hAnsi="Times New Roman" w:cs="Times New Roman"/>
-          <w:kern w:val="0"/>
-          <w:lang w:eastAsia="en-GB"/>
-          <w14:ligatures w14:val="none"/>
-        </w:rPr>
-        <w:t>wp</w:t>
-      </w:r>
-      <w:proofErr w:type="spellEnd"/>
-      <w:r>
-        <w:rPr>
-          <w:rFonts w:ascii="Times New Roman" w:eastAsia="Times New Roman" w:hAnsi="Times New Roman" w:cs="Times New Roman"/>
-          <w:kern w:val="0"/>
-          <w:lang w:eastAsia="en-GB"/>
-          <w14:ligatures w14:val="none"/>
-        </w:rPr>
-        <w:t xml:space="preserve">-deploy/) with the admin model-selector dropdowns and the subscriptions/rewards integration, then the Bricks pages via </w:t>
-      </w:r>
-      <w:proofErr w:type="spellStart"/>
-      <w:r>
-        <w:rPr>
-          <w:rFonts w:ascii="Times New Roman" w:eastAsia="Times New Roman" w:hAnsi="Times New Roman" w:cs="Times New Roman"/>
-          <w:kern w:val="0"/>
-          <w:lang w:eastAsia="en-GB"/>
-          <w14:ligatures w14:val="none"/>
-        </w:rPr>
-        <w:t>NovaMira</w:t>
-      </w:r>
-      <w:proofErr w:type="spellEnd"/>
-      <w:r>
-        <w:rPr>
-          <w:rFonts w:ascii="Times New Roman" w:eastAsia="Times New Roman" w:hAnsi="Times New Roman" w:cs="Times New Roman"/>
-          <w:kern w:val="0"/>
-          <w:lang w:eastAsia="en-GB"/>
-          <w14:ligatures w14:val="none"/>
-        </w:rPr>
-        <w:t xml:space="preserve">. </w:t>
+        <w:t xml:space="preserve">Next step when you're ready: build the WordPress plugin (wp-deploy/) with the admin model-selector dropdowns and the subscriptions/rewards integration, then the Bricks pages via NovaMira. </w:t>
       </w:r>
     </w:p>
     <w:p>
@@ -7298,27 +5988,7 @@
           <w:lang w:eastAsia="en-GB"/>
           <w14:ligatures w14:val="none"/>
         </w:rPr>
-        <w:t xml:space="preserve"> 1.Rename yes rename on </w:t>
-      </w:r>
-      <w:proofErr w:type="spellStart"/>
-      <w:r>
-        <w:rPr>
-          <w:rFonts w:ascii="Times New Roman" w:eastAsia="Times New Roman" w:hAnsi="Times New Roman" w:cs="Times New Roman"/>
-          <w:kern w:val="0"/>
-          <w:lang w:eastAsia="en-GB"/>
-          <w14:ligatures w14:val="none"/>
-        </w:rPr>
-        <w:t>github</w:t>
-      </w:r>
-      <w:proofErr w:type="spellEnd"/>
-      <w:r>
-        <w:rPr>
-          <w:rFonts w:ascii="Times New Roman" w:eastAsia="Times New Roman" w:hAnsi="Times New Roman" w:cs="Times New Roman"/>
-          <w:kern w:val="0"/>
-          <w:lang w:eastAsia="en-GB"/>
-          <w14:ligatures w14:val="none"/>
-        </w:rPr>
-        <w:t xml:space="preserve"> to vindicator.</w:t>
+        <w:t xml:space="preserve"> 1.Rename yes rename on github to vindicator.</w:t>
       </w:r>
       <w:r>
         <w:rPr>
@@ -7423,27 +6093,7 @@
           <w:lang w:eastAsia="en-GB"/>
           <w14:ligatures w14:val="none"/>
         </w:rPr>
-        <w:t xml:space="preserve"> the league gap now depends mostly on the live injury/</w:t>
-      </w:r>
-      <w:proofErr w:type="spellStart"/>
-      <w:r>
-        <w:rPr>
-          <w:rFonts w:ascii="Times New Roman" w:eastAsia="Times New Roman" w:hAnsi="Times New Roman" w:cs="Times New Roman"/>
-          <w:kern w:val="0"/>
-          <w:lang w:eastAsia="en-GB"/>
-          <w14:ligatures w14:val="none"/>
-        </w:rPr>
-        <w:t>lineup</w:t>
-      </w:r>
-      <w:proofErr w:type="spellEnd"/>
-      <w:r>
-        <w:rPr>
-          <w:rFonts w:ascii="Times New Roman" w:eastAsia="Times New Roman" w:hAnsi="Times New Roman" w:cs="Times New Roman"/>
-          <w:kern w:val="0"/>
-          <w:lang w:eastAsia="en-GB"/>
-          <w14:ligatures w14:val="none"/>
-        </w:rPr>
-        <w:t xml:space="preserve"> signals feeding real predictions</w:t>
+        <w:t xml:space="preserve"> the league gap now depends mostly on the live injury/lineup signals feeding real predictions</w:t>
       </w:r>
       <w:r>
         <w:rPr>
@@ -7522,27 +6172,7 @@
           <w:lang w:eastAsia="en-GB"/>
           <w14:ligatures w14:val="none"/>
         </w:rPr>
-        <w:t>Everything's deployed to staging.vendicator.co.uk and pushed to git. Natural next steps when you're ready: schedule the daily pipeline + injury logger (</w:t>
-      </w:r>
-      <w:proofErr w:type="spellStart"/>
-      <w:r>
-        <w:rPr>
-          <w:rFonts w:ascii="Times New Roman" w:eastAsia="Times New Roman" w:hAnsi="Times New Roman" w:cs="Times New Roman"/>
-          <w:kern w:val="0"/>
-          <w:lang w:eastAsia="en-GB"/>
-          <w14:ligatures w14:val="none"/>
-        </w:rPr>
-        <w:t>cron</w:t>
-      </w:r>
-      <w:proofErr w:type="spellEnd"/>
-      <w:r>
-        <w:rPr>
-          <w:rFonts w:ascii="Times New Roman" w:eastAsia="Times New Roman" w:hAnsi="Times New Roman" w:cs="Times New Roman"/>
-          <w:kern w:val="0"/>
-          <w:lang w:eastAsia="en-GB"/>
-          <w14:ligatures w14:val="none"/>
-        </w:rPr>
-        <w:t xml:space="preserve">), settle real predictions as this weekend's fixtures finish so points start flowing, </w:t>
+        <w:t xml:space="preserve">Everything's deployed to staging.vendicator.co.uk and pushed to git. Natural next steps when you're ready: schedule the daily pipeline + injury logger (cron), settle real predictions as this weekend's fixtures finish so points start flowing, </w:t>
       </w:r>
       <w:r>
         <w:rPr>
@@ -7621,39 +6251,13 @@
       <w:r>
         <w:t xml:space="preserve">if data </w:t>
       </w:r>
-      <w:proofErr w:type="spellStart"/>
       <w:proofErr w:type="gramStart"/>
       <w:r>
         <w:t>cant</w:t>
       </w:r>
-      <w:proofErr w:type="spellEnd"/>
       <w:proofErr w:type="gramEnd"/>
       <w:r>
-        <w:t xml:space="preserve"> be pulled freely from </w:t>
-      </w:r>
-      <w:proofErr w:type="spellStart"/>
-      <w:r>
-        <w:t>opta</w:t>
-      </w:r>
-      <w:proofErr w:type="spellEnd"/>
-      <w:r>
-        <w:t xml:space="preserve"> and </w:t>
-      </w:r>
-      <w:proofErr w:type="spellStart"/>
-      <w:r>
-        <w:t>api</w:t>
-      </w:r>
-      <w:proofErr w:type="spellEnd"/>
-      <w:r>
-        <w:t xml:space="preserve">-football then make sure </w:t>
-      </w:r>
-      <w:proofErr w:type="spellStart"/>
-      <w:r>
-        <w:t>theres</w:t>
-      </w:r>
-      <w:proofErr w:type="spellEnd"/>
-      <w:r>
-        <w:t xml:space="preserve"> and option in the upgrading for the admin to add these in the future when ready.</w:t>
+        <w:t xml:space="preserve"> be pulled freely from opta and api-football then make sure theres and option in the upgrading for the admin to add these in the future when ready.</w:t>
       </w:r>
     </w:p>
     <w:p>
@@ -7681,23 +6285,7 @@
         <w:pStyle w:val="NormalWeb"/>
       </w:pPr>
       <w:r>
-        <w:t xml:space="preserve">1. in the predictions section change double chance section to </w:t>
-      </w:r>
-      <w:proofErr w:type="spellStart"/>
-      <w:r>
-        <w:t>xtotal</w:t>
-      </w:r>
-      <w:proofErr w:type="spellEnd"/>
-      <w:r>
-        <w:t xml:space="preserve"> alternative goals </w:t>
-      </w:r>
-      <w:proofErr w:type="spellStart"/>
-      <w:r>
-        <w:t>i.e</w:t>
-      </w:r>
-      <w:proofErr w:type="spellEnd"/>
-      <w:r>
-        <w:t xml:space="preserve"> 0, 1.5, 2.5 etc</w:t>
+        <w:t>1. in the predictions section change double chance section to xtotal alternative goals i.e 0, 1.5, 2.5 etc</w:t>
       </w:r>
       <w:r>
         <w:br/>
@@ -7747,15 +6335,7 @@
       </w:r>
       <w:r>
         <w:br/>
-        <w:t xml:space="preserve">7. Once a selection has been made, remove that current selection from the </w:t>
-      </w:r>
-      <w:proofErr w:type="spellStart"/>
-      <w:r>
-        <w:t>selctions</w:t>
-      </w:r>
-      <w:proofErr w:type="spellEnd"/>
-      <w:r>
-        <w:t xml:space="preserve"> page and log it.</w:t>
+        <w:t>7. Once a selection has been made, remove that current selection from the selctions page and log it.</w:t>
       </w:r>
       <w:r>
         <w:br/>
@@ -7814,19 +6394,8 @@
           <w:lang w:eastAsia="en-GB"/>
           <w14:ligatures w14:val="none"/>
         </w:rPr>
-        <w:t>ca</w:t>
-      </w:r>
-      <w:proofErr w:type="spellStart"/>
-      <w:r>
-        <w:rPr>
-          <w:rFonts w:ascii="Times New Roman" w:eastAsia="Times New Roman" w:hAnsi="Times New Roman" w:cs="Times New Roman"/>
-          <w:kern w:val="0"/>
-          <w:lang w:eastAsia="en-GB"/>
-          <w14:ligatures w14:val="none"/>
-        </w:rPr>
-        <w:t>nt</w:t>
-      </w:r>
-      <w:proofErr w:type="spellEnd"/>
+        <w:t>cant</w:t>
+      </w:r>
       <w:proofErr w:type="gramEnd"/>
       <w:r>
         <w:rPr>
@@ -7893,25 +6462,14 @@
         </w:rPr>
         <w:t xml:space="preserve"> the name of </w:t>
       </w:r>
-      <w:proofErr w:type="spellStart"/>
-      <w:r>
-        <w:rPr>
-          <w:rFonts w:ascii="Times New Roman" w:eastAsia="Times New Roman" w:hAnsi="Times New Roman" w:cs="Times New Roman"/>
-          <w:kern w:val="0"/>
-          <w:lang w:eastAsia="en-GB"/>
-          <w14:ligatures w14:val="none"/>
-        </w:rPr>
-        <w:t>xtotal</w:t>
-      </w:r>
-      <w:proofErr w:type="spellEnd"/>
-      <w:r>
-        <w:rPr>
-          <w:rFonts w:ascii="Times New Roman" w:eastAsia="Times New Roman" w:hAnsi="Times New Roman" w:cs="Times New Roman"/>
-          <w:kern w:val="0"/>
-          <w:lang w:eastAsia="en-GB"/>
-          <w14:ligatures w14:val="none"/>
-        </w:rPr>
-        <w:t xml:space="preserve"> </w:t>
+      <w:r>
+        <w:rPr>
+          <w:rFonts w:ascii="Times New Roman" w:eastAsia="Times New Roman" w:hAnsi="Times New Roman" w:cs="Times New Roman"/>
+          <w:kern w:val="0"/>
+          <w:lang w:eastAsia="en-GB"/>
+          <w14:ligatures w14:val="none"/>
+        </w:rPr>
+        <w:t xml:space="preserve">xtotal </w:t>
       </w:r>
       <w:r>
         <w:rPr>
@@ -8032,27 +6590,7 @@
           <w:lang w:eastAsia="en-GB"/>
           <w14:ligatures w14:val="none"/>
         </w:rPr>
-        <w:t xml:space="preserve"> Make each player have a selection based on </w:t>
-      </w:r>
-      <w:proofErr w:type="spellStart"/>
-      <w:r>
-        <w:rPr>
-          <w:rFonts w:ascii="Times New Roman" w:eastAsia="Times New Roman" w:hAnsi="Times New Roman" w:cs="Times New Roman"/>
-          <w:kern w:val="0"/>
-          <w:lang w:eastAsia="en-GB"/>
-          <w14:ligatures w14:val="none"/>
-        </w:rPr>
-        <w:t>wether</w:t>
-      </w:r>
-      <w:proofErr w:type="spellEnd"/>
-      <w:r>
-        <w:rPr>
-          <w:rFonts w:ascii="Times New Roman" w:eastAsia="Times New Roman" w:hAnsi="Times New Roman" w:cs="Times New Roman"/>
-          <w:kern w:val="0"/>
-          <w:lang w:eastAsia="en-GB"/>
-          <w14:ligatures w14:val="none"/>
-        </w:rPr>
-        <w:t xml:space="preserve"> you think they will score or assist in that game and you will earn a certain amount of points based on how valuable that player is (the</w:t>
+        <w:t xml:space="preserve"> Make each player have a selection based on wether you think they will score or assist in that game and you will earn a certain amount of points based on how valuable that player is (the</w:t>
       </w:r>
       <w:r>
         <w:rPr>
@@ -8210,7 +6748,6 @@
         </w:rPr>
         <w:t xml:space="preserve"> field of different leagues, a field for </w:t>
       </w:r>
-      <w:proofErr w:type="spellStart"/>
       <w:proofErr w:type="gramStart"/>
       <w:r>
         <w:rPr>
@@ -8221,7 +6758,6 @@
         </w:rPr>
         <w:t>country’s</w:t>
       </w:r>
-      <w:proofErr w:type="spellEnd"/>
       <w:proofErr w:type="gramEnd"/>
       <w:r>
         <w:rPr>
@@ -8530,37 +7066,7 @@
           <w:lang w:eastAsia="en-GB"/>
           <w14:ligatures w14:val="none"/>
         </w:rPr>
-        <w:t xml:space="preserve">to generate a completely separate score called the </w:t>
-      </w:r>
-      <w:proofErr w:type="spellStart"/>
-      <w:r>
-        <w:rPr>
-          <w:rFonts w:ascii="Times New Roman" w:eastAsia="Times New Roman" w:hAnsi="Times New Roman" w:cs="Times New Roman"/>
-          <w:kern w:val="0"/>
-          <w:lang w:eastAsia="en-GB"/>
-          <w14:ligatures w14:val="none"/>
-        </w:rPr>
-        <w:t>Vendicator</w:t>
-      </w:r>
-      <w:proofErr w:type="spellEnd"/>
-      <w:r>
-        <w:rPr>
-          <w:rFonts w:ascii="Times New Roman" w:eastAsia="Times New Roman" w:hAnsi="Times New Roman" w:cs="Times New Roman"/>
-          <w:kern w:val="0"/>
-          <w:lang w:eastAsia="en-GB"/>
-          <w14:ligatures w14:val="none"/>
-        </w:rPr>
-        <w:t xml:space="preserve"> </w:t>
-      </w:r>
-      <w:proofErr w:type="spellStart"/>
-      <w:r>
-        <w:rPr>
-          <w:rFonts w:ascii="Times New Roman" w:eastAsia="Times New Roman" w:hAnsi="Times New Roman" w:cs="Times New Roman"/>
-          <w:kern w:val="0"/>
-          <w:lang w:eastAsia="en-GB"/>
-          <w14:ligatures w14:val="none"/>
-        </w:rPr>
-        <w:t>Score</w:t>
+        <w:t>to generate a completely separate score called the Vendicator Score</w:t>
       </w:r>
       <w:r>
         <w:rPr>
@@ -8571,7 +7077,6 @@
         </w:rPr>
         <w:t>line</w:t>
       </w:r>
-      <w:proofErr w:type="spellEnd"/>
       <w:r>
         <w:rPr>
           <w:rFonts w:ascii="Times New Roman" w:eastAsia="Times New Roman" w:hAnsi="Times New Roman" w:cs="Times New Roman"/>
@@ -8787,27 +7292,7 @@
           <w:lang w:eastAsia="en-GB"/>
           <w14:ligatures w14:val="none"/>
         </w:rPr>
-        <w:t xml:space="preserve"> This means the score can go up </w:t>
-      </w:r>
-      <w:proofErr w:type="spellStart"/>
-      <w:r>
-        <w:rPr>
-          <w:rFonts w:ascii="Times New Roman" w:eastAsia="Times New Roman" w:hAnsi="Times New Roman" w:cs="Times New Roman"/>
-          <w:kern w:val="0"/>
-          <w:lang w:eastAsia="en-GB"/>
-          <w14:ligatures w14:val="none"/>
-        </w:rPr>
-        <w:t>our</w:t>
-      </w:r>
-      <w:proofErr w:type="spellEnd"/>
-      <w:r>
-        <w:rPr>
-          <w:rFonts w:ascii="Times New Roman" w:eastAsia="Times New Roman" w:hAnsi="Times New Roman" w:cs="Times New Roman"/>
-          <w:kern w:val="0"/>
-          <w:lang w:eastAsia="en-GB"/>
-          <w14:ligatures w14:val="none"/>
-        </w:rPr>
-        <w:t xml:space="preserve"> down and even into minus if you don’t make the right selections (however the odds should always help you win as long as the users selected bet wins, otherwise no points will be earned and if more than 3 selections of the bet builder fails then the user will be </w:t>
+        <w:t xml:space="preserve"> This means the score can go up our down and even into minus if you don’t make the right selections (however the odds should always help you win as long as the users selected bet wins, otherwise no points will be earned and if more than 3 selections of the bet builder fails then the user will be </w:t>
       </w:r>
       <w:r>
         <w:rPr>
@@ -9046,27 +7531,7 @@
           <w:lang w:eastAsia="en-GB"/>
           <w14:ligatures w14:val="none"/>
         </w:rPr>
-        <w:t xml:space="preserve"> based on the generated points system. (note; the points system should also factor into it the Vindicator </w:t>
-      </w:r>
-      <w:proofErr w:type="spellStart"/>
-      <w:r>
-        <w:rPr>
-          <w:rFonts w:ascii="Times New Roman" w:eastAsia="Times New Roman" w:hAnsi="Times New Roman" w:cs="Times New Roman"/>
-          <w:kern w:val="0"/>
-          <w:lang w:eastAsia="en-GB"/>
-          <w14:ligatures w14:val="none"/>
-        </w:rPr>
-        <w:t>Scoreline</w:t>
-      </w:r>
-      <w:proofErr w:type="spellEnd"/>
-      <w:r>
-        <w:rPr>
-          <w:rFonts w:ascii="Times New Roman" w:eastAsia="Times New Roman" w:hAnsi="Times New Roman" w:cs="Times New Roman"/>
-          <w:kern w:val="0"/>
-          <w:lang w:eastAsia="en-GB"/>
-          <w14:ligatures w14:val="none"/>
-        </w:rPr>
-        <w:t xml:space="preserve"> numbers to either generate a bonus total if the bet wins (full house) or to generate deduction points if the bet loses with 3 or more selections</w:t>
+        <w:t xml:space="preserve"> based on the generated points system. (note; the points system should also factor into it the Vindicator Scoreline numbers to either generate a bonus total if the bet wins (full house) or to generate deduction points if the bet loses with 3 or more selections</w:t>
       </w:r>
       <w:r>
         <w:rPr>
@@ -9611,47 +8076,7 @@
           <w:lang w:eastAsia="en-GB"/>
           <w14:ligatures w14:val="none"/>
         </w:rPr>
-        <w:t xml:space="preserve"> filter each prediction card based on either by; default (normal viewing showing a star card with the best value at the top and the rest in order of league category and date and time of the card event time), </w:t>
-      </w:r>
-      <w:proofErr w:type="spellStart"/>
-      <w:r>
-        <w:rPr>
-          <w:rFonts w:ascii="Times New Roman" w:eastAsia="Times New Roman" w:hAnsi="Times New Roman" w:cs="Times New Roman"/>
-          <w:kern w:val="0"/>
-          <w:lang w:eastAsia="en-GB"/>
-          <w14:ligatures w14:val="none"/>
-        </w:rPr>
-        <w:t>Vendicator</w:t>
-      </w:r>
-      <w:proofErr w:type="spellEnd"/>
-      <w:r>
-        <w:rPr>
-          <w:rFonts w:ascii="Times New Roman" w:eastAsia="Times New Roman" w:hAnsi="Times New Roman" w:cs="Times New Roman"/>
-          <w:kern w:val="0"/>
-          <w:lang w:eastAsia="en-GB"/>
-          <w14:ligatures w14:val="none"/>
-        </w:rPr>
-        <w:t xml:space="preserve"> </w:t>
-      </w:r>
-      <w:proofErr w:type="spellStart"/>
-      <w:r>
-        <w:rPr>
-          <w:rFonts w:ascii="Times New Roman" w:eastAsia="Times New Roman" w:hAnsi="Times New Roman" w:cs="Times New Roman"/>
-          <w:kern w:val="0"/>
-          <w:lang w:eastAsia="en-GB"/>
-          <w14:ligatures w14:val="none"/>
-        </w:rPr>
-        <w:t>scoreline</w:t>
-      </w:r>
-      <w:proofErr w:type="spellEnd"/>
-      <w:r>
-        <w:rPr>
-          <w:rFonts w:ascii="Times New Roman" w:eastAsia="Times New Roman" w:hAnsi="Times New Roman" w:cs="Times New Roman"/>
-          <w:kern w:val="0"/>
-          <w:lang w:eastAsia="en-GB"/>
-          <w14:ligatures w14:val="none"/>
-        </w:rPr>
-        <w:t xml:space="preserve"> in ascending or descending order, by alphabetical order, date (showing cards only from either a certain gaming date week for the season or by date order).</w:t>
+        <w:t xml:space="preserve"> filter each prediction card based on either by; default (normal viewing showing a star card with the best value at the top and the rest in order of league category and date and time of the card event time), Vendicator scoreline in ascending or descending order, by alphabetical order, date (showing cards only from either a certain gaming date week for the season or by date order).</w:t>
       </w:r>
       <w:r>
         <w:rPr>
@@ -9688,27 +8113,7 @@
           <w14:ligatures w14:val="none"/>
         </w:rPr>
         <w:br/>
-        <w:t xml:space="preserve">This page will be called the </w:t>
-      </w:r>
-      <w:proofErr w:type="spellStart"/>
-      <w:r>
-        <w:rPr>
-          <w:rFonts w:ascii="Times New Roman" w:eastAsia="Times New Roman" w:hAnsi="Times New Roman" w:cs="Times New Roman"/>
-          <w:kern w:val="0"/>
-          <w:lang w:eastAsia="en-GB"/>
-          <w14:ligatures w14:val="none"/>
-        </w:rPr>
-        <w:t>CardGrid</w:t>
-      </w:r>
-      <w:proofErr w:type="spellEnd"/>
-      <w:r>
-        <w:rPr>
-          <w:rFonts w:ascii="Times New Roman" w:eastAsia="Times New Roman" w:hAnsi="Times New Roman" w:cs="Times New Roman"/>
-          <w:kern w:val="0"/>
-          <w:lang w:eastAsia="en-GB"/>
-          <w14:ligatures w14:val="none"/>
-        </w:rPr>
-        <w:t xml:space="preserve"> and its where cards will disappear when a bet starts if you haven’t selected it for live in-play bet gaming before the sports match starts.</w:t>
+        <w:t>This page will be called the CardGrid and its where cards will disappear when a bet starts if you haven’t selected it for live in-play bet gaming before the sports match starts.</w:t>
       </w:r>
       <w:r>
         <w:rPr>
@@ -9955,27 +8360,7 @@
           <w14:ligatures w14:val="none"/>
         </w:rPr>
         <w:br/>
-        <w:t xml:space="preserve">16. Make the home logo selectable to go the main predictions page. Also make a button at the top to go to the </w:t>
-      </w:r>
-      <w:proofErr w:type="spellStart"/>
-      <w:r>
-        <w:rPr>
-          <w:rFonts w:ascii="Times New Roman" w:eastAsia="Times New Roman" w:hAnsi="Times New Roman" w:cs="Times New Roman"/>
-          <w:kern w:val="0"/>
-          <w:lang w:eastAsia="en-GB"/>
-          <w14:ligatures w14:val="none"/>
-        </w:rPr>
-        <w:t>CardGrid</w:t>
-      </w:r>
-      <w:proofErr w:type="spellEnd"/>
-      <w:r>
-        <w:rPr>
-          <w:rFonts w:ascii="Times New Roman" w:eastAsia="Times New Roman" w:hAnsi="Times New Roman" w:cs="Times New Roman"/>
-          <w:kern w:val="0"/>
-          <w:lang w:eastAsia="en-GB"/>
-          <w14:ligatures w14:val="none"/>
-        </w:rPr>
-        <w:t xml:space="preserve"> page</w:t>
+        <w:t>16. Make the home logo selectable to go the main predictions page. Also make a button at the top to go to the CardGrid page</w:t>
       </w:r>
       <w:r>
         <w:rPr>
@@ -9994,6 +8379,620 @@
           <w14:ligatures w14:val="none"/>
         </w:rPr>
         <w:t>which is the main feature of this card and the button should be more of a mascot/icon to stand out and show fun professional gaming is ahead after clicking that button.</w:t>
+      </w:r>
+    </w:p>
+    <w:p>
+      <w:pPr>
+        <w:spacing w:before="100" w:beforeAutospacing="1" w:after="100" w:afterAutospacing="1"/>
+        <w:rPr>
+          <w:rFonts w:ascii="Times New Roman" w:eastAsia="Times New Roman" w:hAnsi="Times New Roman" w:cs="Times New Roman"/>
+          <w:b/>
+          <w:bCs/>
+          <w:kern w:val="0"/>
+          <w:sz w:val="48"/>
+          <w:szCs w:val="48"/>
+          <w:lang w:eastAsia="en-GB"/>
+          <w14:ligatures w14:val="none"/>
+        </w:rPr>
+      </w:pPr>
+    </w:p>
+    <w:p>
+      <w:pPr>
+        <w:spacing w:before="100" w:beforeAutospacing="1" w:after="100" w:afterAutospacing="1"/>
+        <w:rPr>
+          <w:rFonts w:ascii="Times New Roman" w:eastAsia="Times New Roman" w:hAnsi="Times New Roman" w:cs="Times New Roman"/>
+          <w:kern w:val="0"/>
+          <w:lang w:eastAsia="en-GB"/>
+          <w14:ligatures w14:val="none"/>
+        </w:rPr>
+      </w:pPr>
+      <w:r>
+        <w:rPr>
+          <w:rFonts w:ascii="Times New Roman" w:eastAsia="Times New Roman" w:hAnsi="Times New Roman" w:cs="Times New Roman"/>
+          <w:b/>
+          <w:bCs/>
+          <w:kern w:val="0"/>
+          <w:sz w:val="48"/>
+          <w:szCs w:val="48"/>
+          <w:lang w:eastAsia="en-GB"/>
+          <w14:ligatures w14:val="none"/>
+        </w:rPr>
+        <w:t>13.</w:t>
+      </w:r>
+      <w:r>
+        <w:rPr>
+          <w:rFonts w:ascii="Times New Roman" w:eastAsia="Times New Roman" w:hAnsi="Times New Roman" w:cs="Times New Roman"/>
+          <w:kern w:val="0"/>
+          <w:lang w:eastAsia="en-GB"/>
+          <w14:ligatures w14:val="none"/>
+        </w:rPr>
+        <w:br/>
+        <w:t>1. Make</w:t>
+      </w:r>
+      <w:r>
+        <w:rPr>
+          <w:rFonts w:ascii="Times New Roman" w:eastAsia="Times New Roman" w:hAnsi="Times New Roman" w:cs="Times New Roman"/>
+          <w:kern w:val="0"/>
+          <w:lang w:eastAsia="en-GB"/>
+          <w14:ligatures w14:val="none"/>
+        </w:rPr>
+        <w:t xml:space="preserve"> </w:t>
+      </w:r>
+      <w:r>
+        <w:rPr>
+          <w:rFonts w:ascii="Times New Roman" w:eastAsia="Times New Roman" w:hAnsi="Times New Roman" w:cs="Times New Roman"/>
+          <w:kern w:val="0"/>
+          <w:lang w:eastAsia="en-GB"/>
+          <w14:ligatures w14:val="none"/>
+        </w:rPr>
+        <w:t>The floating glass nav is live</w:t>
+      </w:r>
+      <w:r>
+        <w:rPr>
+          <w:rFonts w:ascii="Times New Roman" w:eastAsia="Times New Roman" w:hAnsi="Times New Roman" w:cs="Times New Roman"/>
+          <w:kern w:val="0"/>
+          <w:lang w:eastAsia="en-GB"/>
+          <w14:ligatures w14:val="none"/>
+        </w:rPr>
+        <w:t xml:space="preserve"> on every page, it seems to be missing on the accounts section mainly along with the main title logo not being selectable to the home page.</w:t>
+      </w:r>
+      <w:r>
+        <w:rPr>
+          <w:rFonts w:ascii="Times New Roman" w:eastAsia="Times New Roman" w:hAnsi="Times New Roman" w:cs="Times New Roman"/>
+          <w:kern w:val="0"/>
+          <w:lang w:eastAsia="en-GB"/>
+          <w14:ligatures w14:val="none"/>
+        </w:rPr>
+        <w:br/>
+        <w:t>I want the floating header global across all pages for easy navigation.</w:t>
+      </w:r>
+      <w:r>
+        <w:rPr>
+          <w:rFonts w:ascii="Times New Roman" w:eastAsia="Times New Roman" w:hAnsi="Times New Roman" w:cs="Times New Roman"/>
+          <w:kern w:val="0"/>
+          <w:lang w:eastAsia="en-GB"/>
+          <w14:ligatures w14:val="none"/>
+        </w:rPr>
+        <w:br/>
+        <w:t>2.the more fixtures button at the bottom of the predictions page needs to direct to the card grid page.</w:t>
+      </w:r>
+      <w:r>
+        <w:rPr>
+          <w:rFonts w:ascii="Times New Roman" w:eastAsia="Times New Roman" w:hAnsi="Times New Roman" w:cs="Times New Roman"/>
+          <w:kern w:val="0"/>
+          <w:lang w:eastAsia="en-GB"/>
+          <w14:ligatures w14:val="none"/>
+        </w:rPr>
+        <w:br/>
+        <w:t>3.bets placed knowing it has a risk factor calculated into the bet can be very profitable if the bet wins, as the user can win calculated bonus points based on the Vendicator value and the value of the points and the betting odds generate a bonus points.</w:t>
+      </w:r>
+      <w:r>
+        <w:rPr>
+          <w:rFonts w:ascii="Times New Roman" w:eastAsia="Times New Roman" w:hAnsi="Times New Roman" w:cs="Times New Roman"/>
+          <w:kern w:val="0"/>
+          <w:lang w:eastAsia="en-GB"/>
+          <w14:ligatures w14:val="none"/>
+        </w:rPr>
+        <w:br/>
+        <w:t>(Also make the Vendicator scoreline value similar to how odds work, take betfair exchange and bet365 for example. Use the same sort of value as the number before the decimal when placing odds for the Vendicator scoreline value rating.</w:t>
+      </w:r>
+      <w:r>
+        <w:rPr>
+          <w:rFonts w:ascii="Times New Roman" w:eastAsia="Times New Roman" w:hAnsi="Times New Roman" w:cs="Times New Roman"/>
+          <w:kern w:val="0"/>
+          <w:lang w:eastAsia="en-GB"/>
+          <w14:ligatures w14:val="none"/>
+        </w:rPr>
+        <w:br/>
+        <w:t xml:space="preserve">4. Instead of making the </w:t>
+      </w:r>
+      <w:r>
+        <w:rPr>
+          <w:rFonts w:ascii="Times New Roman" w:eastAsia="Times New Roman" w:hAnsi="Times New Roman" w:cs="Times New Roman"/>
+          <w:kern w:val="0"/>
+          <w:lang w:eastAsia="en-GB"/>
+          <w14:ligatures w14:val="none"/>
+        </w:rPr>
+        <w:t xml:space="preserve">global </w:t>
+      </w:r>
+      <w:r>
+        <w:rPr>
+          <w:rFonts w:ascii="Times New Roman" w:eastAsia="Times New Roman" w:hAnsi="Times New Roman" w:cs="Times New Roman"/>
+          <w:kern w:val="0"/>
+          <w:lang w:eastAsia="en-GB"/>
+          <w14:ligatures w14:val="none"/>
+        </w:rPr>
+        <w:t xml:space="preserve">reward points go in </w:t>
+      </w:r>
+      <w:r>
+        <w:rPr>
+          <w:rFonts w:ascii="Times New Roman" w:eastAsia="Times New Roman" w:hAnsi="Times New Roman" w:cs="Times New Roman"/>
+          <w:kern w:val="0"/>
+          <w:lang w:eastAsia="en-GB"/>
+          <w14:ligatures w14:val="none"/>
+        </w:rPr>
+        <w:t xml:space="preserve">to </w:t>
+      </w:r>
+      <w:r>
+        <w:rPr>
+          <w:rFonts w:ascii="Times New Roman" w:eastAsia="Times New Roman" w:hAnsi="Times New Roman" w:cs="Times New Roman"/>
+          <w:kern w:val="0"/>
+          <w:lang w:eastAsia="en-GB"/>
+          <w14:ligatures w14:val="none"/>
+        </w:rPr>
+        <w:t xml:space="preserve">the </w:t>
+      </w:r>
+      <w:r>
+        <w:rPr>
+          <w:rFonts w:ascii="Times New Roman" w:eastAsia="Times New Roman" w:hAnsi="Times New Roman" w:cs="Times New Roman"/>
+          <w:kern w:val="0"/>
+          <w:lang w:eastAsia="en-GB"/>
+          <w14:ligatures w14:val="none"/>
+        </w:rPr>
+        <w:t>hundreds</w:t>
+      </w:r>
+      <w:r>
+        <w:rPr>
+          <w:rFonts w:ascii="Times New Roman" w:eastAsia="Times New Roman" w:hAnsi="Times New Roman" w:cs="Times New Roman"/>
+          <w:kern w:val="0"/>
+          <w:lang w:eastAsia="en-GB"/>
+          <w14:ligatures w14:val="none"/>
+        </w:rPr>
+        <w:t xml:space="preserve"> (000)</w:t>
+      </w:r>
+      <w:r>
+        <w:rPr>
+          <w:rFonts w:ascii="Times New Roman" w:eastAsia="Times New Roman" w:hAnsi="Times New Roman" w:cs="Times New Roman"/>
+          <w:kern w:val="0"/>
+          <w:lang w:eastAsia="en-GB"/>
+          <w14:ligatures w14:val="none"/>
+        </w:rPr>
+        <w:t xml:space="preserve"> digits,</w:t>
+      </w:r>
+      <w:r>
+        <w:rPr>
+          <w:rFonts w:ascii="Times New Roman" w:eastAsia="Times New Roman" w:hAnsi="Times New Roman" w:cs="Times New Roman"/>
+          <w:kern w:val="0"/>
+          <w:lang w:eastAsia="en-GB"/>
+          <w14:ligatures w14:val="none"/>
+        </w:rPr>
+        <w:t xml:space="preserve"> make the points </w:t>
+      </w:r>
+      <w:r>
+        <w:rPr>
+          <w:rFonts w:ascii="Times New Roman" w:eastAsia="Times New Roman" w:hAnsi="Times New Roman" w:cs="Times New Roman"/>
+          <w:kern w:val="0"/>
+          <w:lang w:eastAsia="en-GB"/>
+          <w14:ligatures w14:val="none"/>
+        </w:rPr>
+        <w:t>with a similar value to betting odds like betfair exchange decimal odds for example.</w:t>
+      </w:r>
+      <w:r>
+        <w:rPr>
+          <w:rFonts w:ascii="Times New Roman" w:eastAsia="Times New Roman" w:hAnsi="Times New Roman" w:cs="Times New Roman"/>
+          <w:kern w:val="0"/>
+          <w:lang w:eastAsia="en-GB"/>
+          <w14:ligatures w14:val="none"/>
+        </w:rPr>
+        <w:t xml:space="preserve"> </w:t>
+      </w:r>
+      <w:r>
+        <w:rPr>
+          <w:rFonts w:ascii="Times New Roman" w:eastAsia="Times New Roman" w:hAnsi="Times New Roman" w:cs="Times New Roman"/>
+          <w:kern w:val="0"/>
+          <w:lang w:eastAsia="en-GB"/>
+          <w14:ligatures w14:val="none"/>
+        </w:rPr>
+        <w:t>G</w:t>
+      </w:r>
+      <w:r>
+        <w:rPr>
+          <w:rFonts w:ascii="Times New Roman" w:eastAsia="Times New Roman" w:hAnsi="Times New Roman" w:cs="Times New Roman"/>
+          <w:kern w:val="0"/>
+          <w:lang w:eastAsia="en-GB"/>
+          <w14:ligatures w14:val="none"/>
+        </w:rPr>
+        <w:t xml:space="preserve">iving a calculated betting </w:t>
+      </w:r>
+      <w:r>
+        <w:rPr>
+          <w:rFonts w:ascii="Times New Roman" w:eastAsia="Times New Roman" w:hAnsi="Times New Roman" w:cs="Times New Roman"/>
+          <w:kern w:val="0"/>
+          <w:lang w:eastAsia="en-GB"/>
+          <w14:ligatures w14:val="none"/>
+        </w:rPr>
+        <w:t>odds generated</w:t>
+      </w:r>
+      <w:r>
+        <w:rPr>
+          <w:rFonts w:ascii="Times New Roman" w:eastAsia="Times New Roman" w:hAnsi="Times New Roman" w:cs="Times New Roman"/>
+          <w:kern w:val="0"/>
+          <w:lang w:eastAsia="en-GB"/>
+          <w14:ligatures w14:val="none"/>
+        </w:rPr>
+        <w:t xml:space="preserve"> style </w:t>
+      </w:r>
+      <w:r>
+        <w:rPr>
+          <w:rFonts w:ascii="Times New Roman" w:eastAsia="Times New Roman" w:hAnsi="Times New Roman" w:cs="Times New Roman"/>
+          <w:kern w:val="0"/>
+          <w:lang w:eastAsia="en-GB"/>
+          <w14:ligatures w14:val="none"/>
+        </w:rPr>
+        <w:t xml:space="preserve">number displayed next to the calculated </w:t>
+      </w:r>
+      <w:r>
+        <w:rPr>
+          <w:rFonts w:ascii="Times New Roman" w:eastAsia="Times New Roman" w:hAnsi="Times New Roman" w:cs="Times New Roman"/>
+          <w:kern w:val="0"/>
+          <w:lang w:eastAsia="en-GB"/>
+          <w14:ligatures w14:val="none"/>
+        </w:rPr>
+        <w:t xml:space="preserve">Vendicator scoreline (the number generated will </w:t>
+      </w:r>
+      <w:r>
+        <w:rPr>
+          <w:rFonts w:ascii="Times New Roman" w:eastAsia="Times New Roman" w:hAnsi="Times New Roman" w:cs="Times New Roman"/>
+          <w:kern w:val="0"/>
+          <w:lang w:eastAsia="en-GB"/>
+          <w14:ligatures w14:val="none"/>
+        </w:rPr>
+        <w:t>basically</w:t>
+      </w:r>
+      <w:r>
+        <w:rPr>
+          <w:rFonts w:ascii="Times New Roman" w:eastAsia="Times New Roman" w:hAnsi="Times New Roman" w:cs="Times New Roman"/>
+          <w:kern w:val="0"/>
+          <w:lang w:eastAsia="en-GB"/>
+          <w14:ligatures w14:val="none"/>
+        </w:rPr>
+        <w:t xml:space="preserve"> be based off top </w:t>
+      </w:r>
+      <w:proofErr w:type="gramStart"/>
+      <w:r>
+        <w:rPr>
+          <w:rFonts w:ascii="Times New Roman" w:eastAsia="Times New Roman" w:hAnsi="Times New Roman" w:cs="Times New Roman"/>
+          <w:kern w:val="0"/>
+          <w:lang w:eastAsia="en-GB"/>
+          <w14:ligatures w14:val="none"/>
+        </w:rPr>
+        <w:t>bookmakers</w:t>
+      </w:r>
+      <w:proofErr w:type="gramEnd"/>
+      <w:r>
+        <w:rPr>
+          <w:rFonts w:ascii="Times New Roman" w:eastAsia="Times New Roman" w:hAnsi="Times New Roman" w:cs="Times New Roman"/>
+          <w:kern w:val="0"/>
+          <w:lang w:eastAsia="en-GB"/>
+          <w14:ligatures w14:val="none"/>
+        </w:rPr>
+        <w:t xml:space="preserve"> odds at the time of events and based on the models historical data and </w:t>
+      </w:r>
+      <w:r>
+        <w:rPr>
+          <w:rFonts w:ascii="Times New Roman" w:eastAsia="Times New Roman" w:hAnsi="Times New Roman" w:cs="Times New Roman"/>
+          <w:kern w:val="0"/>
+          <w:lang w:eastAsia="en-GB"/>
+          <w14:ligatures w14:val="none"/>
+        </w:rPr>
+        <w:t>player and team values). But these are reward points that will be totalled and used to gain rankings and future rewards.</w:t>
+      </w:r>
+      <w:r>
+        <w:rPr>
+          <w:rFonts w:ascii="Times New Roman" w:eastAsia="Times New Roman" w:hAnsi="Times New Roman" w:cs="Times New Roman"/>
+          <w:kern w:val="0"/>
+          <w:lang w:eastAsia="en-GB"/>
+          <w14:ligatures w14:val="none"/>
+        </w:rPr>
+        <w:br/>
+        <w:t>5. Give a broader selection for alternative goals (use scroll down if needed) and a broader selection to fouls expected and goals expected. Also remove the yellow cards section from that section on the cards and replace it with; first half home win, second half home win,</w:t>
+      </w:r>
+      <w:r>
+        <w:rPr>
+          <w:rFonts w:ascii="Times New Roman" w:eastAsia="Times New Roman" w:hAnsi="Times New Roman" w:cs="Times New Roman"/>
+          <w:kern w:val="0"/>
+          <w:lang w:eastAsia="en-GB"/>
+          <w14:ligatures w14:val="none"/>
+        </w:rPr>
+        <w:t xml:space="preserve"> first half home win, second half home draw, first half home draw, second half home draw etc…</w:t>
+      </w:r>
+      <w:r>
+        <w:rPr>
+          <w:rFonts w:ascii="Times New Roman" w:eastAsia="Times New Roman" w:hAnsi="Times New Roman" w:cs="Times New Roman"/>
+          <w:kern w:val="0"/>
+          <w:lang w:eastAsia="en-GB"/>
+          <w14:ligatures w14:val="none"/>
+        </w:rPr>
+        <w:br/>
+        <w:t xml:space="preserve">6. Add the </w:t>
+      </w:r>
+      <w:proofErr w:type="gramStart"/>
+      <w:r>
+        <w:rPr>
+          <w:rFonts w:ascii="Times New Roman" w:eastAsia="Times New Roman" w:hAnsi="Times New Roman" w:cs="Times New Roman"/>
+          <w:kern w:val="0"/>
+          <w:lang w:eastAsia="en-GB"/>
+          <w14:ligatures w14:val="none"/>
+        </w:rPr>
+        <w:t>team</w:t>
+      </w:r>
+      <w:proofErr w:type="gramEnd"/>
+      <w:r>
+        <w:rPr>
+          <w:rFonts w:ascii="Times New Roman" w:eastAsia="Times New Roman" w:hAnsi="Times New Roman" w:cs="Times New Roman"/>
+          <w:kern w:val="0"/>
+          <w:lang w:eastAsia="en-GB"/>
+          <w14:ligatures w14:val="none"/>
+        </w:rPr>
+        <w:t xml:space="preserve"> name of each player in the player markets grid under the name and above the numbered data. Also add the player position next to the name i.e FWD, DEF etc…</w:t>
+      </w:r>
+      <w:r>
+        <w:rPr>
+          <w:rFonts w:ascii="Times New Roman" w:eastAsia="Times New Roman" w:hAnsi="Times New Roman" w:cs="Times New Roman"/>
+          <w:kern w:val="0"/>
+          <w:lang w:eastAsia="en-GB"/>
+          <w14:ligatures w14:val="none"/>
+        </w:rPr>
+        <w:br/>
+        <w:t>Also show all the players in each column section (use a dropdown menu if needed).</w:t>
+      </w:r>
+      <w:r>
+        <w:rPr>
+          <w:rFonts w:ascii="Times New Roman" w:eastAsia="Times New Roman" w:hAnsi="Times New Roman" w:cs="Times New Roman"/>
+          <w:kern w:val="0"/>
+          <w:lang w:eastAsia="en-GB"/>
+          <w14:ligatures w14:val="none"/>
+        </w:rPr>
+        <w:br/>
+        <w:t xml:space="preserve">7. When on each player profile globally make the position of each player show a more detail version of their </w:t>
+      </w:r>
+      <w:r>
+        <w:rPr>
+          <w:rFonts w:ascii="Times New Roman" w:eastAsia="Times New Roman" w:hAnsi="Times New Roman" w:cs="Times New Roman"/>
+          <w:kern w:val="0"/>
+          <w:lang w:eastAsia="en-GB"/>
+          <w14:ligatures w14:val="none"/>
+        </w:rPr>
+        <w:t>positions</w:t>
+      </w:r>
+      <w:r>
+        <w:rPr>
+          <w:rFonts w:ascii="Times New Roman" w:eastAsia="Times New Roman" w:hAnsi="Times New Roman" w:cs="Times New Roman"/>
+          <w:kern w:val="0"/>
+          <w:lang w:eastAsia="en-GB"/>
+          <w14:ligatures w14:val="none"/>
+        </w:rPr>
+        <w:t>. Also show their team number next to their name.</w:t>
+      </w:r>
+      <w:r>
+        <w:rPr>
+          <w:rFonts w:ascii="Times New Roman" w:eastAsia="Times New Roman" w:hAnsi="Times New Roman" w:cs="Times New Roman"/>
+          <w:kern w:val="0"/>
+          <w:lang w:eastAsia="en-GB"/>
+          <w14:ligatures w14:val="none"/>
+        </w:rPr>
+        <w:br/>
+        <w:t xml:space="preserve">8. </w:t>
+      </w:r>
+      <w:r>
+        <w:rPr>
+          <w:rFonts w:ascii="Times New Roman" w:eastAsia="Times New Roman" w:hAnsi="Times New Roman" w:cs="Times New Roman"/>
+          <w:kern w:val="0"/>
+          <w:lang w:eastAsia="en-GB"/>
+          <w14:ligatures w14:val="none"/>
+        </w:rPr>
+        <w:t xml:space="preserve">The player markets </w:t>
+      </w:r>
+      <w:proofErr w:type="gramStart"/>
+      <w:r>
+        <w:rPr>
+          <w:rFonts w:ascii="Times New Roman" w:eastAsia="Times New Roman" w:hAnsi="Times New Roman" w:cs="Times New Roman"/>
+          <w:kern w:val="0"/>
+          <w:lang w:eastAsia="en-GB"/>
+          <w14:ligatures w14:val="none"/>
+        </w:rPr>
+        <w:t>is</w:t>
+      </w:r>
+      <w:proofErr w:type="gramEnd"/>
+      <w:r>
+        <w:rPr>
+          <w:rFonts w:ascii="Times New Roman" w:eastAsia="Times New Roman" w:hAnsi="Times New Roman" w:cs="Times New Roman"/>
+          <w:kern w:val="0"/>
+          <w:lang w:eastAsia="en-GB"/>
+          <w14:ligatures w14:val="none"/>
+        </w:rPr>
+        <w:t xml:space="preserve"> good but the player cards need to be in rows for each </w:t>
+      </w:r>
+      <w:r>
+        <w:rPr>
+          <w:rFonts w:ascii="Times New Roman" w:eastAsia="Times New Roman" w:hAnsi="Times New Roman" w:cs="Times New Roman"/>
+          <w:kern w:val="0"/>
+          <w:lang w:eastAsia="en-GB"/>
+          <w14:ligatures w14:val="none"/>
+        </w:rPr>
+        <w:t>category</w:t>
+      </w:r>
+      <w:r>
+        <w:rPr>
+          <w:rFonts w:ascii="Times New Roman" w:eastAsia="Times New Roman" w:hAnsi="Times New Roman" w:cs="Times New Roman"/>
+          <w:kern w:val="0"/>
+          <w:lang w:eastAsia="en-GB"/>
+          <w14:ligatures w14:val="none"/>
+        </w:rPr>
+        <w:t>.</w:t>
+      </w:r>
+      <w:r>
+        <w:rPr>
+          <w:rFonts w:ascii="Times New Roman" w:eastAsia="Times New Roman" w:hAnsi="Times New Roman" w:cs="Times New Roman"/>
+          <w:kern w:val="0"/>
+          <w:lang w:eastAsia="en-GB"/>
+          <w14:ligatures w14:val="none"/>
+        </w:rPr>
+        <w:t xml:space="preserve"> </w:t>
+      </w:r>
+      <w:r>
+        <w:rPr>
+          <w:rFonts w:ascii="Times New Roman" w:eastAsia="Times New Roman" w:hAnsi="Times New Roman" w:cs="Times New Roman"/>
+          <w:kern w:val="0"/>
+          <w:lang w:eastAsia="en-GB"/>
+          <w14:ligatures w14:val="none"/>
+        </w:rPr>
+        <w:t xml:space="preserve">Also showing a broader selection of columns for selection of either 1+, 2+ etc or 0, 1.5, 2.5 etc. </w:t>
+      </w:r>
+      <w:proofErr w:type="gramStart"/>
+      <w:r>
+        <w:rPr>
+          <w:rFonts w:ascii="Times New Roman" w:eastAsia="Times New Roman" w:hAnsi="Times New Roman" w:cs="Times New Roman"/>
+          <w:kern w:val="0"/>
+          <w:lang w:eastAsia="en-GB"/>
+          <w14:ligatures w14:val="none"/>
+        </w:rPr>
+        <w:t>Also</w:t>
+      </w:r>
+      <w:proofErr w:type="gramEnd"/>
+      <w:r>
+        <w:rPr>
+          <w:rFonts w:ascii="Times New Roman" w:eastAsia="Times New Roman" w:hAnsi="Times New Roman" w:cs="Times New Roman"/>
+          <w:kern w:val="0"/>
+          <w:lang w:eastAsia="en-GB"/>
+          <w14:ligatures w14:val="none"/>
+        </w:rPr>
+        <w:t xml:space="preserve"> with the team name of the player under his name above the numbers underneath. (use dropdown selection menus if needed but keep it modern looking in same style of the glass theme).</w:t>
+      </w:r>
+      <w:r>
+        <w:rPr>
+          <w:rFonts w:ascii="Times New Roman" w:eastAsia="Times New Roman" w:hAnsi="Times New Roman" w:cs="Times New Roman"/>
+          <w:kern w:val="0"/>
+          <w:lang w:eastAsia="en-GB"/>
+          <w14:ligatures w14:val="none"/>
+        </w:rPr>
+        <w:br/>
+        <w:t xml:space="preserve">9. Move the expected corners section on the cards to its </w:t>
+      </w:r>
+      <w:r>
+        <w:rPr>
+          <w:rFonts w:ascii="Times New Roman" w:eastAsia="Times New Roman" w:hAnsi="Times New Roman" w:cs="Times New Roman"/>
+          <w:kern w:val="0"/>
+          <w:lang w:eastAsia="en-GB"/>
+          <w14:ligatures w14:val="none"/>
+        </w:rPr>
+        <w:t>own section</w:t>
+      </w:r>
+      <w:r>
+        <w:rPr>
+          <w:rFonts w:ascii="Times New Roman" w:eastAsia="Times New Roman" w:hAnsi="Times New Roman" w:cs="Times New Roman"/>
+          <w:kern w:val="0"/>
+          <w:lang w:eastAsia="en-GB"/>
+          <w14:ligatures w14:val="none"/>
+        </w:rPr>
+        <w:t xml:space="preserve"> slot just above the same space</w:t>
+      </w:r>
+      <w:r>
+        <w:rPr>
+          <w:rFonts w:ascii="Times New Roman" w:eastAsia="Times New Roman" w:hAnsi="Times New Roman" w:cs="Times New Roman"/>
+          <w:kern w:val="0"/>
+          <w:lang w:eastAsia="en-GB"/>
+          <w14:ligatures w14:val="none"/>
+        </w:rPr>
+        <w:t xml:space="preserve"> it was before. Again, giving a broader selection to make a bet builder to earn reward points.</w:t>
+      </w:r>
+      <w:r>
+        <w:rPr>
+          <w:rFonts w:ascii="Times New Roman" w:eastAsia="Times New Roman" w:hAnsi="Times New Roman" w:cs="Times New Roman"/>
+          <w:kern w:val="0"/>
+          <w:lang w:eastAsia="en-GB"/>
+          <w14:ligatures w14:val="none"/>
+        </w:rPr>
+        <w:br/>
+        <w:t xml:space="preserve">10. Keep the theme and style of everything else but make that glass floating header available </w:t>
+      </w:r>
+      <w:r>
+        <w:rPr>
+          <w:rFonts w:ascii="Times New Roman" w:eastAsia="Times New Roman" w:hAnsi="Times New Roman" w:cs="Times New Roman"/>
+          <w:kern w:val="0"/>
+          <w:lang w:eastAsia="en-GB"/>
+          <w14:ligatures w14:val="none"/>
+        </w:rPr>
+        <w:lastRenderedPageBreak/>
+        <w:t>on all pages and also create a footer on all pages with this text: copyright 2026 Vendicator (with a contact us button in text next to it directing to the help page).</w:t>
+      </w:r>
+      <w:r>
+        <w:rPr>
+          <w:rFonts w:ascii="Times New Roman" w:eastAsia="Times New Roman" w:hAnsi="Times New Roman" w:cs="Times New Roman"/>
+          <w:kern w:val="0"/>
+          <w:lang w:eastAsia="en-GB"/>
+          <w14:ligatures w14:val="none"/>
+        </w:rPr>
+        <w:br/>
+        <w:t xml:space="preserve">11. Make the filter button next to competition actually filter the prediction cards into either; alphabetical order, default (all competitions by date), by date ascending or descending, (each league) and game week (which shows only cards from a game week that is selected from a separate </w:t>
+      </w:r>
+      <w:r>
+        <w:rPr>
+          <w:rFonts w:ascii="Times New Roman" w:eastAsia="Times New Roman" w:hAnsi="Times New Roman" w:cs="Times New Roman"/>
+          <w:kern w:val="0"/>
+          <w:lang w:eastAsia="en-GB"/>
+          <w14:ligatures w14:val="none"/>
+        </w:rPr>
+        <w:t>drop-down</w:t>
+      </w:r>
+      <w:r>
+        <w:rPr>
+          <w:rFonts w:ascii="Times New Roman" w:eastAsia="Times New Roman" w:hAnsi="Times New Roman" w:cs="Times New Roman"/>
+          <w:kern w:val="0"/>
+          <w:lang w:eastAsia="en-GB"/>
+          <w14:ligatures w14:val="none"/>
+        </w:rPr>
+        <w:t xml:space="preserve"> menu (this way users can look up future fixtures and past fixtures within the gaming season. </w:t>
+      </w:r>
+      <w:r>
+        <w:rPr>
+          <w:rFonts w:ascii="Times New Roman" w:eastAsia="Times New Roman" w:hAnsi="Times New Roman" w:cs="Times New Roman"/>
+          <w:kern w:val="0"/>
+          <w:lang w:eastAsia="en-GB"/>
+          <w14:ligatures w14:val="none"/>
+        </w:rPr>
+        <w:br/>
+        <w:t>keep the card grid view but add team icons/badges images next to each team name and add icons/league badges to each league section in the card grid. (if adding images next to the names changes the setup too much to this page then leave it for now)</w:t>
+      </w:r>
+      <w:r>
+        <w:rPr>
+          <w:rFonts w:ascii="Times New Roman" w:eastAsia="Times New Roman" w:hAnsi="Times New Roman" w:cs="Times New Roman"/>
+          <w:kern w:val="0"/>
+          <w:lang w:eastAsia="en-GB"/>
+          <w14:ligatures w14:val="none"/>
+        </w:rPr>
+        <w:br/>
+        <w:t>12. Make sure the league table is also up to date. The time and dates should be global so it’s the same all around.</w:t>
+      </w:r>
+      <w:r>
+        <w:rPr>
+          <w:rFonts w:ascii="Times New Roman" w:eastAsia="Times New Roman" w:hAnsi="Times New Roman" w:cs="Times New Roman"/>
+          <w:kern w:val="0"/>
+          <w:lang w:eastAsia="en-GB"/>
+          <w14:ligatures w14:val="none"/>
+        </w:rPr>
+        <w:br/>
+        <w:t>13. Yes setup the zoho stack if that’s the best method you have for this model, if not use something better</w:t>
       </w:r>
     </w:p>
     <w:sectPr>

</xml_diff>